<commit_message>
Weekly plan Week 7 Parachute: revised docx (Alberta standard)
</commit_message>
<xml_diff>
--- a/weekly-plans/PE-Weekly-Plan-Oct-13-16-2026-Parachute-Week-7.docx
+++ b/weekly-plans/PE-Weekly-Plan-Oct-13-16-2026-Parachute-Week-7.docx
@@ -27,7 +27,7 @@
           <w:b w:val="0"/>
           <w:sz w:val="22"/>
         </w:rPr>
-        <w:t xml:space="preserve">Early dismissal: Wednesday Oct 14 (1 hour early) — keep wu + game tight; skip long skill stations; still do the cool-down sentence.</w:t>
+        <w:t xml:space="preserve">Early dismissal: Wednesday Oct 14 (1 hour early). Wednesday is a 25-minute plan for every band: keep the warm-up and game tight, skip long skill stations, and still do the cool-down sentence.</w:t>
       </w:r>
     </w:p>
     <w:p>
@@ -37,7 +37,17 @@
           <w:b w:val="0"/>
           <w:sz w:val="22"/>
         </w:rPr>
-        <w:t xml:space="preserve">Theme: Parachute Week 7 (school week) — SCA PE Playbook October Week 2 (October W2) skill sequence: ripples and dome (lift together on a count), popcorn (force and timing), change-places (listen for your colour or name), number games (problem-solving as a group). Four lessons for four days. Builds on Week 6 (Oct 5–9 football: hand-off, defend the lane, small-sided flag, jail-catch) and gives a cooperative, no-collision week before circus.</w:t>
+        <w:t xml:space="preserve">Theme: Parachute Week 7 (school week) — SCA PE Playbook October Week 2 (October W2) skill sequence: ripples and dome (lift together on a count), popcorn (force and timing), change-places (listen for your colour or name), number games (problem-solving as a group). Four lessons for four days. Builds on Week 6 (Oct 5–9 football: hand-off, defend the lane, small-sided flag, jail-catch) and gives a co-operative, no-collision week before circus.</w:t>
+      </w:r>
+    </w:p>
+    <w:p>
+      <w:r>
+        <w:rPr>
+          <w:rFonts w:ascii="Calibri" w:hAnsi="Calibri"/>
+          <w:b w:val="0"/>
+          <w:sz w:val="22"/>
+        </w:rPr>
+        <w:t xml:space="preserve">Grade / Subject: Grades 1–6 Physical Education and Wellness   ·   Unit: Parachute (October W2), lessons 1–4 of 4   ·   Time: 30 minutes per class (Wed Oct 14: 25 minutes)   ·   Location: gym (Plan B: cleared classroom or hallway space with a king-size sheet)</w:t>
       </w:r>
     </w:p>
     <w:p>
@@ -184,11 +194,21 @@
       <w:r>
         <w:rPr>
           <w:rFonts w:ascii="Calibri" w:hAnsi="Calibri"/>
-          <w:b w:val="0"/>
-          <w:sz w:val="22"/>
-        </w:rPr>
-        <w:t xml:space="preserve">Equipment: Parachute (two if you have them; king-size sheet as back-up), 6+ beanbags in at least two colours (or soft foam balls), hoops (target hoop for Gr 5–6; Hoop Run &amp; Spin), cones, 2–5 noodles (Sharks and Dolphins taggers), colour handles or coloured pinnies, tennis balls + beanbags (Post the Parcel option), rackets or paper plates (Pancake Relay option)</w:t>
-      </w:r>
+          <w:sz w:val="22"/>
+        </w:rPr>
+        <w:t xml:space="preserve">Curriculum: </w:t>
+      </w:r>
+      <w:hyperlink r:id="rId16">
+        <w:r>
+          <w:rPr>
+            <w:color w:val="0563C1"/>
+            <w:u w:val="single"/>
+            <w:sz w:val="22"/>
+            <w:rFonts w:ascii="Calibri" w:hAnsi="Calibri"/>
+          </w:rPr>
+          <w:t>Physical Education and Wellness K–6 (new LearnAlberta)</w:t>
+        </w:r>
+      </w:hyperlink>
     </w:p>
     <w:p>
       <w:r>
@@ -205,27 +225,111 @@
         <w:pStyle w:val="Heading2"/>
       </w:pPr>
       <w:r>
-        <w:t>PEW (Alberta) — organizing ideas</w:t>
-      </w:r>
-    </w:p>
-    <w:p>
+        <w:t>Notes for teacher</w:t>
+      </w:r>
+    </w:p>
+    <w:p>
+      <w:pPr>
+        <w:pStyle w:val="ListBullet"/>
+      </w:pPr>
       <w:r>
         <w:rPr>
           <w:rFonts w:ascii="Calibri" w:hAnsi="Calibri"/>
           <w:b w:val="0"/>
           <w:sz w:val="22"/>
         </w:rPr>
-        <w:t xml:space="preserve">Movement Skill Development · Movement Tactics · Safety · Healthy Relationships · Active Living</w:t>
-      </w:r>
-    </w:p>
-    <w:p>
+        <w:t xml:space="preserve">Updated Oct 16, 2026 to the Alberta lesson plan standard. Lesson content, dates and links are unchanged from the Oct 9 version. Added: word-for-word outcomes, EIPS 2026–27 rubric levels, safety, differentiation, management cues and sub notes.</w:t>
+      </w:r>
+    </w:p>
+    <w:p>
+      <w:pPr>
+        <w:pStyle w:val="ListBullet"/>
+      </w:pPr>
       <w:r>
         <w:rPr>
           <w:rFonts w:ascii="Calibri" w:hAnsi="Calibri"/>
           <w:b w:val="0"/>
           <w:sz w:val="22"/>
         </w:rPr>
-        <w:t xml:space="preserve">(Confirm exact LearnAlberta outcome wording before report cards.)</w:t>
+        <w:t xml:space="preserve">Outcomes are copied word for word from the new LearnAlberta data file for Physical Education and Wellness K–6 (retrieved Oct 11, 2026; includes the 2026–27 minor updates). The same saved copy was used for the Week 8 Circus plan. Spot-check the wording on the LearnAlberta page before you use it on report cards.</w:t>
+      </w:r>
+    </w:p>
+    <w:p>
+      <w:pPr>
+        <w:pStyle w:val="ListBullet"/>
+      </w:pPr>
+      <w:r>
+        <w:rPr>
+          <w:rFonts w:ascii="Calibri" w:hAnsi="Calibri"/>
+          <w:b w:val="0"/>
+          <w:sz w:val="22"/>
+        </w:rPr>
+        <w:t xml:space="preserve">The Oct 9 version listed “Movement Tactics” as an organizing idea. That is not a Physical Education and Wellness K–6 organizing idea, so it was removed. This week is cited under Movement Skill Development, plus Safety for Grade 4.</w:t>
+      </w:r>
+    </w:p>
+    <w:p>
+      <w:pPr>
+        <w:pStyle w:val="ListBullet"/>
+      </w:pPr>
+      <w:r>
+        <w:rPr>
+          <w:rFonts w:ascii="Calibri" w:hAnsi="Calibri"/>
+          <w:b w:val="0"/>
+          <w:sz w:val="22"/>
+        </w:rPr>
+        <w:t xml:space="preserve">Crossing under the chute safely is cited under spatial awareness for Grades 1–2, under the Grade 4 Safety outcome, under the movement (space, direction, avoiding others) outcomes for Grades 3 and 5, and under the Grade 6 structure outcome. Safety is also taught as routines every day.</w:t>
+      </w:r>
+    </w:p>
+    <w:p>
+      <w:pPr>
+        <w:pStyle w:val="ListBullet"/>
+      </w:pPr>
+      <w:r>
+        <w:rPr>
+          <w:rFonts w:ascii="Calibri" w:hAnsi="Calibri"/>
+          <w:b w:val="0"/>
+          <w:sz w:val="22"/>
+        </w:rPr>
+        <w:t xml:space="preserve">Grade 6: the Grade 6 teamwork guiding question is about conflict resolution, which this week does not teach. Grade 6 number games are cited under the Grade 6 structure outcome (rules, roles, inclusion). Co-operation is still observed as the learner attribute “Co-operates with Others”.</w:t>
+      </w:r>
+    </w:p>
+    <w:p>
+      <w:pPr>
+        <w:pStyle w:val="ListBullet"/>
+      </w:pPr>
+      <w:r>
+        <w:rPr>
+          <w:rFonts w:ascii="Calibri" w:hAnsi="Calibri"/>
+          <w:b w:val="0"/>
+          <w:sz w:val="22"/>
+        </w:rPr>
+        <w:t xml:space="preserve">Healthy Relationships is not cited this week. Lifting together and including everyone are assessed through the teamwork outcomes (Grades 1–5) and the learner attributes.</w:t>
+      </w:r>
+    </w:p>
+    <w:p>
+      <w:pPr>
+        <w:pStyle w:val="ListBullet"/>
+      </w:pPr>
+      <w:r>
+        <w:rPr>
+          <w:rFonts w:ascii="Calibri" w:hAnsi="Calibri"/>
+          <w:b w:val="0"/>
+          <w:sz w:val="22"/>
+        </w:rPr>
+        <w:t xml:space="preserve">Library games used as warm-ups or finishers (Hoop Run &amp; Spin, Zone Tag, Post the Parcel, Pancake Relay, Hot Air Balloon, BackBurst, Horse and Jockey, Four Corners / Guess Who, Dizzy Dizzy) support the lesson but are not assessed this week.</w:t>
+      </w:r>
+    </w:p>
+    <w:p>
+      <w:pPr>
+        <w:pStyle w:val="ListBullet"/>
+      </w:pPr>
+      <w:r>
+        <w:rPr>
+          <w:rFonts w:ascii="Calibri" w:hAnsi="Calibri"/>
+          <w:b w:val="0"/>
+          <w:sz w:val="22"/>
+        </w:rPr>
+        <w:t xml:space="preserve">EIPS 2026–27 reporting pilot levels are used in the rubric (no percentages).</w:t>
       </w:r>
     </w:p>
     <w:p>
@@ -233,7 +337,55 @@
         <w:pStyle w:val="Heading2"/>
       </w:pPr>
       <w:r>
-        <w:t>Shared look-fors this week</w:t>
+        <w:t>Curriculum outcomes (Physical Education and Wellness K–6, word for word)</w:t>
+      </w:r>
+    </w:p>
+    <w:p>
+      <w:r>
+        <w:rPr>
+          <w:rFonts w:ascii="Calibri" w:hAnsi="Calibri"/>
+          <w:b w:val="0"/>
+          <w:sz w:val="22"/>
+        </w:rPr>
+        <w:t xml:space="preserve">Source: new LearnAlberta, Physical Education and Wellness K–6, in effect 2026–27. Codes in brackets are LearnAlberta’s internal codes. The Learning Outcome is what you assess and report; the KUSP lines show the part this week teaches.</w:t>
+      </w:r>
+    </w:p>
+    <w:p>
+      <w:r>
+        <w:rPr>
+          <w:rFonts w:ascii="Calibri" w:hAnsi="Calibri"/>
+          <w:sz w:val="22"/>
+        </w:rPr>
+        <w:t xml:space="preserve">Check wording: </w:t>
+      </w:r>
+      <w:hyperlink r:id="rId17">
+        <w:r>
+          <w:rPr>
+            <w:color w:val="0563C1"/>
+            <w:u w:val="single"/>
+            <w:sz w:val="22"/>
+            <w:rFonts w:ascii="Calibri" w:hAnsi="Calibri"/>
+          </w:rPr>
+          <w:t>LearnAlberta — Physical Education and Wellness K–6</w:t>
+        </w:r>
+      </w:hyperlink>
+    </w:p>
+    <w:p>
+      <w:pPr>
+        <w:pStyle w:val="Heading3"/>
+      </w:pPr>
+      <w:r>
+        <w:t>Grades 1–2</w:t>
+      </w:r>
+    </w:p>
+    <w:p>
+      <w:r>
+        <w:rPr>
+          <w:rFonts w:ascii="Calibri" w:hAnsi="Calibri"/>
+          <w:b/>
+          <w:sz w:val="22"/>
+        </w:rPr>
+        <w:t xml:space="preserve">Physical Education and Wellness, Grade 1</w:t>
       </w:r>
     </w:p>
     <w:p>
@@ -246,7 +398,7 @@
           <w:b w:val="0"/>
           <w:sz w:val="22"/>
         </w:rPr>
-        <w:t xml:space="preserve">Lift together on the count — the chute stays round; shoulders down</w:t>
+        <w:t xml:space="preserve">Organizing Idea: Movement Skill Development: Developing physical literacy through movement and active living supports well-being across a lifespan.</w:t>
       </w:r>
     </w:p>
     <w:p>
@@ -259,7 +411,7 @@
           <w:b w:val="0"/>
           <w:sz w:val="22"/>
         </w:rPr>
-        <w:t xml:space="preserve">Force and timing: pop the bags with a big snap, but never let go to chase a bag</w:t>
+        <w:t xml:space="preserve">Guiding Question: How might awareness of the surroundings impact movement?</w:t>
       </w:r>
     </w:p>
     <w:p>
@@ -272,7 +424,7 @@
           <w:b w:val="0"/>
           <w:sz w:val="22"/>
         </w:rPr>
-        <w:t xml:space="preserve">Listen for your colour or name; cross under with heads up and take a new handle without colliding</w:t>
+        <w:t xml:space="preserve">Learning Outcome: Students demonstrate how movement can support different types of physical activity. [PDE1-OI2-GQ2-LO1]</w:t>
       </w:r>
     </w:p>
     <w:p>
@@ -285,7 +437,28 @@
           <w:b w:val="0"/>
           <w:sz w:val="22"/>
         </w:rPr>
-        <w:t xml:space="preserve">Solve the group problem so no one is left out — wait for everyone</w:t>
+        <w:t xml:space="preserve">KUSP focus this week: Understanding: “Object manipulation is the ability to control and handle objects with the body.”; Skills &amp; Procedures: “Demonstrate a variety of object-manipulation skills.” Skills &amp; Procedures: “Perform non-locomotor movements in a variety of physical activity contexts.”</w:t>
+      </w:r>
+    </w:p>
+    <w:p>
+      <w:r>
+        <w:rPr>
+          <w:rFonts w:ascii="Calibri" w:hAnsi="Calibri"/>
+          <w:b w:val="0"/>
+          <w:i/>
+          <w:sz w:val="22"/>
+        </w:rPr>
+        <w:t xml:space="preserve">Used for: lift together on a count (Tue) and popcorn force and timing (Wed).</w:t>
+      </w:r>
+    </w:p>
+    <w:p>
+      <w:r>
+        <w:rPr>
+          <w:rFonts w:ascii="Calibri" w:hAnsi="Calibri"/>
+          <w:b/>
+          <w:sz w:val="22"/>
+        </w:rPr>
+        <w:t xml:space="preserve">Physical Education and Wellness, Grade 1</w:t>
       </w:r>
     </w:p>
     <w:p>
@@ -298,7 +471,1022 @@
           <w:b w:val="0"/>
           <w:sz w:val="22"/>
         </w:rPr>
-        <w:t xml:space="preserve">A drop or tangle = restart from the last good shape · soft tag / stretch 10, then back in — no elimination</w:t>
+        <w:t xml:space="preserve">Organizing Idea: Movement Skill Development: Developing physical literacy through movement and active living supports well-being across a lifespan.</w:t>
+      </w:r>
+    </w:p>
+    <w:p>
+      <w:pPr>
+        <w:pStyle w:val="ListBullet"/>
+      </w:pPr>
+      <w:r>
+        <w:rPr>
+          <w:rFonts w:ascii="Calibri" w:hAnsi="Calibri"/>
+          <w:b w:val="0"/>
+          <w:sz w:val="22"/>
+        </w:rPr>
+        <w:t xml:space="preserve">Guiding Question: How might awareness of the surroundings impact movement?</w:t>
+      </w:r>
+    </w:p>
+    <w:p>
+      <w:pPr>
+        <w:pStyle w:val="ListBullet"/>
+      </w:pPr>
+      <w:r>
+        <w:rPr>
+          <w:rFonts w:ascii="Calibri" w:hAnsi="Calibri"/>
+          <w:b w:val="0"/>
+          <w:sz w:val="22"/>
+        </w:rPr>
+        <w:t xml:space="preserve">Learning Outcome: Students exhibit spatial awareness during a variety of physical activities. [PDE1-OI2-GQ1-LO1]</w:t>
+      </w:r>
+    </w:p>
+    <w:p>
+      <w:pPr>
+        <w:pStyle w:val="ListBullet"/>
+      </w:pPr>
+      <w:r>
+        <w:rPr>
+          <w:rFonts w:ascii="Calibri" w:hAnsi="Calibri"/>
+          <w:b w:val="0"/>
+          <w:sz w:val="22"/>
+        </w:rPr>
+        <w:t xml:space="preserve">KUSP focus this week: Knowledge: “Responses that support movement through general space include • adjusting location and distance • demonstrating control • stopping on signal • moving safely”; Skills &amp; Procedures: “Demonstrate appropriate responses to environmental cues.”</w:t>
+      </w:r>
+    </w:p>
+    <w:p>
+      <w:r>
+        <w:rPr>
+          <w:rFonts w:ascii="Calibri" w:hAnsi="Calibri"/>
+          <w:b w:val="0"/>
+          <w:i/>
+          <w:sz w:val="22"/>
+        </w:rPr>
+        <w:t xml:space="preserve">Used for: listening for your colour or name and crossing under safely (Thu).</w:t>
+      </w:r>
+    </w:p>
+    <w:p>
+      <w:r>
+        <w:rPr>
+          <w:rFonts w:ascii="Calibri" w:hAnsi="Calibri"/>
+          <w:b/>
+          <w:sz w:val="22"/>
+        </w:rPr>
+        <w:t xml:space="preserve">Physical Education and Wellness, Grade 1</w:t>
+      </w:r>
+    </w:p>
+    <w:p>
+      <w:pPr>
+        <w:pStyle w:val="ListBullet"/>
+      </w:pPr>
+      <w:r>
+        <w:rPr>
+          <w:rFonts w:ascii="Calibri" w:hAnsi="Calibri"/>
+          <w:b w:val="0"/>
+          <w:sz w:val="22"/>
+        </w:rPr>
+        <w:t xml:space="preserve">Organizing Idea: Movement Skill Development: Developing physical literacy through movement and active living supports well-being across a lifespan.</w:t>
+      </w:r>
+    </w:p>
+    <w:p>
+      <w:pPr>
+        <w:pStyle w:val="ListBullet"/>
+      </w:pPr>
+      <w:r>
+        <w:rPr>
+          <w:rFonts w:ascii="Calibri" w:hAnsi="Calibri"/>
+          <w:b w:val="0"/>
+          <w:sz w:val="22"/>
+        </w:rPr>
+        <w:t xml:space="preserve">Guiding Question: How can fair play contribute to engagement in physical activity?</w:t>
+      </w:r>
+    </w:p>
+    <w:p>
+      <w:pPr>
+        <w:pStyle w:val="ListBullet"/>
+      </w:pPr>
+      <w:r>
+        <w:rPr>
+          <w:rFonts w:ascii="Calibri" w:hAnsi="Calibri"/>
+          <w:b w:val="0"/>
+          <w:sz w:val="22"/>
+        </w:rPr>
+        <w:t xml:space="preserve">Learning Outcome: Students demonstrate fair play and support engagement in a variety of physical activities. [PDE1-OI2-GQ3-LO1]</w:t>
+      </w:r>
+    </w:p>
+    <w:p>
+      <w:pPr>
+        <w:pStyle w:val="ListBullet"/>
+      </w:pPr>
+      <w:r>
+        <w:rPr>
+          <w:rFonts w:ascii="Calibri" w:hAnsi="Calibri"/>
+          <w:b w:val="0"/>
+          <w:sz w:val="22"/>
+        </w:rPr>
+        <w:t xml:space="preserve">KUSP focus this week: Understanding: “Fair play involves acknowledging the importance of all.”; Skills &amp; Procedures: “Demonstrate practices that support fair play.”</w:t>
+      </w:r>
+    </w:p>
+    <w:p>
+      <w:r>
+        <w:rPr>
+          <w:rFonts w:ascii="Calibri" w:hAnsi="Calibri"/>
+          <w:b w:val="0"/>
+          <w:i/>
+          <w:sz w:val="22"/>
+        </w:rPr>
+        <w:t xml:space="preserve">Used for: number games — waiting for everyone and including everyone (Fri).</w:t>
+      </w:r>
+    </w:p>
+    <w:p>
+      <w:r>
+        <w:rPr>
+          <w:rFonts w:ascii="Calibri" w:hAnsi="Calibri"/>
+          <w:b/>
+          <w:sz w:val="22"/>
+        </w:rPr>
+        <w:t xml:space="preserve">Physical Education and Wellness, Grade 2</w:t>
+      </w:r>
+    </w:p>
+    <w:p>
+      <w:pPr>
+        <w:pStyle w:val="ListBullet"/>
+      </w:pPr>
+      <w:r>
+        <w:rPr>
+          <w:rFonts w:ascii="Calibri" w:hAnsi="Calibri"/>
+          <w:b w:val="0"/>
+          <w:sz w:val="22"/>
+        </w:rPr>
+        <w:t xml:space="preserve">Organizing Idea: Movement Skill Development: Developing physical literacy through movement and active living supports well-being across a lifespan.</w:t>
+      </w:r>
+    </w:p>
+    <w:p>
+      <w:pPr>
+        <w:pStyle w:val="ListBullet"/>
+      </w:pPr>
+      <w:r>
+        <w:rPr>
+          <w:rFonts w:ascii="Calibri" w:hAnsi="Calibri"/>
+          <w:b w:val="0"/>
+          <w:sz w:val="22"/>
+        </w:rPr>
+        <w:t xml:space="preserve">Guiding Question: How are awareness and movement connected?</w:t>
+      </w:r>
+    </w:p>
+    <w:p>
+      <w:pPr>
+        <w:pStyle w:val="ListBullet"/>
+      </w:pPr>
+      <w:r>
+        <w:rPr>
+          <w:rFonts w:ascii="Calibri" w:hAnsi="Calibri"/>
+          <w:b w:val="0"/>
+          <w:sz w:val="22"/>
+        </w:rPr>
+        <w:t xml:space="preserve">Learning Outcome: Students modify movement to improve control and efficiency. [PDE2-OI2-GQ2-LO1]</w:t>
+      </w:r>
+    </w:p>
+    <w:p>
+      <w:pPr>
+        <w:pStyle w:val="ListBullet"/>
+      </w:pPr>
+      <w:r>
+        <w:rPr>
+          <w:rFonts w:ascii="Calibri" w:hAnsi="Calibri"/>
+          <w:b w:val="0"/>
+          <w:sz w:val="22"/>
+        </w:rPr>
+        <w:t xml:space="preserve">KUSP focus this week: Knowledge: “Object manipulation can occur in a variety of ways, such as • sending objects, including passing and pulling • retaining objects, including bouncing • receiving objects, including collecting”; Skills &amp; Procedures: “Experiment with the three phases of movement in a variety of physical activities.” Skills &amp; Procedures: “Modify one or more phases of movement to improve control and efficiency.”</w:t>
+      </w:r>
+    </w:p>
+    <w:p>
+      <w:r>
+        <w:rPr>
+          <w:rFonts w:ascii="Calibri" w:hAnsi="Calibri"/>
+          <w:b w:val="0"/>
+          <w:i/>
+          <w:sz w:val="22"/>
+        </w:rPr>
+        <w:t xml:space="preserve">Used for: lift together on a count (Tue) and popcorn force and timing (Wed).</w:t>
+      </w:r>
+    </w:p>
+    <w:p>
+      <w:r>
+        <w:rPr>
+          <w:rFonts w:ascii="Calibri" w:hAnsi="Calibri"/>
+          <w:b/>
+          <w:sz w:val="22"/>
+        </w:rPr>
+        <w:t xml:space="preserve">Physical Education and Wellness, Grade 2</w:t>
+      </w:r>
+    </w:p>
+    <w:p>
+      <w:pPr>
+        <w:pStyle w:val="ListBullet"/>
+      </w:pPr>
+      <w:r>
+        <w:rPr>
+          <w:rFonts w:ascii="Calibri" w:hAnsi="Calibri"/>
+          <w:b w:val="0"/>
+          <w:sz w:val="22"/>
+        </w:rPr>
+        <w:t xml:space="preserve">Organizing Idea: Movement Skill Development: Developing physical literacy through movement and active living supports well-being across a lifespan.</w:t>
+      </w:r>
+    </w:p>
+    <w:p>
+      <w:pPr>
+        <w:pStyle w:val="ListBullet"/>
+      </w:pPr>
+      <w:r>
+        <w:rPr>
+          <w:rFonts w:ascii="Calibri" w:hAnsi="Calibri"/>
+          <w:b w:val="0"/>
+          <w:sz w:val="22"/>
+        </w:rPr>
+        <w:t xml:space="preserve">Guiding Question: How are awareness and movement connected?</w:t>
+      </w:r>
+    </w:p>
+    <w:p>
+      <w:pPr>
+        <w:pStyle w:val="ListBullet"/>
+      </w:pPr>
+      <w:r>
+        <w:rPr>
+          <w:rFonts w:ascii="Calibri" w:hAnsi="Calibri"/>
+          <w:b w:val="0"/>
+          <w:sz w:val="22"/>
+        </w:rPr>
+        <w:t xml:space="preserve">Learning Outcome: Students refine and apply spatial awareness across a variety of physical activity contexts. [PDE2-OI2-GQ1-LO1]</w:t>
+      </w:r>
+    </w:p>
+    <w:p>
+      <w:pPr>
+        <w:pStyle w:val="ListBullet"/>
+      </w:pPr>
+      <w:r>
+        <w:rPr>
+          <w:rFonts w:ascii="Calibri" w:hAnsi="Calibri"/>
+          <w:b w:val="0"/>
+          <w:sz w:val="22"/>
+        </w:rPr>
+        <w:t xml:space="preserve">KUSP focus this week: Skills &amp; Procedures: “Scan and assess surroundings to support spatial awareness.” Skills &amp; Procedures: “Refine movement skills in relation to people or objects in a variety of physical activities.”</w:t>
+      </w:r>
+    </w:p>
+    <w:p>
+      <w:r>
+        <w:rPr>
+          <w:rFonts w:ascii="Calibri" w:hAnsi="Calibri"/>
+          <w:b w:val="0"/>
+          <w:i/>
+          <w:sz w:val="22"/>
+        </w:rPr>
+        <w:t xml:space="preserve">Used for: crossing under and taking a new handle without bumping (Thu).</w:t>
+      </w:r>
+    </w:p>
+    <w:p>
+      <w:r>
+        <w:rPr>
+          <w:rFonts w:ascii="Calibri" w:hAnsi="Calibri"/>
+          <w:b/>
+          <w:sz w:val="22"/>
+        </w:rPr>
+        <w:t xml:space="preserve">Physical Education and Wellness, Grade 2</w:t>
+      </w:r>
+    </w:p>
+    <w:p>
+      <w:pPr>
+        <w:pStyle w:val="ListBullet"/>
+      </w:pPr>
+      <w:r>
+        <w:rPr>
+          <w:rFonts w:ascii="Calibri" w:hAnsi="Calibri"/>
+          <w:b w:val="0"/>
+          <w:sz w:val="22"/>
+        </w:rPr>
+        <w:t xml:space="preserve">Organizing Idea: Movement Skill Development: Developing physical literacy through movement and active living supports well-being across a lifespan.</w:t>
+      </w:r>
+    </w:p>
+    <w:p>
+      <w:pPr>
+        <w:pStyle w:val="ListBullet"/>
+      </w:pPr>
+      <w:r>
+        <w:rPr>
+          <w:rFonts w:ascii="Calibri" w:hAnsi="Calibri"/>
+          <w:b w:val="0"/>
+          <w:sz w:val="22"/>
+        </w:rPr>
+        <w:t xml:space="preserve">Guiding Question: How can teamwork support participation, safety, and enjoyment?</w:t>
+      </w:r>
+    </w:p>
+    <w:p>
+      <w:pPr>
+        <w:pStyle w:val="ListBullet"/>
+      </w:pPr>
+      <w:r>
+        <w:rPr>
+          <w:rFonts w:ascii="Calibri" w:hAnsi="Calibri"/>
+          <w:b w:val="0"/>
+          <w:sz w:val="22"/>
+        </w:rPr>
+        <w:t xml:space="preserve">Learning Outcome: Students demonstrate teamwork and support participation in a variety of physical activities. [PDE2-OI2-GQ3-LO1]</w:t>
+      </w:r>
+    </w:p>
+    <w:p>
+      <w:pPr>
+        <w:pStyle w:val="ListBullet"/>
+      </w:pPr>
+      <w:r>
+        <w:rPr>
+          <w:rFonts w:ascii="Calibri" w:hAnsi="Calibri"/>
+          <w:b w:val="0"/>
+          <w:sz w:val="22"/>
+        </w:rPr>
+        <w:t xml:space="preserve">KUSP focus this week: Knowledge: “Teamwork includes • communicating • making decisions • sharing ideas • contributing • involving all participants”; Skills &amp; Procedures: “Exhibit teamwork in a variety of physical activity contexts.”</w:t>
+      </w:r>
+    </w:p>
+    <w:p>
+      <w:r>
+        <w:rPr>
+          <w:rFonts w:ascii="Calibri" w:hAnsi="Calibri"/>
+          <w:b w:val="0"/>
+          <w:i/>
+          <w:sz w:val="22"/>
+        </w:rPr>
+        <w:t xml:space="preserve">Used for: number games as a group (Fri).</w:t>
+      </w:r>
+    </w:p>
+    <w:p>
+      <w:pPr>
+        <w:pStyle w:val="Heading3"/>
+      </w:pPr>
+      <w:r>
+        <w:t>Grades 3–4</w:t>
+      </w:r>
+    </w:p>
+    <w:p>
+      <w:r>
+        <w:rPr>
+          <w:rFonts w:ascii="Calibri" w:hAnsi="Calibri"/>
+          <w:b/>
+          <w:sz w:val="22"/>
+        </w:rPr>
+        <w:t xml:space="preserve">Physical Education and Wellness, Grade 3</w:t>
+      </w:r>
+    </w:p>
+    <w:p>
+      <w:pPr>
+        <w:pStyle w:val="ListBullet"/>
+      </w:pPr>
+      <w:r>
+        <w:rPr>
+          <w:rFonts w:ascii="Calibri" w:hAnsi="Calibri"/>
+          <w:b w:val="0"/>
+          <w:sz w:val="22"/>
+        </w:rPr>
+        <w:t xml:space="preserve">Organizing Idea: Movement Skill Development: Developing physical literacy through movement and active living supports well-being across a lifespan.</w:t>
+      </w:r>
+    </w:p>
+    <w:p>
+      <w:pPr>
+        <w:pStyle w:val="ListBullet"/>
+      </w:pPr>
+      <w:r>
+        <w:rPr>
+          <w:rFonts w:ascii="Calibri" w:hAnsi="Calibri"/>
+          <w:b w:val="0"/>
+          <w:sz w:val="22"/>
+        </w:rPr>
+        <w:t xml:space="preserve">Guiding Question: How can elements of movement support movement competence?</w:t>
+      </w:r>
+    </w:p>
+    <w:p>
+      <w:pPr>
+        <w:pStyle w:val="ListBullet"/>
+      </w:pPr>
+      <w:r>
+        <w:rPr>
+          <w:rFonts w:ascii="Calibri" w:hAnsi="Calibri"/>
+          <w:b w:val="0"/>
+          <w:sz w:val="22"/>
+        </w:rPr>
+        <w:t xml:space="preserve">Learning Outcome: Students investigate and demonstrate how elements of movement support physical activity. [PDE3-OI2-GQ2-LO1]</w:t>
+      </w:r>
+    </w:p>
+    <w:p>
+      <w:pPr>
+        <w:pStyle w:val="ListBullet"/>
+      </w:pPr>
+      <w:r>
+        <w:rPr>
+          <w:rFonts w:ascii="Calibri" w:hAnsi="Calibri"/>
+          <w:b w:val="0"/>
+          <w:sz w:val="22"/>
+        </w:rPr>
+        <w:t xml:space="preserve">KUSP focus this week: Knowledge: “Force involves a push or a pull and can be strong or light.”; Understanding: “Effort determines speed, time, and force.”; Skills &amp; Procedures: “Experiment with effort in a variety of movement contexts.” Skills &amp; Procedures: “Adjust movement in response to the element of space.” Skills &amp; Procedures: “Demonstrate directional movement in physical activity.”</w:t>
+      </w:r>
+    </w:p>
+    <w:p>
+      <w:r>
+        <w:rPr>
+          <w:rFonts w:ascii="Calibri" w:hAnsi="Calibri"/>
+          <w:b w:val="0"/>
+          <w:i/>
+          <w:sz w:val="22"/>
+        </w:rPr>
+        <w:t xml:space="preserve">Used for: lift together (Tue), popcorn force and timing (Wed), and crossing under safely (Thu).</w:t>
+      </w:r>
+    </w:p>
+    <w:p>
+      <w:r>
+        <w:rPr>
+          <w:rFonts w:ascii="Calibri" w:hAnsi="Calibri"/>
+          <w:b/>
+          <w:sz w:val="22"/>
+        </w:rPr>
+        <w:t xml:space="preserve">Physical Education and Wellness, Grade 3</w:t>
+      </w:r>
+    </w:p>
+    <w:p>
+      <w:pPr>
+        <w:pStyle w:val="ListBullet"/>
+      </w:pPr>
+      <w:r>
+        <w:rPr>
+          <w:rFonts w:ascii="Calibri" w:hAnsi="Calibri"/>
+          <w:b w:val="0"/>
+          <w:sz w:val="22"/>
+        </w:rPr>
+        <w:t xml:space="preserve">Organizing Idea: Movement Skill Development: Developing physical literacy through movement and active living supports well-being across a lifespan.</w:t>
+      </w:r>
+    </w:p>
+    <w:p>
+      <w:pPr>
+        <w:pStyle w:val="ListBullet"/>
+      </w:pPr>
+      <w:r>
+        <w:rPr>
+          <w:rFonts w:ascii="Calibri" w:hAnsi="Calibri"/>
+          <w:b w:val="0"/>
+          <w:sz w:val="22"/>
+        </w:rPr>
+        <w:t xml:space="preserve">Guiding Question: How can teamwork support positive interactions?</w:t>
+      </w:r>
+    </w:p>
+    <w:p>
+      <w:pPr>
+        <w:pStyle w:val="ListBullet"/>
+      </w:pPr>
+      <w:r>
+        <w:rPr>
+          <w:rFonts w:ascii="Calibri" w:hAnsi="Calibri"/>
+          <w:b w:val="0"/>
+          <w:sz w:val="22"/>
+        </w:rPr>
+        <w:t xml:space="preserve">Learning Outcome: Students identify and demonstrate how teamwork supports positive interactions during physical activity. [PDE3-OI2-GQ3-LO1]</w:t>
+      </w:r>
+    </w:p>
+    <w:p>
+      <w:pPr>
+        <w:pStyle w:val="ListBullet"/>
+      </w:pPr>
+      <w:r>
+        <w:rPr>
+          <w:rFonts w:ascii="Calibri" w:hAnsi="Calibri"/>
+          <w:b w:val="0"/>
+          <w:sz w:val="22"/>
+        </w:rPr>
+        <w:t xml:space="preserve">KUSP focus this week: Understanding: “Teamwork provides opportunities for individuals to contribute to team efforts and goals.”; Skills &amp; Procedures: “Engage in positive interactions that support teamwork.”</w:t>
+      </w:r>
+    </w:p>
+    <w:p>
+      <w:r>
+        <w:rPr>
+          <w:rFonts w:ascii="Calibri" w:hAnsi="Calibri"/>
+          <w:b w:val="0"/>
+          <w:i/>
+          <w:sz w:val="22"/>
+        </w:rPr>
+        <w:t xml:space="preserve">Used for: number games and student callers (Fri).</w:t>
+      </w:r>
+    </w:p>
+    <w:p>
+      <w:r>
+        <w:rPr>
+          <w:rFonts w:ascii="Calibri" w:hAnsi="Calibri"/>
+          <w:b/>
+          <w:sz w:val="22"/>
+        </w:rPr>
+        <w:t xml:space="preserve">Physical Education and Wellness, Grade 4</w:t>
+      </w:r>
+    </w:p>
+    <w:p>
+      <w:pPr>
+        <w:pStyle w:val="ListBullet"/>
+      </w:pPr>
+      <w:r>
+        <w:rPr>
+          <w:rFonts w:ascii="Calibri" w:hAnsi="Calibri"/>
+          <w:b w:val="0"/>
+          <w:sz w:val="22"/>
+        </w:rPr>
+        <w:t xml:space="preserve">Organizing Idea: Movement Skill Development: Developing physical literacy through movement and active living supports well-being across a lifespan.</w:t>
+      </w:r>
+    </w:p>
+    <w:p>
+      <w:pPr>
+        <w:pStyle w:val="ListBullet"/>
+      </w:pPr>
+      <w:r>
+        <w:rPr>
+          <w:rFonts w:ascii="Calibri" w:hAnsi="Calibri"/>
+          <w:b w:val="0"/>
+          <w:sz w:val="22"/>
+        </w:rPr>
+        <w:t xml:space="preserve">Guiding Question: How can elements of movement support active living?</w:t>
+      </w:r>
+    </w:p>
+    <w:p>
+      <w:pPr>
+        <w:pStyle w:val="ListBullet"/>
+      </w:pPr>
+      <w:r>
+        <w:rPr>
+          <w:rFonts w:ascii="Calibri" w:hAnsi="Calibri"/>
+          <w:b w:val="0"/>
+          <w:sz w:val="22"/>
+        </w:rPr>
+        <w:t xml:space="preserve">Learning Outcome: Students integrate and experiment with elements of movement to support physical activity. [PDE4-OI2-GQ2-LO1]</w:t>
+      </w:r>
+    </w:p>
+    <w:p>
+      <w:pPr>
+        <w:pStyle w:val="ListBullet"/>
+      </w:pPr>
+      <w:r>
+        <w:rPr>
+          <w:rFonts w:ascii="Calibri" w:hAnsi="Calibri"/>
+          <w:b w:val="0"/>
+          <w:sz w:val="22"/>
+        </w:rPr>
+        <w:t xml:space="preserve">KUSP focus this week: Knowledge: “Non-locomotor movements include lifting, extending, and flexing.”; Understanding: “Elements of movement can be manipulated to improve accuracy and control.”; Skills &amp; Procedures: “Manipulate movement elements to improve efficiency, accuracy, and control.”</w:t>
+      </w:r>
+    </w:p>
+    <w:p>
+      <w:r>
+        <w:rPr>
+          <w:rFonts w:ascii="Calibri" w:hAnsi="Calibri"/>
+          <w:b w:val="0"/>
+          <w:i/>
+          <w:sz w:val="22"/>
+        </w:rPr>
+        <w:t xml:space="preserve">Used for: lift together (Tue) and popcorn force and timing (Wed).</w:t>
+      </w:r>
+    </w:p>
+    <w:p>
+      <w:r>
+        <w:rPr>
+          <w:rFonts w:ascii="Calibri" w:hAnsi="Calibri"/>
+          <w:b/>
+          <w:sz w:val="22"/>
+        </w:rPr>
+        <w:t xml:space="preserve">Physical Education and Wellness, Grade 4</w:t>
+      </w:r>
+    </w:p>
+    <w:p>
+      <w:pPr>
+        <w:pStyle w:val="ListBullet"/>
+      </w:pPr>
+      <w:r>
+        <w:rPr>
+          <w:rFonts w:ascii="Calibri" w:hAnsi="Calibri"/>
+          <w:b w:val="0"/>
+          <w:sz w:val="22"/>
+        </w:rPr>
+        <w:t xml:space="preserve">Organizing Idea: Safety: A lifetime of optimal well-being is supported by prioritizing health and safety.</w:t>
+      </w:r>
+    </w:p>
+    <w:p>
+      <w:pPr>
+        <w:pStyle w:val="ListBullet"/>
+      </w:pPr>
+      <w:r>
+        <w:rPr>
+          <w:rFonts w:ascii="Calibri" w:hAnsi="Calibri"/>
+          <w:b w:val="0"/>
+          <w:sz w:val="22"/>
+        </w:rPr>
+        <w:t xml:space="preserve">Guiding Question: How can taking responsibility impact safety?</w:t>
+      </w:r>
+    </w:p>
+    <w:p>
+      <w:pPr>
+        <w:pStyle w:val="ListBullet"/>
+      </w:pPr>
+      <w:r>
+        <w:rPr>
+          <w:rFonts w:ascii="Calibri" w:hAnsi="Calibri"/>
+          <w:b w:val="0"/>
+          <w:sz w:val="22"/>
+        </w:rPr>
+        <w:t xml:space="preserve">Learning Outcome: Students analyze and explain responsibility and how it can impact personal and group safety. [PDE4-OI4-GQ1-LO1]</w:t>
+      </w:r>
+    </w:p>
+    <w:p>
+      <w:pPr>
+        <w:pStyle w:val="ListBullet"/>
+      </w:pPr>
+      <w:r>
+        <w:rPr>
+          <w:rFonts w:ascii="Calibri" w:hAnsi="Calibri"/>
+          <w:b w:val="0"/>
+          <w:sz w:val="22"/>
+        </w:rPr>
+        <w:t xml:space="preserve">KUSP focus this week: Knowledge: “Responsibility includes making decisions to ensure self or others are not in unsafe and uncomfortable situations.”; Understanding: “Responsibility includes an awareness of surroundings to determine the safety of a situation.”; Skills &amp; Procedures: “Examine how responsibility can impact safety in a variety of situations.”</w:t>
+      </w:r>
+    </w:p>
+    <w:p>
+      <w:r>
+        <w:rPr>
+          <w:rFonts w:ascii="Calibri" w:hAnsi="Calibri"/>
+          <w:b w:val="0"/>
+          <w:i/>
+          <w:sz w:val="22"/>
+        </w:rPr>
+        <w:t xml:space="preserve">Used for: crossing under safely, Sharks and Dolphins, and the chute safety rules (Thu, all week).</w:t>
+      </w:r>
+    </w:p>
+    <w:p>
+      <w:r>
+        <w:rPr>
+          <w:rFonts w:ascii="Calibri" w:hAnsi="Calibri"/>
+          <w:b/>
+          <w:sz w:val="22"/>
+        </w:rPr>
+        <w:t xml:space="preserve">Physical Education and Wellness, Grade 4</w:t>
+      </w:r>
+    </w:p>
+    <w:p>
+      <w:pPr>
+        <w:pStyle w:val="ListBullet"/>
+      </w:pPr>
+      <w:r>
+        <w:rPr>
+          <w:rFonts w:ascii="Calibri" w:hAnsi="Calibri"/>
+          <w:b w:val="0"/>
+          <w:sz w:val="22"/>
+        </w:rPr>
+        <w:t xml:space="preserve">Organizing Idea: Movement Skill Development: Developing physical literacy through movement and active living supports well-being across a lifespan.</w:t>
+      </w:r>
+    </w:p>
+    <w:p>
+      <w:pPr>
+        <w:pStyle w:val="ListBullet"/>
+      </w:pPr>
+      <w:r>
+        <w:rPr>
+          <w:rFonts w:ascii="Calibri" w:hAnsi="Calibri"/>
+          <w:b w:val="0"/>
+          <w:sz w:val="22"/>
+        </w:rPr>
+        <w:t xml:space="preserve">Guiding Question: How can teamwork enhance participation in physical activity?</w:t>
+      </w:r>
+    </w:p>
+    <w:p>
+      <w:pPr>
+        <w:pStyle w:val="ListBullet"/>
+      </w:pPr>
+      <w:r>
+        <w:rPr>
+          <w:rFonts w:ascii="Calibri" w:hAnsi="Calibri"/>
+          <w:b w:val="0"/>
+          <w:sz w:val="22"/>
+        </w:rPr>
+        <w:t xml:space="preserve">Learning Outcome: Students connect and demonstrate how teamwork enhances participation in physical activity. [PDE4-OI2-GQ3-LO1]</w:t>
+      </w:r>
+    </w:p>
+    <w:p>
+      <w:pPr>
+        <w:pStyle w:val="ListBullet"/>
+      </w:pPr>
+      <w:r>
+        <w:rPr>
+          <w:rFonts w:ascii="Calibri" w:hAnsi="Calibri"/>
+          <w:b w:val="0"/>
+          <w:sz w:val="22"/>
+        </w:rPr>
+        <w:t xml:space="preserve">KUSP focus this week: Knowledge: “Team success is optimized through the contributions of all members.”; Skills &amp; Procedures: “Demonstrate effective teamwork strategies during physical activity.”</w:t>
+      </w:r>
+    </w:p>
+    <w:p>
+      <w:r>
+        <w:rPr>
+          <w:rFonts w:ascii="Calibri" w:hAnsi="Calibri"/>
+          <w:b w:val="0"/>
+          <w:i/>
+          <w:sz w:val="22"/>
+        </w:rPr>
+        <w:t xml:space="preserve">Used for: number games and student callers (Fri).</w:t>
+      </w:r>
+    </w:p>
+    <w:p>
+      <w:pPr>
+        <w:pStyle w:val="Heading3"/>
+      </w:pPr>
+      <w:r>
+        <w:t>Grades 5–6</w:t>
+      </w:r>
+    </w:p>
+    <w:p>
+      <w:r>
+        <w:rPr>
+          <w:rFonts w:ascii="Calibri" w:hAnsi="Calibri"/>
+          <w:b/>
+          <w:sz w:val="22"/>
+        </w:rPr>
+        <w:t xml:space="preserve">Physical Education and Wellness, Grade 5</w:t>
+      </w:r>
+    </w:p>
+    <w:p>
+      <w:pPr>
+        <w:pStyle w:val="ListBullet"/>
+      </w:pPr>
+      <w:r>
+        <w:rPr>
+          <w:rFonts w:ascii="Calibri" w:hAnsi="Calibri"/>
+          <w:b w:val="0"/>
+          <w:sz w:val="22"/>
+        </w:rPr>
+        <w:t xml:space="preserve">Organizing Idea: Movement Skill Development: Developing physical literacy through movement and active living supports well-being across a lifespan.</w:t>
+      </w:r>
+    </w:p>
+    <w:p>
+      <w:pPr>
+        <w:pStyle w:val="ListBullet"/>
+      </w:pPr>
+      <w:r>
+        <w:rPr>
+          <w:rFonts w:ascii="Calibri" w:hAnsi="Calibri"/>
+          <w:b w:val="0"/>
+          <w:sz w:val="22"/>
+        </w:rPr>
+        <w:t xml:space="preserve">Guiding Question: How can diverse movement patterns contribute to success across physical activities?</w:t>
+      </w:r>
+    </w:p>
+    <w:p>
+      <w:pPr>
+        <w:pStyle w:val="ListBullet"/>
+      </w:pPr>
+      <w:r>
+        <w:rPr>
+          <w:rFonts w:ascii="Calibri" w:hAnsi="Calibri"/>
+          <w:b w:val="0"/>
+          <w:sz w:val="22"/>
+        </w:rPr>
+        <w:t xml:space="preserve">Learning Outcome: Students demonstrate and adapt various movement patterns to enhance skill development. [PDE5-OI2-GQ2-LO1]</w:t>
+      </w:r>
+    </w:p>
+    <w:p>
+      <w:pPr>
+        <w:pStyle w:val="ListBullet"/>
+      </w:pPr>
+      <w:r>
+        <w:rPr>
+          <w:rFonts w:ascii="Calibri" w:hAnsi="Calibri"/>
+          <w:b w:val="0"/>
+          <w:sz w:val="22"/>
+        </w:rPr>
+        <w:t xml:space="preserve">KUSP focus this week: Knowledge: “Movement patterns can be improved by adapting elements of movement, such as • sending and receiving while changing direction and speed • throwing objects at different levels • adjusting speed or changing direction to avoid individuals or objects”; Skills &amp; Procedures: “Perform movement patterns using various types of equipment, individually and with others.” Skills &amp; Procedures: “Adapt elements of movement to enhance movement patterns.”</w:t>
+      </w:r>
+    </w:p>
+    <w:p>
+      <w:r>
+        <w:rPr>
+          <w:rFonts w:ascii="Calibri" w:hAnsi="Calibri"/>
+          <w:b w:val="0"/>
+          <w:i/>
+          <w:sz w:val="22"/>
+        </w:rPr>
+        <w:t xml:space="preserve">Used for: students count the lift (Tue), pop to a target hoop (Wed), and the three-mouse version and crossing under (Thu).</w:t>
+      </w:r>
+    </w:p>
+    <w:p>
+      <w:r>
+        <w:rPr>
+          <w:rFonts w:ascii="Calibri" w:hAnsi="Calibri"/>
+          <w:b/>
+          <w:sz w:val="22"/>
+        </w:rPr>
+        <w:t xml:space="preserve">Physical Education and Wellness, Grade 5</w:t>
+      </w:r>
+    </w:p>
+    <w:p>
+      <w:pPr>
+        <w:pStyle w:val="ListBullet"/>
+      </w:pPr>
+      <w:r>
+        <w:rPr>
+          <w:rFonts w:ascii="Calibri" w:hAnsi="Calibri"/>
+          <w:b w:val="0"/>
+          <w:sz w:val="22"/>
+        </w:rPr>
+        <w:t xml:space="preserve">Organizing Idea: Movement Skill Development: Developing physical literacy through movement and active living supports well-being across a lifespan.</w:t>
+      </w:r>
+    </w:p>
+    <w:p>
+      <w:pPr>
+        <w:pStyle w:val="ListBullet"/>
+      </w:pPr>
+      <w:r>
+        <w:rPr>
+          <w:rFonts w:ascii="Calibri" w:hAnsi="Calibri"/>
+          <w:b w:val="0"/>
+          <w:sz w:val="22"/>
+        </w:rPr>
+        <w:t xml:space="preserve">Guiding Question: What is the relationship between collaboration and physical activity?</w:t>
+      </w:r>
+    </w:p>
+    <w:p>
+      <w:pPr>
+        <w:pStyle w:val="ListBullet"/>
+      </w:pPr>
+      <w:r>
+        <w:rPr>
+          <w:rFonts w:ascii="Calibri" w:hAnsi="Calibri"/>
+          <w:b w:val="0"/>
+          <w:sz w:val="22"/>
+        </w:rPr>
+        <w:t xml:space="preserve">Learning Outcome: Students demonstrate how collaboration influences physical activity. [PDE5-OI2-GQ3-LO1]</w:t>
+      </w:r>
+    </w:p>
+    <w:p>
+      <w:pPr>
+        <w:pStyle w:val="ListBullet"/>
+      </w:pPr>
+      <w:r>
+        <w:rPr>
+          <w:rFonts w:ascii="Calibri" w:hAnsi="Calibri"/>
+          <w:b w:val="0"/>
+          <w:sz w:val="22"/>
+        </w:rPr>
+        <w:t xml:space="preserve">KUSP focus this week: Knowledge: “Collaboration during physical activity involves • identifying goals • planning strategy • exchanging ideas • making and implementing decisions”; Skills &amp; Procedures: “Practise collaboration during physical activity.” Skills &amp; Procedures: “Demonstrate respect for the contributions and perspectives of others when working together to make decisions or achieve team goals.”</w:t>
+      </w:r>
+    </w:p>
+    <w:p>
+      <w:r>
+        <w:rPr>
+          <w:rFonts w:ascii="Calibri" w:hAnsi="Calibri"/>
+          <w:b w:val="0"/>
+          <w:i/>
+          <w:sz w:val="22"/>
+        </w:rPr>
+        <w:t xml:space="preserve">Used for: silent number shapes and student leaders (Fri).</w:t>
+      </w:r>
+    </w:p>
+    <w:p>
+      <w:r>
+        <w:rPr>
+          <w:rFonts w:ascii="Calibri" w:hAnsi="Calibri"/>
+          <w:b/>
+          <w:sz w:val="22"/>
+        </w:rPr>
+        <w:t xml:space="preserve">Physical Education and Wellness, Grade 6</w:t>
+      </w:r>
+    </w:p>
+    <w:p>
+      <w:pPr>
+        <w:pStyle w:val="ListBullet"/>
+      </w:pPr>
+      <w:r>
+        <w:rPr>
+          <w:rFonts w:ascii="Calibri" w:hAnsi="Calibri"/>
+          <w:b w:val="0"/>
+          <w:sz w:val="22"/>
+        </w:rPr>
+        <w:t xml:space="preserve">Organizing Idea: Movement Skill Development: Developing physical literacy through movement and active living supports well-being across a lifespan.</w:t>
+      </w:r>
+    </w:p>
+    <w:p>
+      <w:pPr>
+        <w:pStyle w:val="ListBullet"/>
+      </w:pPr>
+      <w:r>
+        <w:rPr>
+          <w:rFonts w:ascii="Calibri" w:hAnsi="Calibri"/>
+          <w:b w:val="0"/>
+          <w:sz w:val="22"/>
+        </w:rPr>
+        <w:t xml:space="preserve">Guiding Question: In what ways can movement patterns function to improve performance?</w:t>
+      </w:r>
+    </w:p>
+    <w:p>
+      <w:pPr>
+        <w:pStyle w:val="ListBullet"/>
+      </w:pPr>
+      <w:r>
+        <w:rPr>
+          <w:rFonts w:ascii="Calibri" w:hAnsi="Calibri"/>
+          <w:b w:val="0"/>
+          <w:sz w:val="22"/>
+        </w:rPr>
+        <w:t xml:space="preserve">Learning Outcome: Students adapt and apply movement patterns in controlled and dynamic physical activities. [PDE6-OI2-GQ2-LO1]</w:t>
+      </w:r>
+    </w:p>
+    <w:p>
+      <w:pPr>
+        <w:pStyle w:val="ListBullet"/>
+      </w:pPr>
+      <w:r>
+        <w:rPr>
+          <w:rFonts w:ascii="Calibri" w:hAnsi="Calibri"/>
+          <w:b w:val="0"/>
+          <w:sz w:val="22"/>
+        </w:rPr>
+        <w:t xml:space="preserve">KUSP focus this week: Knowledge: “Patterns are movements that enable the body to move in response to a stimulus.”; Skills &amp; Procedures: “Implement movement patterns in response to a variety of physical, verbal, visual, and musical stimuli.” Skills &amp; Procedures: “Adapt movement patterns to improve accuracy, speed, and proficiency in a variety of controlled and dynamic physical activities.”</w:t>
+      </w:r>
+    </w:p>
+    <w:p>
+      <w:r>
+        <w:rPr>
+          <w:rFonts w:ascii="Calibri" w:hAnsi="Calibri"/>
+          <w:b w:val="0"/>
+          <w:i/>
+          <w:sz w:val="22"/>
+        </w:rPr>
+        <w:t xml:space="preserve">Used for: lifting on a student count (Tue) and popping to a target hoop (Wed).</w:t>
+      </w:r>
+    </w:p>
+    <w:p>
+      <w:r>
+        <w:rPr>
+          <w:rFonts w:ascii="Calibri" w:hAnsi="Calibri"/>
+          <w:b/>
+          <w:sz w:val="22"/>
+        </w:rPr>
+        <w:t xml:space="preserve">Physical Education and Wellness, Grade 6</w:t>
+      </w:r>
+    </w:p>
+    <w:p>
+      <w:pPr>
+        <w:pStyle w:val="ListBullet"/>
+      </w:pPr>
+      <w:r>
+        <w:rPr>
+          <w:rFonts w:ascii="Calibri" w:hAnsi="Calibri"/>
+          <w:b w:val="0"/>
+          <w:sz w:val="22"/>
+        </w:rPr>
+        <w:t xml:space="preserve">Organizing Idea: Movement Skill Development: Developing physical literacy through movement and active living supports well-being across a lifespan.</w:t>
+      </w:r>
+    </w:p>
+    <w:p>
+      <w:pPr>
+        <w:pStyle w:val="ListBullet"/>
+      </w:pPr>
+      <w:r>
+        <w:rPr>
+          <w:rFonts w:ascii="Calibri" w:hAnsi="Calibri"/>
+          <w:b w:val="0"/>
+          <w:sz w:val="22"/>
+        </w:rPr>
+        <w:t xml:space="preserve">Guiding Question: How does structure bring organization to physical activity?</w:t>
+      </w:r>
+    </w:p>
+    <w:p>
+      <w:pPr>
+        <w:pStyle w:val="ListBullet"/>
+      </w:pPr>
+      <w:r>
+        <w:rPr>
+          <w:rFonts w:ascii="Calibri" w:hAnsi="Calibri"/>
+          <w:b w:val="0"/>
+          <w:sz w:val="22"/>
+        </w:rPr>
+        <w:t xml:space="preserve">Learning Outcome: Students examine and demonstrate an understanding of structure in physical activity. [PDE6-OI2-GQ1-LO1]</w:t>
+      </w:r>
+    </w:p>
+    <w:p>
+      <w:pPr>
+        <w:pStyle w:val="ListBullet"/>
+      </w:pPr>
+      <w:r>
+        <w:rPr>
+          <w:rFonts w:ascii="Calibri" w:hAnsi="Calibri"/>
+          <w:b w:val="0"/>
+          <w:sz w:val="22"/>
+        </w:rPr>
+        <w:t xml:space="preserve">KUSP focus this week: Knowledge: “Structural components of physical activities can have various characteristics and features, such as • rules and guidelines • protocols • purpose or intent • number and roles of participants • required equipment”; Understanding: “Structure provides parameters to support safety, engagement, and inclusion of all participants.”; Skills &amp; Procedures: “Apply structure in the creation and playing of games.”</w:t>
+      </w:r>
+    </w:p>
+    <w:p>
+      <w:r>
+        <w:rPr>
+          <w:rFonts w:ascii="Calibri" w:hAnsi="Calibri"/>
+          <w:b w:val="0"/>
+          <w:i/>
+          <w:sz w:val="22"/>
+        </w:rPr>
+        <w:t xml:space="preserve">Used for: crossing on the call and the three-mouse rules (Thu), and silent number shapes (Fri). See Notes for teacher about Grade 6 teamwork.</w:t>
       </w:r>
     </w:p>
     <w:p>
@@ -306,6 +1494,371 @@
         <w:pStyle w:val="Heading2"/>
       </w:pPr>
       <w:r>
+        <w:t>Learning intentions</w:t>
+      </w:r>
+    </w:p>
+    <w:p>
+      <w:pPr>
+        <w:pStyle w:val="ListBullet"/>
+      </w:pPr>
+      <w:r>
+        <w:rPr>
+          <w:rFonts w:ascii="Calibri" w:hAnsi="Calibri"/>
+          <w:b w:val="0"/>
+          <w:sz w:val="22"/>
+        </w:rPr>
+        <w:t xml:space="preserve">We are learning to move together as a class on the parachute: lift on a count, use force and timing, listen and cross under safely, and solve group problems so no one is left out.</w:t>
+      </w:r>
+    </w:p>
+    <w:p>
+      <w:pPr>
+        <w:pStyle w:val="ListBullet"/>
+      </w:pPr>
+      <w:r>
+        <w:rPr>
+          <w:rFonts w:ascii="Calibri" w:hAnsi="Calibri"/>
+          <w:b w:val="0"/>
+          <w:sz w:val="22"/>
+        </w:rPr>
+        <w:t xml:space="preserve">I can lift the chute with my class on the count and keep both hands on.</w:t>
+      </w:r>
+    </w:p>
+    <w:p>
+      <w:pPr>
+        <w:pStyle w:val="ListBullet"/>
+      </w:pPr>
+      <w:r>
+        <w:rPr>
+          <w:rFonts w:ascii="Calibri" w:hAnsi="Calibri"/>
+          <w:b w:val="0"/>
+          <w:sz w:val="22"/>
+        </w:rPr>
+        <w:t xml:space="preserve">I can shake the chute to pop the beanbags without letting go, and I can cross under safely when my colour or name is called.</w:t>
+      </w:r>
+    </w:p>
+    <w:p>
+      <w:pPr>
+        <w:pStyle w:val="ListBullet"/>
+      </w:pPr>
+      <w:r>
+        <w:rPr>
+          <w:rFonts w:ascii="Calibri" w:hAnsi="Calibri"/>
+          <w:b w:val="0"/>
+          <w:sz w:val="22"/>
+        </w:rPr>
+        <w:t xml:space="preserve">I can help my group make a number shape and wait for everyone.</w:t>
+      </w:r>
+    </w:p>
+    <w:p>
+      <w:pPr>
+        <w:pStyle w:val="Heading2"/>
+      </w:pPr>
+      <w:r>
+        <w:t>Success criteria / evidence of learning</w:t>
+      </w:r>
+    </w:p>
+    <w:p>
+      <w:pPr>
+        <w:pStyle w:val="ListBullet"/>
+      </w:pPr>
+      <w:r>
+        <w:rPr>
+          <w:rFonts w:ascii="Calibri" w:hAnsi="Calibri"/>
+          <w:b w:val="0"/>
+          <w:sz w:val="22"/>
+        </w:rPr>
+        <w:t xml:space="preserve">Observation (Tue): the student lifts on the count so the chute stays round, then steps in and sits calmly in the dome.</w:t>
+      </w:r>
+    </w:p>
+    <w:p>
+      <w:pPr>
+        <w:pStyle w:val="ListBullet"/>
+      </w:pPr>
+      <w:r>
+        <w:rPr>
+          <w:rFonts w:ascii="Calibri" w:hAnsi="Calibri"/>
+          <w:b w:val="0"/>
+          <w:sz w:val="22"/>
+        </w:rPr>
+        <w:t xml:space="preserve">Observation (Wed): the student pops the bags with force and timing, never lets go to chase a bag, and follows the colour rule.</w:t>
+      </w:r>
+    </w:p>
+    <w:p>
+      <w:pPr>
+        <w:pStyle w:val="ListBullet"/>
+      </w:pPr>
+      <w:r>
+        <w:rPr>
+          <w:rFonts w:ascii="Calibri" w:hAnsi="Calibri"/>
+          <w:b w:val="0"/>
+          <w:sz w:val="22"/>
+        </w:rPr>
+        <w:t xml:space="preserve">Observation (Thu): the student crosses under on their own call with head up and takes a new handle without bumping anyone.</w:t>
+      </w:r>
+    </w:p>
+    <w:p>
+      <w:pPr>
+        <w:pStyle w:val="ListBullet"/>
+      </w:pPr>
+      <w:r>
+        <w:rPr>
+          <w:rFonts w:ascii="Calibri" w:hAnsi="Calibri"/>
+          <w:b w:val="0"/>
+          <w:sz w:val="22"/>
+        </w:rPr>
+        <w:t xml:space="preserve">Conversation (Thu and Fri): the student can say how to cross safely and how the group made sure no one was left out.</w:t>
+      </w:r>
+    </w:p>
+    <w:p>
+      <w:pPr>
+        <w:pStyle w:val="ListBullet"/>
+      </w:pPr>
+      <w:r>
+        <w:rPr>
+          <w:rFonts w:ascii="Calibri" w:hAnsi="Calibri"/>
+          <w:b w:val="0"/>
+          <w:sz w:val="22"/>
+        </w:rPr>
+        <w:t xml:space="preserve">Product (Fri): the group’s number shape, or the silent number shape for Grades 5–6, is finished with everyone included.</w:t>
+      </w:r>
+    </w:p>
+    <w:p>
+      <w:pPr>
+        <w:pStyle w:val="Heading2"/>
+      </w:pPr>
+      <w:r>
+        <w:t>Materials and prep</w:t>
+      </w:r>
+    </w:p>
+    <w:p>
+      <w:pPr>
+        <w:pStyle w:val="ListBullet"/>
+      </w:pPr>
+      <w:r>
+        <w:rPr>
+          <w:rFonts w:ascii="Calibri" w:hAnsi="Calibri"/>
+          <w:b w:val="0"/>
+          <w:sz w:val="22"/>
+        </w:rPr>
+        <w:t xml:space="preserve">Parachute (two if you have them; king-size sheet as back-up)</w:t>
+      </w:r>
+    </w:p>
+    <w:p>
+      <w:pPr>
+        <w:pStyle w:val="ListBullet"/>
+      </w:pPr>
+      <w:r>
+        <w:rPr>
+          <w:rFonts w:ascii="Calibri" w:hAnsi="Calibri"/>
+          <w:b w:val="0"/>
+          <w:sz w:val="22"/>
+        </w:rPr>
+        <w:t xml:space="preserve">6+ beanbags in at least two colours (or soft foam balls)</w:t>
+      </w:r>
+    </w:p>
+    <w:p>
+      <w:pPr>
+        <w:pStyle w:val="ListBullet"/>
+      </w:pPr>
+      <w:r>
+        <w:rPr>
+          <w:rFonts w:ascii="Calibri" w:hAnsi="Calibri"/>
+          <w:b w:val="0"/>
+          <w:sz w:val="22"/>
+        </w:rPr>
+        <w:t xml:space="preserve">Hoops (target hoop for Gr 5–6; Hoop Run &amp; Spin), cones, 2–5 noodles (Sharks and Dolphins taggers)</w:t>
+      </w:r>
+    </w:p>
+    <w:p>
+      <w:pPr>
+        <w:pStyle w:val="ListBullet"/>
+      </w:pPr>
+      <w:r>
+        <w:rPr>
+          <w:rFonts w:ascii="Calibri" w:hAnsi="Calibri"/>
+          <w:b w:val="0"/>
+          <w:sz w:val="22"/>
+        </w:rPr>
+        <w:t xml:space="preserve">Colour handles or coloured pinnies, so every student has a colour to listen for</w:t>
+      </w:r>
+    </w:p>
+    <w:p>
+      <w:pPr>
+        <w:pStyle w:val="ListBullet"/>
+      </w:pPr>
+      <w:r>
+        <w:rPr>
+          <w:rFonts w:ascii="Calibri" w:hAnsi="Calibri"/>
+          <w:b w:val="0"/>
+          <w:sz w:val="22"/>
+        </w:rPr>
+        <w:t xml:space="preserve">Tennis balls + beanbags (Post the Parcel option), rackets or paper plates (Pancake Relay option)</w:t>
+      </w:r>
+    </w:p>
+    <w:p>
+      <w:pPr>
+        <w:pStyle w:val="ListBullet"/>
+      </w:pPr>
+      <w:r>
+        <w:rPr>
+          <w:rFonts w:ascii="Calibri" w:hAnsi="Calibri"/>
+          <w:b w:val="0"/>
+          <w:sz w:val="22"/>
+        </w:rPr>
+        <w:t xml:space="preserve">Prep before students arrive (5 minutes): check the chute for rips and loose handles; lay it flat in the centre circle; put the stop-signal card and the day’s cues on the whiteboard.</w:t>
+      </w:r>
+    </w:p>
+    <w:p>
+      <w:pPr>
+        <w:pStyle w:val="Heading2"/>
+      </w:pPr>
+      <w:r>
+        <w:t>Room or space setup</w:t>
+      </w:r>
+    </w:p>
+    <w:p>
+      <w:pPr>
+        <w:pStyle w:val="ListBullet"/>
+      </w:pPr>
+      <w:r>
+        <w:rPr>
+          <w:rFonts w:ascii="Calibri" w:hAnsi="Calibri"/>
+          <w:b w:val="0"/>
+          <w:sz w:val="22"/>
+        </w:rPr>
+        <w:t xml:space="preserve">Lay the chute flat in the centre of the gym. Boundary cones at least 2 m from walls, the stage and doors.</w:t>
+      </w:r>
+    </w:p>
+    <w:p>
+      <w:pPr>
+        <w:pStyle w:val="ListBullet"/>
+      </w:pPr>
+      <w:r>
+        <w:rPr>
+          <w:rFonts w:ascii="Calibri" w:hAnsi="Calibri"/>
+          <w:b w:val="0"/>
+          <w:sz w:val="22"/>
+        </w:rPr>
+        <w:t xml:space="preserve">Students stand evenly around the chute, one per handle, about an arm-span apart. Two chutes: 12 + 12, with at least 4 m between the chutes.</w:t>
+      </w:r>
+    </w:p>
+    <w:p>
+      <w:pPr>
+        <w:pStyle w:val="ListBullet"/>
+      </w:pPr>
+      <w:r>
+        <w:rPr>
+          <w:rFonts w:ascii="Calibri" w:hAnsi="Calibri"/>
+          <w:b w:val="0"/>
+          <w:sz w:val="22"/>
+        </w:rPr>
+        <w:t xml:space="preserve">Tue and Wed: everyone stays at their handle. Pick up loose beanbags only when the teacher says so.</w:t>
+      </w:r>
+    </w:p>
+    <w:p>
+      <w:pPr>
+        <w:pStyle w:val="ListBullet"/>
+      </w:pPr>
+      <w:r>
+        <w:rPr>
+          <w:rFonts w:ascii="Calibri" w:hAnsi="Calibri"/>
+          <w:b w:val="0"/>
+          <w:sz w:val="22"/>
+        </w:rPr>
+        <w:t xml:space="preserve">Thu: keep the space under the chute clear. Sharks and Dolphins uses the area around the chute, inside the boundary cones.</w:t>
+      </w:r>
+    </w:p>
+    <w:p>
+      <w:pPr>
+        <w:pStyle w:val="ListBullet"/>
+      </w:pPr>
+      <w:r>
+        <w:rPr>
+          <w:rFonts w:ascii="Calibri" w:hAnsi="Calibri"/>
+          <w:b w:val="0"/>
+          <w:sz w:val="22"/>
+        </w:rPr>
+        <w:t xml:space="preserve">Fri: same circle. Leave space beside the chute for groups to make number shapes on the floor.</w:t>
+      </w:r>
+    </w:p>
+    <w:p>
+      <w:pPr>
+        <w:pStyle w:val="Heading2"/>
+      </w:pPr>
+      <w:r>
+        <w:t>Shared look-fors this week</w:t>
+      </w:r>
+    </w:p>
+    <w:p>
+      <w:pPr>
+        <w:pStyle w:val="ListBullet"/>
+      </w:pPr>
+      <w:r>
+        <w:rPr>
+          <w:rFonts w:ascii="Calibri" w:hAnsi="Calibri"/>
+          <w:b w:val="0"/>
+          <w:sz w:val="22"/>
+        </w:rPr>
+        <w:t xml:space="preserve">Lift together on the count — the chute stays round; shoulders down</w:t>
+      </w:r>
+    </w:p>
+    <w:p>
+      <w:pPr>
+        <w:pStyle w:val="ListBullet"/>
+      </w:pPr>
+      <w:r>
+        <w:rPr>
+          <w:rFonts w:ascii="Calibri" w:hAnsi="Calibri"/>
+          <w:b w:val="0"/>
+          <w:sz w:val="22"/>
+        </w:rPr>
+        <w:t xml:space="preserve">Force and timing: pop the bags with a big snap, but never let go to chase a bag</w:t>
+      </w:r>
+    </w:p>
+    <w:p>
+      <w:pPr>
+        <w:pStyle w:val="ListBullet"/>
+      </w:pPr>
+      <w:r>
+        <w:rPr>
+          <w:rFonts w:ascii="Calibri" w:hAnsi="Calibri"/>
+          <w:b w:val="0"/>
+          <w:sz w:val="22"/>
+        </w:rPr>
+        <w:t xml:space="preserve">Listen for your colour or name; cross under with heads up and take a new handle without colliding</w:t>
+      </w:r>
+    </w:p>
+    <w:p>
+      <w:pPr>
+        <w:pStyle w:val="ListBullet"/>
+      </w:pPr>
+      <w:r>
+        <w:rPr>
+          <w:rFonts w:ascii="Calibri" w:hAnsi="Calibri"/>
+          <w:b w:val="0"/>
+          <w:sz w:val="22"/>
+        </w:rPr>
+        <w:t xml:space="preserve">Solve the group problem so no one is left out — wait for everyone</w:t>
+      </w:r>
+    </w:p>
+    <w:p>
+      <w:pPr>
+        <w:pStyle w:val="ListBullet"/>
+      </w:pPr>
+      <w:r>
+        <w:rPr>
+          <w:rFonts w:ascii="Calibri" w:hAnsi="Calibri"/>
+          <w:b w:val="0"/>
+          <w:sz w:val="22"/>
+        </w:rPr>
+        <w:t xml:space="preserve">A drop or tangle = restart from the last good shape · soft tag / stretch 10, then back in — no elimination</w:t>
+      </w:r>
+    </w:p>
+    <w:p>
+      <w:pPr>
+        <w:pStyle w:val="Heading2"/>
+      </w:pPr>
+      <w:r>
         <w:t>Game &amp; activity links used this week</w:t>
       </w:r>
     </w:p>
@@ -327,7 +1880,7 @@
         </w:rPr>
         <w:t xml:space="preserve">Week 7 lessons (playbook): </w:t>
       </w:r>
-      <w:hyperlink r:id="rId16">
+      <w:hyperlink r:id="rId18">
         <w:r>
           <w:rPr>
             <w:color w:val="0563C1"/>
@@ -347,7 +1900,7 @@
         </w:rPr>
         <w:t xml:space="preserve">Tue · C1 ripples and dome: </w:t>
       </w:r>
-      <w:hyperlink r:id="rId17">
+      <w:hyperlink r:id="rId19">
         <w:r>
           <w:rPr>
             <w:color w:val="0563C1"/>
@@ -367,7 +1920,7 @@
         </w:rPr>
         <w:t xml:space="preserve">Wed · C2 popcorn: </w:t>
       </w:r>
-      <w:hyperlink r:id="rId18">
+      <w:hyperlink r:id="rId20">
         <w:r>
           <w:rPr>
             <w:color w:val="0563C1"/>
@@ -387,7 +1940,7 @@
         </w:rPr>
         <w:t xml:space="preserve">Thu · C3 change-places: </w:t>
       </w:r>
-      <w:hyperlink r:id="rId19">
+      <w:hyperlink r:id="rId21">
         <w:r>
           <w:rPr>
             <w:color w:val="0563C1"/>
@@ -407,7 +1960,7 @@
         </w:rPr>
         <w:t xml:space="preserve">Fri · C4 number games: </w:t>
       </w:r>
-      <w:hyperlink r:id="rId20">
+      <w:hyperlink r:id="rId22">
         <w:r>
           <w:rPr>
             <w:color w:val="0563C1"/>
@@ -427,7 +1980,7 @@
         </w:rPr>
         <w:t xml:space="preserve">Parachute set (playbook card): </w:t>
       </w:r>
-      <w:hyperlink r:id="rId21">
+      <w:hyperlink r:id="rId23">
         <w:r>
           <w:rPr>
             <w:color w:val="0563C1"/>
@@ -447,7 +2000,7 @@
         </w:rPr>
         <w:t xml:space="preserve">Hot Air Balloon (library · dome): </w:t>
       </w:r>
-      <w:hyperlink r:id="rId22">
+      <w:hyperlink r:id="rId24">
         <w:r>
           <w:rPr>
             <w:color w:val="0563C1"/>
@@ -467,7 +2020,7 @@
         </w:rPr>
         <w:t xml:space="preserve">BackBurst (library · dome finisher): </w:t>
       </w:r>
-      <w:hyperlink r:id="rId23">
+      <w:hyperlink r:id="rId25">
         <w:r>
           <w:rPr>
             <w:color w:val="0563C1"/>
@@ -487,7 +2040,7 @@
         </w:rPr>
         <w:t xml:space="preserve">Parachute Popcorn rules: </w:t>
       </w:r>
-      <w:hyperlink r:id="rId24">
+      <w:hyperlink r:id="rId26">
         <w:r>
           <w:rPr>
             <w:color w:val="0563C1"/>
@@ -507,7 +2060,7 @@
         </w:rPr>
         <w:t xml:space="preserve">Parachute Popcorn demo: </w:t>
       </w:r>
-      <w:hyperlink r:id="rId25">
+      <w:hyperlink r:id="rId27">
         <w:r>
           <w:rPr>
             <w:color w:val="0563C1"/>
@@ -527,7 +2080,7 @@
         </w:rPr>
         <w:t xml:space="preserve">Parachute Rocket Launch (Gr 5–6 popcorn option): </w:t>
       </w:r>
-      <w:hyperlink r:id="rId26">
+      <w:hyperlink r:id="rId28">
         <w:r>
           <w:rPr>
             <w:color w:val="0563C1"/>
@@ -547,7 +2100,7 @@
         </w:rPr>
         <w:t xml:space="preserve">Rocket Launch demo: </w:t>
       </w:r>
-      <w:hyperlink r:id="rId27">
+      <w:hyperlink r:id="rId29">
         <w:r>
           <w:rPr>
             <w:color w:val="0563C1"/>
@@ -567,7 +2120,7 @@
         </w:rPr>
         <w:t xml:space="preserve">Sharks and Dolphins (playbook card · chute version): </w:t>
       </w:r>
-      <w:hyperlink r:id="rId28">
+      <w:hyperlink r:id="rId30">
         <w:r>
           <w:rPr>
             <w:color w:val="0563C1"/>
@@ -587,7 +2140,7 @@
         </w:rPr>
         <w:t xml:space="preserve">Parachute Sharks &amp; Lifeguards (playbook video for C3): </w:t>
       </w:r>
-      <w:hyperlink r:id="rId29">
+      <w:hyperlink r:id="rId31">
         <w:r>
           <w:rPr>
             <w:color w:val="0563C1"/>
@@ -607,7 +2160,7 @@
         </w:rPr>
         <w:t xml:space="preserve">Parachute Cat &amp; Mouse rules: </w:t>
       </w:r>
-      <w:hyperlink r:id="rId30">
+      <w:hyperlink r:id="rId32">
         <w:r>
           <w:rPr>
             <w:color w:val="0563C1"/>
@@ -627,7 +2180,7 @@
         </w:rPr>
         <w:t xml:space="preserve">Cat &amp; Mouse demo: </w:t>
       </w:r>
-      <w:hyperlink r:id="rId31">
+      <w:hyperlink r:id="rId33">
         <w:r>
           <w:rPr>
             <w:color w:val="0563C1"/>
@@ -647,7 +2200,7 @@
         </w:rPr>
         <w:t xml:space="preserve">Dizzy Dizzy (merry-go-round direction changes): </w:t>
       </w:r>
-      <w:hyperlink r:id="rId32">
+      <w:hyperlink r:id="rId34">
         <w:r>
           <w:rPr>
             <w:color w:val="0563C1"/>
@@ -667,7 +2220,7 @@
         </w:rPr>
         <w:t xml:space="preserve">Dizzy Dizzy demo: </w:t>
       </w:r>
-      <w:hyperlink r:id="rId33">
+      <w:hyperlink r:id="rId35">
         <w:r>
           <w:rPr>
             <w:color w:val="0563C1"/>
@@ -687,7 +2240,7 @@
         </w:rPr>
         <w:t xml:space="preserve">Hoop Run &amp; Spin (NEW · wu): </w:t>
       </w:r>
-      <w:hyperlink r:id="rId34">
+      <w:hyperlink r:id="rId36">
         <w:r>
           <w:rPr>
             <w:color w:val="0563C1"/>
@@ -707,7 +2260,7 @@
         </w:rPr>
         <w:t xml:space="preserve">Hoop Run &amp; Spin demo: </w:t>
       </w:r>
-      <w:hyperlink r:id="rId35">
+      <w:hyperlink r:id="rId37">
         <w:r>
           <w:rPr>
             <w:color w:val="0563C1"/>
@@ -727,7 +2280,7 @@
         </w:rPr>
         <w:t xml:space="preserve">Zone Tag (NEW · wu): </w:t>
       </w:r>
-      <w:hyperlink r:id="rId36">
+      <w:hyperlink r:id="rId38">
         <w:r>
           <w:rPr>
             <w:color w:val="0563C1"/>
@@ -747,7 +2300,7 @@
         </w:rPr>
         <w:t xml:space="preserve">Zone Tag demo: </w:t>
       </w:r>
-      <w:hyperlink r:id="rId37">
+      <w:hyperlink r:id="rId39">
         <w:r>
           <w:rPr>
             <w:color w:val="0563C1"/>
@@ -767,7 +2320,7 @@
         </w:rPr>
         <w:t xml:space="preserve">Post the Parcel (NEW · Fri wu option): </w:t>
       </w:r>
-      <w:hyperlink r:id="rId38">
+      <w:hyperlink r:id="rId40">
         <w:r>
           <w:rPr>
             <w:color w:val="0563C1"/>
@@ -787,7 +2340,7 @@
         </w:rPr>
         <w:t xml:space="preserve">Pancake Relay (NEW · Fri wu option): </w:t>
       </w:r>
-      <w:hyperlink r:id="rId39">
+      <w:hyperlink r:id="rId41">
         <w:r>
           <w:rPr>
             <w:color w:val="0563C1"/>
@@ -807,7 +2360,7 @@
         </w:rPr>
         <w:t xml:space="preserve">Post the Parcel / Pancake Relay demo: </w:t>
       </w:r>
-      <w:hyperlink r:id="rId40">
+      <w:hyperlink r:id="rId42">
         <w:r>
           <w:rPr>
             <w:color w:val="0563C1"/>
@@ -827,7 +2380,7 @@
         </w:rPr>
         <w:t xml:space="preserve">Horse and Jockey (wu option): </w:t>
       </w:r>
-      <w:hyperlink r:id="rId41">
+      <w:hyperlink r:id="rId43">
         <w:r>
           <w:rPr>
             <w:color w:val="0563C1"/>
@@ -847,7 +2400,7 @@
         </w:rPr>
         <w:t xml:space="preserve">Four Corners / Guess Who (stay-in opener): </w:t>
       </w:r>
-      <w:hyperlink r:id="rId42">
+      <w:hyperlink r:id="rId44">
         <w:r>
           <w:rPr>
             <w:color w:val="0563C1"/>
@@ -867,7 +2420,7 @@
         </w:rPr>
         <w:t xml:space="preserve">Warm-up stay-in ideas: </w:t>
       </w:r>
-      <w:hyperlink r:id="rId43">
+      <w:hyperlink r:id="rId45">
         <w:r>
           <w:rPr>
             <w:color w:val="0563C1"/>
@@ -887,7 +2440,7 @@
         </w:rPr>
         <w:t xml:space="preserve">PhysEdGames channel: </w:t>
       </w:r>
-      <w:hyperlink r:id="rId44">
+      <w:hyperlink r:id="rId46">
         <w:r>
           <w:rPr>
             <w:color w:val="0563C1"/>
@@ -907,7 +2460,7 @@
         </w:rPr>
         <w:t xml:space="preserve">Coach Gelardi: </w:t>
       </w:r>
-      <w:hyperlink r:id="rId45">
+      <w:hyperlink r:id="rId47">
         <w:r>
           <w:rPr>
             <w:color w:val="0563C1"/>
@@ -927,7 +2480,7 @@
         </w:rPr>
         <w:t xml:space="preserve">Daly Exercise: </w:t>
       </w:r>
-      <w:hyperlink r:id="rId46">
+      <w:hyperlink r:id="rId48">
         <w:r>
           <w:rPr>
             <w:color w:val="0563C1"/>
@@ -947,7 +2500,7 @@
         </w:rPr>
         <w:t xml:space="preserve">Prime Coaching Sport: </w:t>
       </w:r>
-      <w:hyperlink r:id="rId47">
+      <w:hyperlink r:id="rId49">
         <w:r>
           <w:rPr>
             <w:color w:val="0563C1"/>
@@ -1055,7 +2608,7 @@
         </w:rPr>
         <w:t xml:space="preserve">Links: </w:t>
       </w:r>
-      <w:hyperlink r:id="rId48">
+      <w:hyperlink r:id="rId50">
         <w:r>
           <w:rPr>
             <w:color w:val="0563C1"/>
@@ -1073,7 +2626,7 @@
         </w:rPr>
         <w:t xml:space="preserve"> · </w:t>
       </w:r>
-      <w:hyperlink r:id="rId49">
+      <w:hyperlink r:id="rId51">
         <w:r>
           <w:rPr>
             <w:color w:val="0563C1"/>
@@ -1091,7 +2644,7 @@
         </w:rPr>
         <w:t xml:space="preserve"> · </w:t>
       </w:r>
-      <w:hyperlink r:id="rId50">
+      <w:hyperlink r:id="rId52">
         <w:r>
           <w:rPr>
             <w:color w:val="0563C1"/>
@@ -1109,7 +2662,7 @@
         </w:rPr>
         <w:t xml:space="preserve"> · </w:t>
       </w:r>
-      <w:hyperlink r:id="rId51">
+      <w:hyperlink r:id="rId53">
         <w:r>
           <w:rPr>
             <w:color w:val="0563C1"/>
@@ -1127,7 +2680,7 @@
         </w:rPr>
         <w:t xml:space="preserve"> · </w:t>
       </w:r>
-      <w:hyperlink r:id="rId52">
+      <w:hyperlink r:id="rId54">
         <w:r>
           <w:rPr>
             <w:color w:val="0563C1"/>
@@ -1197,7 +2750,7 @@
         </w:rPr>
         <w:t xml:space="preserve">Links: </w:t>
       </w:r>
-      <w:hyperlink r:id="rId53">
+      <w:hyperlink r:id="rId55">
         <w:r>
           <w:rPr>
             <w:color w:val="0563C1"/>
@@ -1215,7 +2768,7 @@
         </w:rPr>
         <w:t xml:space="preserve"> · </w:t>
       </w:r>
-      <w:hyperlink r:id="rId54">
+      <w:hyperlink r:id="rId56">
         <w:r>
           <w:rPr>
             <w:color w:val="0563C1"/>
@@ -1233,7 +2786,7 @@
         </w:rPr>
         <w:t xml:space="preserve"> · </w:t>
       </w:r>
-      <w:hyperlink r:id="rId55">
+      <w:hyperlink r:id="rId57">
         <w:r>
           <w:rPr>
             <w:color w:val="0563C1"/>
@@ -1251,7 +2804,7 @@
         </w:rPr>
         <w:t xml:space="preserve"> · </w:t>
       </w:r>
-      <w:hyperlink r:id="rId56">
+      <w:hyperlink r:id="rId58">
         <w:r>
           <w:rPr>
             <w:color w:val="0563C1"/>
@@ -1321,7 +2874,7 @@
         </w:rPr>
         <w:t xml:space="preserve">Links: </w:t>
       </w:r>
-      <w:hyperlink r:id="rId57">
+      <w:hyperlink r:id="rId59">
         <w:r>
           <w:rPr>
             <w:color w:val="0563C1"/>
@@ -1339,7 +2892,7 @@
         </w:rPr>
         <w:t xml:space="preserve"> · </w:t>
       </w:r>
-      <w:hyperlink r:id="rId58">
+      <w:hyperlink r:id="rId60">
         <w:r>
           <w:rPr>
             <w:color w:val="0563C1"/>
@@ -1357,7 +2910,7 @@
         </w:rPr>
         <w:t xml:space="preserve"> · </w:t>
       </w:r>
-      <w:hyperlink r:id="rId59">
+      <w:hyperlink r:id="rId61">
         <w:r>
           <w:rPr>
             <w:color w:val="0563C1"/>
@@ -1375,7 +2928,7 @@
         </w:rPr>
         <w:t xml:space="preserve"> · </w:t>
       </w:r>
-      <w:hyperlink r:id="rId60">
+      <w:hyperlink r:id="rId62">
         <w:r>
           <w:rPr>
             <w:color w:val="0563C1"/>
@@ -1393,7 +2946,7 @@
         </w:rPr>
         <w:t xml:space="preserve"> · </w:t>
       </w:r>
-      <w:hyperlink r:id="rId61">
+      <w:hyperlink r:id="rId63">
         <w:r>
           <w:rPr>
             <w:color w:val="0563C1"/>
@@ -1463,7 +3016,7 @@
         </w:rPr>
         <w:t xml:space="preserve">Links: </w:t>
       </w:r>
-      <w:hyperlink r:id="rId62">
+      <w:hyperlink r:id="rId64">
         <w:r>
           <w:rPr>
             <w:color w:val="0563C1"/>
@@ -1481,7 +3034,7 @@
         </w:rPr>
         <w:t xml:space="preserve"> · </w:t>
       </w:r>
-      <w:hyperlink r:id="rId63">
+      <w:hyperlink r:id="rId65">
         <w:r>
           <w:rPr>
             <w:color w:val="0563C1"/>
@@ -1499,7 +3052,7 @@
         </w:rPr>
         <w:t xml:space="preserve"> · </w:t>
       </w:r>
-      <w:hyperlink r:id="rId64">
+      <w:hyperlink r:id="rId66">
         <w:r>
           <w:rPr>
             <w:color w:val="0563C1"/>
@@ -1517,7 +3070,7 @@
         </w:rPr>
         <w:t xml:space="preserve"> · </w:t>
       </w:r>
-      <w:hyperlink r:id="rId65">
+      <w:hyperlink r:id="rId67">
         <w:r>
           <w:rPr>
             <w:color w:val="0563C1"/>
@@ -1526,122 +3079,6 @@
             <w:rFonts w:ascii="Calibri" w:hAnsi="Calibri"/>
           </w:rPr>
           <w:t>BackBurst</w:t>
-        </w:r>
-      </w:hyperlink>
-      <w:r>
-        <w:rPr>
-          <w:rFonts w:ascii="Calibri" w:hAnsi="Calibri"/>
-          <w:sz w:val="22"/>
-        </w:rPr>
-        <w:t xml:space="preserve"> · </w:t>
-      </w:r>
-      <w:hyperlink r:id="rId66">
-        <w:r>
-          <w:rPr>
-            <w:color w:val="0563C1"/>
-            <w:u w:val="single"/>
-            <w:sz w:val="22"/>
-            <w:rFonts w:ascii="Calibri" w:hAnsi="Calibri"/>
-          </w:rPr>
-          <w:t>Parachute card</w:t>
-        </w:r>
-      </w:hyperlink>
-    </w:p>
-    <w:p>
-      <w:r>
-        <w:rPr>
-          <w:rFonts w:ascii="Calibri" w:hAnsi="Calibri"/>
-          <w:b w:val="0"/>
-          <w:sz w:val="22"/>
-        </w:rPr>
-        <w:t xml:space="preserve">Look-fors (1–2): small ripples first, lift on the teacher count, few bags, never let go to chase, walk only under, teacher calls numbers, stay-in. (Tue–Fri.)</w:t>
-      </w:r>
-    </w:p>
-    <w:p>
-      <w:pPr>
-        <w:pStyle w:val="Heading2"/>
-      </w:pPr>
-      <w:r>
-        <w:t>Grades 3–4</w:t>
-      </w:r>
-    </w:p>
-    <w:p>
-      <w:r>
-        <w:rPr>
-          <w:rFonts w:ascii="Calibri" w:hAnsi="Calibri"/>
-          <w:b w:val="0"/>
-          <w:sz w:val="22"/>
-        </w:rPr>
-        <w:t xml:space="preserve">Focus: Dome sit · colour rules on popcorn · jog under · student callers</w:t>
-      </w:r>
-    </w:p>
-    <w:p>
-      <w:r>
-        <w:rPr>
-          <w:rFonts w:ascii="Calibri" w:hAnsi="Calibri"/>
-          <w:b/>
-          <w:sz w:val="22"/>
-        </w:rPr>
-        <w:t xml:space="preserve">Day 1 · Tue Oct 13 · Parachute ripples and dome — Together on a count</w:t>
-      </w:r>
-    </w:p>
-    <w:p>
-      <w:r>
-        <w:rPr>
-          <w:rFonts w:ascii="Calibri" w:hAnsi="Calibri"/>
-          <w:b w:val="0"/>
-          <w:sz w:val="22"/>
-        </w:rPr>
-        <w:t xml:space="preserve">wu: Hoop Run &amp; Spin (NEW, Daly) — spin, swap, catch; one step back after each success · or jog the circle holding the chute.</w:t>
-      </w:r>
-    </w:p>
-    <w:p>
-      <w:r>
-        <w:rPr>
-          <w:rFonts w:ascii="Calibri" w:hAnsi="Calibri"/>
-          <w:b w:val="0"/>
-          <w:sz w:val="22"/>
-        </w:rPr>
-        <w:t xml:space="preserve">skill: Ripples, big waves, then mushroom/dome on a 3-count. Cue: lift together.</w:t>
-      </w:r>
-    </w:p>
-    <w:p>
-      <w:r>
-        <w:rPr>
-          <w:rFonts w:ascii="Calibri" w:hAnsi="Calibri"/>
-          <w:b w:val="0"/>
-          <w:sz w:val="22"/>
-        </w:rPr>
-        <w:t xml:space="preserve">game: Dome sit — lift, step in, sit on the edge to trap the air · then Hot Air Balloon rounds (5 steps in, 5 out).</w:t>
-      </w:r>
-    </w:p>
-    <w:p>
-      <w:r>
-        <w:rPr>
-          <w:rFonts w:ascii="Calibri" w:hAnsi="Calibri"/>
-          <w:b w:val="0"/>
-          <w:sz w:val="22"/>
-        </w:rPr>
-        <w:t xml:space="preserve">cd: Shoulders down.</w:t>
-      </w:r>
-    </w:p>
-    <w:p>
-      <w:r>
-        <w:rPr>
-          <w:rFonts w:ascii="Calibri" w:hAnsi="Calibri"/>
-          <w:sz w:val="22"/>
-        </w:rPr>
-        <w:t xml:space="preserve">Links: </w:t>
-      </w:r>
-      <w:hyperlink r:id="rId67">
-        <w:r>
-          <w:rPr>
-            <w:color w:val="0563C1"/>
-            <w:u w:val="single"/>
-            <w:sz w:val="22"/>
-            <w:rFonts w:ascii="Calibri" w:hAnsi="Calibri"/>
-          </w:rPr>
-          <w:t>Playbook W2 · C1</w:t>
         </w:r>
       </w:hyperlink>
       <w:r>
@@ -1662,6 +3099,104 @@
           <w:t>Parachute card</w:t>
         </w:r>
       </w:hyperlink>
+    </w:p>
+    <w:p>
+      <w:r>
+        <w:rPr>
+          <w:rFonts w:ascii="Calibri" w:hAnsi="Calibri"/>
+          <w:b w:val="0"/>
+          <w:sz w:val="22"/>
+        </w:rPr>
+        <w:t xml:space="preserve">Look-fors (1–2): small ripples first, lift on the teacher count, few bags, never let go to chase, walk only under, teacher calls numbers, stay-in. (Tue–Fri.)</w:t>
+      </w:r>
+    </w:p>
+    <w:p>
+      <w:pPr>
+        <w:pStyle w:val="Heading2"/>
+      </w:pPr>
+      <w:r>
+        <w:t>Grades 3–4</w:t>
+      </w:r>
+    </w:p>
+    <w:p>
+      <w:r>
+        <w:rPr>
+          <w:rFonts w:ascii="Calibri" w:hAnsi="Calibri"/>
+          <w:b w:val="0"/>
+          <w:sz w:val="22"/>
+        </w:rPr>
+        <w:t xml:space="preserve">Focus: Dome sit · colour rules on popcorn · jog under · student callers</w:t>
+      </w:r>
+    </w:p>
+    <w:p>
+      <w:r>
+        <w:rPr>
+          <w:rFonts w:ascii="Calibri" w:hAnsi="Calibri"/>
+          <w:b/>
+          <w:sz w:val="22"/>
+        </w:rPr>
+        <w:t xml:space="preserve">Day 1 · Tue Oct 13 · Parachute ripples and dome — Together on a count</w:t>
+      </w:r>
+    </w:p>
+    <w:p>
+      <w:r>
+        <w:rPr>
+          <w:rFonts w:ascii="Calibri" w:hAnsi="Calibri"/>
+          <w:b w:val="0"/>
+          <w:sz w:val="22"/>
+        </w:rPr>
+        <w:t xml:space="preserve">wu: Hoop Run &amp; Spin (NEW, Daly) — spin, swap, catch; one step back after each success · or jog the circle holding the chute.</w:t>
+      </w:r>
+    </w:p>
+    <w:p>
+      <w:r>
+        <w:rPr>
+          <w:rFonts w:ascii="Calibri" w:hAnsi="Calibri"/>
+          <w:b w:val="0"/>
+          <w:sz w:val="22"/>
+        </w:rPr>
+        <w:t xml:space="preserve">skill: Ripples, big waves, then mushroom/dome on a 3-count. Cue: lift together.</w:t>
+      </w:r>
+    </w:p>
+    <w:p>
+      <w:r>
+        <w:rPr>
+          <w:rFonts w:ascii="Calibri" w:hAnsi="Calibri"/>
+          <w:b w:val="0"/>
+          <w:sz w:val="22"/>
+        </w:rPr>
+        <w:t xml:space="preserve">game: Dome sit — lift, step in, sit on the edge to trap the air · then Hot Air Balloon rounds (5 steps in, 5 out).</w:t>
+      </w:r>
+    </w:p>
+    <w:p>
+      <w:r>
+        <w:rPr>
+          <w:rFonts w:ascii="Calibri" w:hAnsi="Calibri"/>
+          <w:b w:val="0"/>
+          <w:sz w:val="22"/>
+        </w:rPr>
+        <w:t xml:space="preserve">cd: Shoulders down.</w:t>
+      </w:r>
+    </w:p>
+    <w:p>
+      <w:r>
+        <w:rPr>
+          <w:rFonts w:ascii="Calibri" w:hAnsi="Calibri"/>
+          <w:sz w:val="22"/>
+        </w:rPr>
+        <w:t xml:space="preserve">Links: </w:t>
+      </w:r>
+      <w:hyperlink r:id="rId69">
+        <w:r>
+          <w:rPr>
+            <w:color w:val="0563C1"/>
+            <w:u w:val="single"/>
+            <w:sz w:val="22"/>
+            <w:rFonts w:ascii="Calibri" w:hAnsi="Calibri"/>
+          </w:rPr>
+          <w:t>Playbook W2 · C1</w:t>
+        </w:r>
+      </w:hyperlink>
       <w:r>
         <w:rPr>
           <w:rFonts w:ascii="Calibri" w:hAnsi="Calibri"/>
@@ -1669,7 +3204,25 @@
         </w:rPr>
         <w:t xml:space="preserve"> · </w:t>
       </w:r>
-      <w:hyperlink r:id="rId69">
+      <w:hyperlink r:id="rId70">
+        <w:r>
+          <w:rPr>
+            <w:color w:val="0563C1"/>
+            <w:u w:val="single"/>
+            <w:sz w:val="22"/>
+            <w:rFonts w:ascii="Calibri" w:hAnsi="Calibri"/>
+          </w:rPr>
+          <w:t>Parachute card</w:t>
+        </w:r>
+      </w:hyperlink>
+      <w:r>
+        <w:rPr>
+          <w:rFonts w:ascii="Calibri" w:hAnsi="Calibri"/>
+          <w:sz w:val="22"/>
+        </w:rPr>
+        <w:t xml:space="preserve"> · </w:t>
+      </w:r>
+      <w:hyperlink r:id="rId71">
         <w:r>
           <w:rPr>
             <w:color w:val="0563C1"/>
@@ -1687,7 +3240,7 @@
         </w:rPr>
         <w:t xml:space="preserve"> · </w:t>
       </w:r>
-      <w:hyperlink r:id="rId70">
+      <w:hyperlink r:id="rId72">
         <w:r>
           <w:rPr>
             <w:color w:val="0563C1"/>
@@ -1705,7 +3258,7 @@
         </w:rPr>
         <w:t xml:space="preserve"> · </w:t>
       </w:r>
-      <w:hyperlink r:id="rId71">
+      <w:hyperlink r:id="rId73">
         <w:r>
           <w:rPr>
             <w:color w:val="0563C1"/>
@@ -1723,7 +3276,7 @@
         </w:rPr>
         <w:t xml:space="preserve"> · </w:t>
       </w:r>
-      <w:hyperlink r:id="rId72">
+      <w:hyperlink r:id="rId74">
         <w:r>
           <w:rPr>
             <w:color w:val="0563C1"/>
@@ -1793,7 +3346,7 @@
         </w:rPr>
         <w:t xml:space="preserve">Links: </w:t>
       </w:r>
-      <w:hyperlink r:id="rId73">
+      <w:hyperlink r:id="rId75">
         <w:r>
           <w:rPr>
             <w:color w:val="0563C1"/>
@@ -1811,7 +3364,7 @@
         </w:rPr>
         <w:t xml:space="preserve"> · </w:t>
       </w:r>
-      <w:hyperlink r:id="rId74">
+      <w:hyperlink r:id="rId76">
         <w:r>
           <w:rPr>
             <w:color w:val="0563C1"/>
@@ -1829,7 +3382,7 @@
         </w:rPr>
         <w:t xml:space="preserve"> · </w:t>
       </w:r>
-      <w:hyperlink r:id="rId75">
+      <w:hyperlink r:id="rId77">
         <w:r>
           <w:rPr>
             <w:color w:val="0563C1"/>
@@ -1847,7 +3400,7 @@
         </w:rPr>
         <w:t xml:space="preserve"> · </w:t>
       </w:r>
-      <w:hyperlink r:id="rId76">
+      <w:hyperlink r:id="rId78">
         <w:r>
           <w:rPr>
             <w:color w:val="0563C1"/>
@@ -1917,7 +3470,7 @@
         </w:rPr>
         <w:t xml:space="preserve">Links: </w:t>
       </w:r>
-      <w:hyperlink r:id="rId77">
+      <w:hyperlink r:id="rId79">
         <w:r>
           <w:rPr>
             <w:color w:val="0563C1"/>
@@ -1935,7 +3488,7 @@
         </w:rPr>
         <w:t xml:space="preserve"> · </w:t>
       </w:r>
-      <w:hyperlink r:id="rId78">
+      <w:hyperlink r:id="rId80">
         <w:r>
           <w:rPr>
             <w:color w:val="0563C1"/>
@@ -1953,7 +3506,7 @@
         </w:rPr>
         <w:t xml:space="preserve"> · </w:t>
       </w:r>
-      <w:hyperlink r:id="rId79">
+      <w:hyperlink r:id="rId81">
         <w:r>
           <w:rPr>
             <w:color w:val="0563C1"/>
@@ -1971,7 +3524,7 @@
         </w:rPr>
         <w:t xml:space="preserve"> · </w:t>
       </w:r>
-      <w:hyperlink r:id="rId80">
+      <w:hyperlink r:id="rId82">
         <w:r>
           <w:rPr>
             <w:color w:val="0563C1"/>
@@ -1989,7 +3542,7 @@
         </w:rPr>
         <w:t xml:space="preserve"> · </w:t>
       </w:r>
-      <w:hyperlink r:id="rId81">
+      <w:hyperlink r:id="rId83">
         <w:r>
           <w:rPr>
             <w:color w:val="0563C1"/>
@@ -2007,7 +3560,7 @@
         </w:rPr>
         <w:t xml:space="preserve"> · </w:t>
       </w:r>
-      <w:hyperlink r:id="rId82">
+      <w:hyperlink r:id="rId84">
         <w:r>
           <w:rPr>
             <w:color w:val="0563C1"/>
@@ -2077,7 +3630,7 @@
         </w:rPr>
         <w:t xml:space="preserve">Links: </w:t>
       </w:r>
-      <w:hyperlink r:id="rId83">
+      <w:hyperlink r:id="rId85">
         <w:r>
           <w:rPr>
             <w:color w:val="0563C1"/>
@@ -2095,7 +3648,7 @@
         </w:rPr>
         <w:t xml:space="preserve"> · </w:t>
       </w:r>
-      <w:hyperlink r:id="rId84">
+      <w:hyperlink r:id="rId86">
         <w:r>
           <w:rPr>
             <w:color w:val="0563C1"/>
@@ -2113,7 +3666,7 @@
         </w:rPr>
         <w:t xml:space="preserve"> · </w:t>
       </w:r>
-      <w:hyperlink r:id="rId85">
+      <w:hyperlink r:id="rId87">
         <w:r>
           <w:rPr>
             <w:color w:val="0563C1"/>
@@ -2131,7 +3684,7 @@
         </w:rPr>
         <w:t xml:space="preserve"> · </w:t>
       </w:r>
-      <w:hyperlink r:id="rId86">
+      <w:hyperlink r:id="rId88">
         <w:r>
           <w:rPr>
             <w:color w:val="0563C1"/>
@@ -2149,7 +3702,7 @@
         </w:rPr>
         <w:t xml:space="preserve"> · </w:t>
       </w:r>
-      <w:hyperlink r:id="rId87">
+      <w:hyperlink r:id="rId89">
         <w:r>
           <w:rPr>
             <w:color w:val="0563C1"/>
@@ -2247,7 +3800,7 @@
         </w:rPr>
         <w:t xml:space="preserve">Links: </w:t>
       </w:r>
-      <w:hyperlink r:id="rId88">
+      <w:hyperlink r:id="rId90">
         <w:r>
           <w:rPr>
             <w:color w:val="0563C1"/>
@@ -2265,7 +3818,7 @@
         </w:rPr>
         <w:t xml:space="preserve"> · </w:t>
       </w:r>
-      <w:hyperlink r:id="rId89">
+      <w:hyperlink r:id="rId91">
         <w:r>
           <w:rPr>
             <w:color w:val="0563C1"/>
@@ -2283,7 +3836,7 @@
         </w:rPr>
         <w:t xml:space="preserve"> · </w:t>
       </w:r>
-      <w:hyperlink r:id="rId90">
+      <w:hyperlink r:id="rId92">
         <w:r>
           <w:rPr>
             <w:color w:val="0563C1"/>
@@ -2301,7 +3854,7 @@
         </w:rPr>
         <w:t xml:space="preserve"> · </w:t>
       </w:r>
-      <w:hyperlink r:id="rId91">
+      <w:hyperlink r:id="rId93">
         <w:r>
           <w:rPr>
             <w:color w:val="0563C1"/>
@@ -2319,7 +3872,7 @@
         </w:rPr>
         <w:t xml:space="preserve"> · </w:t>
       </w:r>
-      <w:hyperlink r:id="rId92">
+      <w:hyperlink r:id="rId94">
         <w:r>
           <w:rPr>
             <w:color w:val="0563C1"/>
@@ -2337,7 +3890,7 @@
         </w:rPr>
         <w:t xml:space="preserve"> · </w:t>
       </w:r>
-      <w:hyperlink r:id="rId93">
+      <w:hyperlink r:id="rId95">
         <w:r>
           <w:rPr>
             <w:color w:val="0563C1"/>
@@ -2407,7 +3960,7 @@
         </w:rPr>
         <w:t xml:space="preserve">Links: </w:t>
       </w:r>
-      <w:hyperlink r:id="rId94">
+      <w:hyperlink r:id="rId96">
         <w:r>
           <w:rPr>
             <w:color w:val="0563C1"/>
@@ -2425,7 +3978,7 @@
         </w:rPr>
         <w:t xml:space="preserve"> · </w:t>
       </w:r>
-      <w:hyperlink r:id="rId95">
+      <w:hyperlink r:id="rId97">
         <w:r>
           <w:rPr>
             <w:color w:val="0563C1"/>
@@ -2443,7 +3996,7 @@
         </w:rPr>
         <w:t xml:space="preserve"> · </w:t>
       </w:r>
-      <w:hyperlink r:id="rId96">
+      <w:hyperlink r:id="rId98">
         <w:r>
           <w:rPr>
             <w:color w:val="0563C1"/>
@@ -2461,7 +4014,7 @@
         </w:rPr>
         <w:t xml:space="preserve"> · </w:t>
       </w:r>
-      <w:hyperlink r:id="rId97">
+      <w:hyperlink r:id="rId99">
         <w:r>
           <w:rPr>
             <w:color w:val="0563C1"/>
@@ -2479,7 +4032,7 @@
         </w:rPr>
         <w:t xml:space="preserve"> · </w:t>
       </w:r>
-      <w:hyperlink r:id="rId98">
+      <w:hyperlink r:id="rId100">
         <w:r>
           <w:rPr>
             <w:color w:val="0563C1"/>
@@ -2549,7 +4102,7 @@
         </w:rPr>
         <w:t xml:space="preserve">Links: </w:t>
       </w:r>
-      <w:hyperlink r:id="rId99">
+      <w:hyperlink r:id="rId101">
         <w:r>
           <w:rPr>
             <w:color w:val="0563C1"/>
@@ -2567,7 +4120,7 @@
         </w:rPr>
         <w:t xml:space="preserve"> · </w:t>
       </w:r>
-      <w:hyperlink r:id="rId100">
+      <w:hyperlink r:id="rId102">
         <w:r>
           <w:rPr>
             <w:color w:val="0563C1"/>
@@ -2585,7 +4138,7 @@
         </w:rPr>
         <w:t xml:space="preserve"> · </w:t>
       </w:r>
-      <w:hyperlink r:id="rId101">
+      <w:hyperlink r:id="rId103">
         <w:r>
           <w:rPr>
             <w:color w:val="0563C1"/>
@@ -2603,7 +4156,7 @@
         </w:rPr>
         <w:t xml:space="preserve"> · </w:t>
       </w:r>
-      <w:hyperlink r:id="rId102">
+      <w:hyperlink r:id="rId104">
         <w:r>
           <w:rPr>
             <w:color w:val="0563C1"/>
@@ -2621,7 +4174,7 @@
         </w:rPr>
         <w:t xml:space="preserve"> · </w:t>
       </w:r>
-      <w:hyperlink r:id="rId103">
+      <w:hyperlink r:id="rId105">
         <w:r>
           <w:rPr>
             <w:color w:val="0563C1"/>
@@ -2639,7 +4192,7 @@
         </w:rPr>
         <w:t xml:space="preserve"> · </w:t>
       </w:r>
-      <w:hyperlink r:id="rId104">
+      <w:hyperlink r:id="rId106">
         <w:r>
           <w:rPr>
             <w:color w:val="0563C1"/>
@@ -2709,7 +4262,7 @@
         </w:rPr>
         <w:t xml:space="preserve">Links: </w:t>
       </w:r>
-      <w:hyperlink r:id="rId105">
+      <w:hyperlink r:id="rId107">
         <w:r>
           <w:rPr>
             <w:color w:val="0563C1"/>
@@ -2727,7 +4280,7 @@
         </w:rPr>
         <w:t xml:space="preserve"> · </w:t>
       </w:r>
-      <w:hyperlink r:id="rId106">
+      <w:hyperlink r:id="rId108">
         <w:r>
           <w:rPr>
             <w:color w:val="0563C1"/>
@@ -2745,7 +4298,7 @@
         </w:rPr>
         <w:t xml:space="preserve"> · </w:t>
       </w:r>
-      <w:hyperlink r:id="rId107">
+      <w:hyperlink r:id="rId109">
         <w:r>
           <w:rPr>
             <w:color w:val="0563C1"/>
@@ -2763,7 +4316,7 @@
         </w:rPr>
         <w:t xml:space="preserve"> · </w:t>
       </w:r>
-      <w:hyperlink r:id="rId108">
+      <w:hyperlink r:id="rId110">
         <w:r>
           <w:rPr>
             <w:color w:val="0563C1"/>
@@ -2781,7 +4334,7 @@
         </w:rPr>
         <w:t xml:space="preserve"> · </w:t>
       </w:r>
-      <w:hyperlink r:id="rId109">
+      <w:hyperlink r:id="rId111">
         <w:r>
           <w:rPr>
             <w:color w:val="0563C1"/>
@@ -2799,7 +4352,7 @@
         </w:rPr>
         <w:t xml:space="preserve"> · </w:t>
       </w:r>
-      <w:hyperlink r:id="rId110">
+      <w:hyperlink r:id="rId112">
         <w:r>
           <w:rPr>
             <w:color w:val="0563C1"/>
@@ -2822,10 +4375,305 @@
       </w:r>
     </w:p>
     <w:p>
+      <w:r>
+        <w:rPr>
+          <w:rFonts w:ascii="Calibri" w:hAnsi="Calibri"/>
+          <w:b w:val="0"/>
+          <w:i/>
+          <w:sz w:val="22"/>
+        </w:rPr>
+        <w:t xml:space="preserve">Timing check: Tue, Thu and Fri are 30-minute classes (about 5 warm-up + 10 skill + 10 game + 5 cool-down). Wednesday is a 25-minute plan for early dismissal (warm-up + game + cool-down only).</w:t>
+      </w:r>
+    </w:p>
+    <w:p>
       <w:pPr>
         <w:pStyle w:val="Heading2"/>
       </w:pPr>
       <w:r>
+        <w:t>Safety notes</w:t>
+      </w:r>
+    </w:p>
+    <w:p>
+      <w:pPr>
+        <w:pStyle w:val="ListBullet"/>
+      </w:pPr>
+      <w:r>
+        <w:rPr>
+          <w:rFonts w:ascii="Calibri" w:hAnsi="Calibri"/>
+          <w:b w:val="0"/>
+          <w:sz w:val="22"/>
+        </w:rPr>
+        <w:t xml:space="preserve">Stop signal: one whistle = “Chute freeze! Hold your handle still, eyes on me.” Two whistles = lower the chute gently to the floor, hands off, and sit. Practise both in the first minute every day.</w:t>
+      </w:r>
+    </w:p>
+    <w:p>
+      <w:pPr>
+        <w:pStyle w:val="ListBullet"/>
+      </w:pPr>
+      <w:r>
+        <w:rPr>
+          <w:rFonts w:ascii="Calibri" w:hAnsi="Calibri"/>
+          <w:b w:val="0"/>
+          <w:sz w:val="22"/>
+        </w:rPr>
+        <w:t xml:space="preserve">Hands stay on the handles unless your colour or name is called. Never wrap the chute or a handle around a wrist, a hand or a classmate. Nobody is pulled off their feet.</w:t>
+      </w:r>
+    </w:p>
+    <w:p>
+      <w:pPr>
+        <w:pStyle w:val="ListBullet"/>
+      </w:pPr>
+      <w:r>
+        <w:rPr>
+          <w:rFonts w:ascii="Calibri" w:hAnsi="Calibri"/>
+          <w:b w:val="0"/>
+          <w:sz w:val="22"/>
+        </w:rPr>
+        <w:t xml:space="preserve">Going under: walk under first (Gr 1–2 walk only; Gr 3–6 jog only after a safe walk round), heads up, eyes open. Students holding the chute keep it lifted until everyone is out. Never pull the chute down on anyone.</w:t>
+      </w:r>
+    </w:p>
+    <w:p>
+      <w:pPr>
+        <w:pStyle w:val="ListBullet"/>
+      </w:pPr>
+      <w:r>
+        <w:rPr>
+          <w:rFonts w:ascii="Calibri" w:hAnsi="Calibri"/>
+          <w:b w:val="0"/>
+          <w:sz w:val="22"/>
+        </w:rPr>
+        <w:t xml:space="preserve">Cat &amp; Mouse: only one cat at a time, on hands and knees on top of the chute — never standing or walking on it. The class makes small waves only. Switch roles often.</w:t>
+      </w:r>
+    </w:p>
+    <w:p>
+      <w:pPr>
+        <w:pStyle w:val="ListBullet"/>
+      </w:pPr>
+      <w:r>
+        <w:rPr>
+          <w:rFonts w:ascii="Calibri" w:hAnsi="Calibri"/>
+          <w:b w:val="0"/>
+          <w:sz w:val="22"/>
+        </w:rPr>
+        <w:t xml:space="preserve">Popcorn: the teacher fetches loose beanbags. Students never let go to chase a bag. Soft beanbags or foam balls only; Rocket Launch uses a soft ball.</w:t>
+      </w:r>
+    </w:p>
+    <w:p>
+      <w:pPr>
+        <w:pStyle w:val="ListBullet"/>
+      </w:pPr>
+      <w:r>
+        <w:rPr>
+          <w:rFonts w:ascii="Calibri" w:hAnsi="Calibri"/>
+          <w:b w:val="0"/>
+          <w:sz w:val="22"/>
+        </w:rPr>
+        <w:t xml:space="preserve">Tag games (Sharks and Dolphins, Zone Tag): walk-tag for Gr 1–2; two-finger tag on the back or shoulder; soft noodles below the shoulders only; boundaries at least 2 m from walls and the stage.</w:t>
+      </w:r>
+    </w:p>
+    <w:p>
+      <w:pPr>
+        <w:pStyle w:val="ListBullet"/>
+      </w:pPr>
+      <w:r>
+        <w:rPr>
+          <w:rFonts w:ascii="Calibri" w:hAnsi="Calibri"/>
+          <w:b w:val="0"/>
+          <w:sz w:val="22"/>
+        </w:rPr>
+        <w:t xml:space="preserve">Merry-go-round and Dizzy Dizzy: walk pace for Gr 1–2; change direction only on the call. If the chute gets chaotic, freeze, reset to ripples, then try again.</w:t>
+      </w:r>
+    </w:p>
+    <w:p>
+      <w:pPr>
+        <w:pStyle w:val="ListBullet"/>
+      </w:pPr>
+      <w:r>
+        <w:rPr>
+          <w:rFonts w:ascii="Calibri" w:hAnsi="Calibri"/>
+          <w:b w:val="0"/>
+          <w:sz w:val="22"/>
+        </w:rPr>
+        <w:t xml:space="preserve">Check the chute for rips and loose handles before class. Shoes tied; no socks-only. Water break after the warm-up if needed.</w:t>
+      </w:r>
+    </w:p>
+    <w:p>
+      <w:pPr>
+        <w:pStyle w:val="ListBullet"/>
+      </w:pPr>
+      <w:r>
+        <w:rPr>
+          <w:rFonts w:ascii="Calibri" w:hAnsi="Calibri"/>
+          <w:b w:val="0"/>
+          <w:sz w:val="22"/>
+        </w:rPr>
+        <w:t xml:space="preserve">Medical/allergy: “Check the class medical alert list in the sub binder.” Follow SPHEReS (myspheres.ca) guidance and school policy.</w:t>
+      </w:r>
+    </w:p>
+    <w:p>
+      <w:pPr>
+        <w:pStyle w:val="Heading2"/>
+      </w:pPr>
+      <w:r>
+        <w:t>Differentiation and inclusive supports</w:t>
+      </w:r>
+    </w:p>
+    <w:p>
+      <w:pPr>
+        <w:pStyle w:val="ListBullet"/>
+      </w:pPr>
+      <w:r>
+        <w:rPr>
+          <w:rFonts w:ascii="Calibri" w:hAnsi="Calibri"/>
+          <w:b w:val="0"/>
+          <w:sz w:val="22"/>
+        </w:rPr>
+        <w:t xml:space="preserve">Support: hold the handle with two hands; stand next to a helper; use small ripples and fewer bags; walk under with a buddy; picture cue cards (lift, shake, freeze, under); a student may stay at the handle and be a caller instead of going under.</w:t>
+      </w:r>
+    </w:p>
+    <w:p>
+      <w:pPr>
+        <w:pStyle w:val="ListBullet"/>
+      </w:pPr>
+      <w:r>
+        <w:rPr>
+          <w:rFonts w:ascii="Calibri" w:hAnsi="Calibri"/>
+          <w:b w:val="0"/>
+          <w:sz w:val="22"/>
+        </w:rPr>
+        <w:t xml:space="preserve">Extension (same outcome): count the lift for the class; keep 6 bags up or pop to a target hoop; take the silent call (teacher points); lead silent number shapes; be a student caller who includes everyone.</w:t>
+      </w:r>
+    </w:p>
+    <w:p>
+      <w:pPr>
+        <w:pStyle w:val="ListBullet"/>
+      </w:pPr>
+      <w:r>
+        <w:rPr>
+          <w:rFonts w:ascii="Calibri" w:hAnsi="Calibri"/>
+          <w:b w:val="0"/>
+          <w:sz w:val="22"/>
+        </w:rPr>
+        <w:t xml:space="preserve">ISP/accommodations: “Follow ISP supports listed in the class binder.”</w:t>
+      </w:r>
+    </w:p>
+    <w:p>
+      <w:pPr>
+        <w:pStyle w:val="ListBullet"/>
+      </w:pPr>
+      <w:r>
+        <w:rPr>
+          <w:rFonts w:ascii="Calibri" w:hAnsi="Calibri"/>
+          <w:b w:val="0"/>
+          <w:sz w:val="22"/>
+        </w:rPr>
+        <w:t xml:space="preserve">Students who use a wheelchair or mobility aid: hold the chute seated or from the chair; cross on the call with a clear, wide path (the class lifts high and waits); in Sharks and Dolphins, a shark or dolphin may tag with a noodle.</w:t>
+      </w:r>
+    </w:p>
+    <w:p>
+      <w:pPr>
+        <w:pStyle w:val="ListBullet"/>
+      </w:pPr>
+      <w:r>
+        <w:rPr>
+          <w:rFonts w:ascii="Calibri" w:hAnsi="Calibri"/>
+          <w:b w:val="0"/>
+          <w:sz w:val="22"/>
+        </w:rPr>
+        <w:t xml:space="preserve">Students who find noise or crowding hard: offer a handle beside an adult, a calm spot on the bench line, and the caller or counter role.</w:t>
+      </w:r>
+    </w:p>
+    <w:p>
+      <w:pPr>
+        <w:pStyle w:val="ListBullet"/>
+      </w:pPr>
+      <w:r>
+        <w:rPr>
+          <w:rFonts w:ascii="Calibri" w:hAnsi="Calibri"/>
+          <w:b w:val="0"/>
+          <w:sz w:val="22"/>
+        </w:rPr>
+        <w:t xml:space="preserve">Language learners: model every skill first; point to the cue card; key vocabulary — lift, down, ripple, wave, dome, shake, pop, freeze, under, colour, number.</w:t>
+      </w:r>
+    </w:p>
+    <w:p>
+      <w:pPr>
+        <w:pStyle w:val="Heading2"/>
+      </w:pPr>
+      <w:r>
+        <w:t>Classroom management cues</w:t>
+      </w:r>
+    </w:p>
+    <w:p>
+      <w:pPr>
+        <w:pStyle w:val="ListBullet"/>
+      </w:pPr>
+      <w:r>
+        <w:rPr>
+          <w:rFonts w:ascii="Calibri" w:hAnsi="Calibri"/>
+          <w:b w:val="0"/>
+          <w:sz w:val="22"/>
+        </w:rPr>
+        <w:t xml:space="preserve">Attention signal: one whistle and a raised hand — “Chute freeze!” Students hold the handle still and look at you.</w:t>
+      </w:r>
+    </w:p>
+    <w:p>
+      <w:pPr>
+        <w:pStyle w:val="ListBullet"/>
+      </w:pPr>
+      <w:r>
+        <w:rPr>
+          <w:rFonts w:ascii="Calibri" w:hAnsi="Calibri"/>
+          <w:b w:val="0"/>
+          <w:sz w:val="22"/>
+        </w:rPr>
+        <w:t xml:space="preserve">During instructions: “Chute down on the floor, hands on your knees.” Talk only when the chute is still.</w:t>
+      </w:r>
+    </w:p>
+    <w:p>
+      <w:pPr>
+        <w:pStyle w:val="ListBullet"/>
+      </w:pPr>
+      <w:r>
+        <w:rPr>
+          <w:rFonts w:ascii="Calibri" w:hAnsi="Calibri"/>
+          <w:b w:val="0"/>
+          <w:sz w:val="22"/>
+        </w:rPr>
+        <w:t xml:space="preserve">Handles: give each student a colour handle or pinnie at the start. Teacher forms the groups (count off by colour).</w:t>
+      </w:r>
+    </w:p>
+    <w:p>
+      <w:pPr>
+        <w:pStyle w:val="ListBullet"/>
+      </w:pPr>
+      <w:r>
+        <w:rPr>
+          <w:rFonts w:ascii="Calibri" w:hAnsi="Calibri"/>
+          <w:b w:val="0"/>
+          <w:sz w:val="22"/>
+        </w:rPr>
+        <w:t xml:space="preserve">Transitions: “Chute down, stand up, walk to the next handle on the whistle — clockwise.”</w:t>
+      </w:r>
+    </w:p>
+    <w:p>
+      <w:pPr>
+        <w:pStyle w:val="ListBullet"/>
+      </w:pPr>
+      <w:r>
+        <w:rPr>
+          <w:rFonts w:ascii="Calibri" w:hAnsi="Calibri"/>
+          <w:b w:val="0"/>
+          <w:sz w:val="22"/>
+        </w:rPr>
+        <w:t xml:space="preserve">Break plan: a student who needs a break sits at the calm spot on the bench line, takes three slow breaths, and returns when ready. No sit-out as a consequence.</w:t>
+      </w:r>
+    </w:p>
+    <w:p>
+      <w:pPr>
+        <w:pStyle w:val="Heading2"/>
+      </w:pPr>
+      <w:r>
         <w:t>Suggested Outcome &amp; Assessment for the Week</w:t>
       </w:r>
     </w:p>
@@ -2836,7 +4684,7 @@
           <w:b w:val="0"/>
           <w:sz w:val="22"/>
         </w:rPr>
-        <w:t xml:space="preserve">Built only from this week’s lessons (Tue Oct 13 – Fri Oct 16; Mon Oct 12 Thanksgiving, no school): parachute ripples and dome, popcorn, change-places, and number games. Suggestion only — does not replace report-card outcomes.</w:t>
+        <w:t xml:space="preserve">Built only from this week’s lessons (Tue Oct 13 – Fri Oct 16; Mon Oct 12 Thanksgiving, no school): parachute ripples and dome (Tue), popcorn (Wed, early dismissal), change-places (Thu), and number games (Fri, with a re-check of any criterion you missed). Suggestion only — does not replace report-card outcomes.</w:t>
       </w:r>
     </w:p>
     <w:p>
@@ -2846,37 +4694,7 @@
           <w:b/>
           <w:sz w:val="22"/>
         </w:rPr>
-        <w:t xml:space="preserve">Suggested weekly learning outcome</w:t>
-      </w:r>
-    </w:p>
-    <w:p>
-      <w:r>
-        <w:rPr>
-          <w:rFonts w:ascii="Calibri" w:hAnsi="Calibri"/>
-          <w:b w:val="0"/>
-          <w:sz w:val="22"/>
-        </w:rPr>
-        <w:t xml:space="preserve">I can work with my class on the parachute: lift together on the count so the chute stays round, use force and timing to pop the beanbags without letting go, listen for my colour or name and cross under safely with my head up, and help my group solve number challenges so no one is left out.</w:t>
-      </w:r>
-    </w:p>
-    <w:p>
-      <w:r>
-        <w:rPr>
-          <w:rFonts w:ascii="Calibri" w:hAnsi="Calibri"/>
-          <w:b w:val="0"/>
-          <w:sz w:val="22"/>
-        </w:rPr>
-        <w:t xml:space="preserve">Aligned to the PEW (Alberta) organizing ideas already used in this plan: Movement Skill Development (lifting on a count, force and timing, crossing under), Movement Tactics (solving group number problems), Safety (hold on, heads up, no pulling or wrapping), and Healthy Relationships (lift together, wait for everyone, include everyone). Confirm exact LearnAlberta outcome wording before report cards.</w:t>
-      </w:r>
-    </w:p>
-    <w:p>
-      <w:r>
-        <w:rPr>
-          <w:rFonts w:ascii="Calibri" w:hAnsi="Calibri"/>
-          <w:b/>
-          <w:sz w:val="22"/>
-        </w:rPr>
-        <w:t xml:space="preserve">Rubric — 4 criteria from this week’s lessons</w:t>
+        <w:t xml:space="preserve">Cited outcomes (word for word; full Organizing Idea, Guiding Question and KUSP above)</w:t>
       </w:r>
     </w:p>
     <w:tbl>
@@ -2887,7 +4705,624 @@
         <w:tblLayout w:type="fixed"/>
       </w:tblPr>
       <w:tblGrid>
-        <w:gridCol w:w="1400"/>
+        <w:gridCol w:w="1000"/>
+        <w:gridCol w:w="2900"/>
+        <w:gridCol w:w="2900"/>
+        <w:gridCol w:w="2900"/>
+      </w:tblGrid>
+      <w:tr>
+        <w:trPr>
+          <w:tblHeader/>
+          <w:cantSplit/>
+        </w:trPr>
+        <w:tc>
+          <w:tcPr>
+            <w:tcW w:type="dxa" w:w="2250"/>
+            <w:tcW w:type="dxa" w:w="1000"/>
+            <w:shd w:val="clear" w:color="auto" w:fill="D9D9D9"/>
+          </w:tcPr>
+          <w:p>
+            <w:pPr>
+              <w:spacing w:after="40" w:before="40"/>
+            </w:pPr>
+            <w:r>
+              <w:rPr>
+                <w:rFonts w:ascii="Calibri" w:hAnsi="Calibri"/>
+                <w:b/>
+                <w:sz w:val="18"/>
+              </w:rPr>
+              <w:t xml:space="preserve">Grade</w:t>
+            </w:r>
+          </w:p>
+        </w:tc>
+        <w:tc>
+          <w:tcPr>
+            <w:tcW w:type="dxa" w:w="2250"/>
+            <w:tcW w:type="dxa" w:w="2900"/>
+            <w:shd w:val="clear" w:color="auto" w:fill="D9D9D9"/>
+          </w:tcPr>
+          <w:p>
+            <w:pPr>
+              <w:spacing w:after="40" w:before="40"/>
+            </w:pPr>
+            <w:r>
+              <w:rPr>
+                <w:rFonts w:ascii="Calibri" w:hAnsi="Calibri"/>
+                <w:b/>
+                <w:sz w:val="18"/>
+              </w:rPr>
+              <w:t xml:space="preserve">Lift together / force and timing (Criteria 1–2)</w:t>
+            </w:r>
+          </w:p>
+        </w:tc>
+        <w:tc>
+          <w:tcPr>
+            <w:tcW w:type="dxa" w:w="2250"/>
+            <w:tcW w:type="dxa" w:w="2900"/>
+            <w:shd w:val="clear" w:color="auto" w:fill="D9D9D9"/>
+          </w:tcPr>
+          <w:p>
+            <w:pPr>
+              <w:spacing w:after="40" w:before="40"/>
+            </w:pPr>
+            <w:r>
+              <w:rPr>
+                <w:rFonts w:ascii="Calibri" w:hAnsi="Calibri"/>
+                <w:b/>
+                <w:sz w:val="18"/>
+              </w:rPr>
+              <w:t xml:space="preserve">Listen and cross safely (Criterion 3)</w:t>
+            </w:r>
+          </w:p>
+        </w:tc>
+        <w:tc>
+          <w:tcPr>
+            <w:tcW w:type="dxa" w:w="2250"/>
+            <w:tcW w:type="dxa" w:w="2900"/>
+            <w:shd w:val="clear" w:color="auto" w:fill="D9D9D9"/>
+          </w:tcPr>
+          <w:p>
+            <w:pPr>
+              <w:spacing w:after="40" w:before="40"/>
+            </w:pPr>
+            <w:r>
+              <w:rPr>
+                <w:rFonts w:ascii="Calibri" w:hAnsi="Calibri"/>
+                <w:b/>
+                <w:sz w:val="18"/>
+              </w:rPr>
+              <w:t xml:space="preserve">Group problem-solving (Criterion 4)</w:t>
+            </w:r>
+          </w:p>
+        </w:tc>
+      </w:tr>
+      <w:tr>
+        <w:trPr>
+          <w:cantSplit/>
+        </w:trPr>
+        <w:tc>
+          <w:tcPr>
+            <w:tcW w:type="dxa" w:w="2250"/>
+            <w:tcW w:type="dxa" w:w="1000"/>
+          </w:tcPr>
+          <w:p>
+            <w:pPr>
+              <w:spacing w:after="40" w:before="40"/>
+            </w:pPr>
+            <w:r>
+              <w:rPr>
+                <w:rFonts w:ascii="Calibri" w:hAnsi="Calibri"/>
+                <w:b/>
+                <w:sz w:val="18"/>
+              </w:rPr>
+              <w:t xml:space="preserve">Grade 1</w:t>
+            </w:r>
+          </w:p>
+        </w:tc>
+        <w:tc>
+          <w:tcPr>
+            <w:tcW w:type="dxa" w:w="2250"/>
+            <w:tcW w:type="dxa" w:w="2900"/>
+          </w:tcPr>
+          <w:p>
+            <w:pPr>
+              <w:spacing w:after="40" w:before="40"/>
+            </w:pPr>
+            <w:r>
+              <w:rPr>
+                <w:rFonts w:ascii="Calibri" w:hAnsi="Calibri"/>
+                <w:b w:val="0"/>
+                <w:sz w:val="18"/>
+              </w:rPr>
+              <w:t xml:space="preserve">Students demonstrate how movement can support different types of physical activity. [PDE1-OI2-GQ2-LO1]</w:t>
+            </w:r>
+          </w:p>
+        </w:tc>
+        <w:tc>
+          <w:tcPr>
+            <w:tcW w:type="dxa" w:w="2250"/>
+            <w:tcW w:type="dxa" w:w="2900"/>
+          </w:tcPr>
+          <w:p>
+            <w:pPr>
+              <w:spacing w:after="40" w:before="40"/>
+            </w:pPr>
+            <w:r>
+              <w:rPr>
+                <w:rFonts w:ascii="Calibri" w:hAnsi="Calibri"/>
+                <w:b w:val="0"/>
+                <w:sz w:val="18"/>
+              </w:rPr>
+              <w:t xml:space="preserve">Students exhibit spatial awareness during a variety of physical activities. [PDE1-OI2-GQ1-LO1]</w:t>
+            </w:r>
+          </w:p>
+        </w:tc>
+        <w:tc>
+          <w:tcPr>
+            <w:tcW w:type="dxa" w:w="2250"/>
+            <w:tcW w:type="dxa" w:w="2900"/>
+          </w:tcPr>
+          <w:p>
+            <w:pPr>
+              <w:spacing w:after="40" w:before="40"/>
+            </w:pPr>
+            <w:r>
+              <w:rPr>
+                <w:rFonts w:ascii="Calibri" w:hAnsi="Calibri"/>
+                <w:b w:val="0"/>
+                <w:sz w:val="18"/>
+              </w:rPr>
+              <w:t xml:space="preserve">Students demonstrate fair play and support engagement in a variety of physical activities. [PDE1-OI2-GQ3-LO1]</w:t>
+            </w:r>
+          </w:p>
+        </w:tc>
+      </w:tr>
+      <w:tr>
+        <w:trPr>
+          <w:cantSplit/>
+        </w:trPr>
+        <w:tc>
+          <w:tcPr>
+            <w:tcW w:type="dxa" w:w="2250"/>
+            <w:tcW w:type="dxa" w:w="1000"/>
+          </w:tcPr>
+          <w:p>
+            <w:pPr>
+              <w:spacing w:after="40" w:before="40"/>
+            </w:pPr>
+            <w:r>
+              <w:rPr>
+                <w:rFonts w:ascii="Calibri" w:hAnsi="Calibri"/>
+                <w:b/>
+                <w:sz w:val="18"/>
+              </w:rPr>
+              <w:t xml:space="preserve">Grade 2</w:t>
+            </w:r>
+          </w:p>
+        </w:tc>
+        <w:tc>
+          <w:tcPr>
+            <w:tcW w:type="dxa" w:w="2250"/>
+            <w:tcW w:type="dxa" w:w="2900"/>
+          </w:tcPr>
+          <w:p>
+            <w:pPr>
+              <w:spacing w:after="40" w:before="40"/>
+            </w:pPr>
+            <w:r>
+              <w:rPr>
+                <w:rFonts w:ascii="Calibri" w:hAnsi="Calibri"/>
+                <w:b w:val="0"/>
+                <w:sz w:val="18"/>
+              </w:rPr>
+              <w:t xml:space="preserve">Students modify movement to improve control and efficiency. [PDE2-OI2-GQ2-LO1]</w:t>
+            </w:r>
+          </w:p>
+        </w:tc>
+        <w:tc>
+          <w:tcPr>
+            <w:tcW w:type="dxa" w:w="2250"/>
+            <w:tcW w:type="dxa" w:w="2900"/>
+          </w:tcPr>
+          <w:p>
+            <w:pPr>
+              <w:spacing w:after="40" w:before="40"/>
+            </w:pPr>
+            <w:r>
+              <w:rPr>
+                <w:rFonts w:ascii="Calibri" w:hAnsi="Calibri"/>
+                <w:b w:val="0"/>
+                <w:sz w:val="18"/>
+              </w:rPr>
+              <w:t xml:space="preserve">Students refine and apply spatial awareness across a variety of physical activity contexts. [PDE2-OI2-GQ1-LO1]</w:t>
+            </w:r>
+          </w:p>
+        </w:tc>
+        <w:tc>
+          <w:tcPr>
+            <w:tcW w:type="dxa" w:w="2250"/>
+            <w:tcW w:type="dxa" w:w="2900"/>
+          </w:tcPr>
+          <w:p>
+            <w:pPr>
+              <w:spacing w:after="40" w:before="40"/>
+            </w:pPr>
+            <w:r>
+              <w:rPr>
+                <w:rFonts w:ascii="Calibri" w:hAnsi="Calibri"/>
+                <w:b w:val="0"/>
+                <w:sz w:val="18"/>
+              </w:rPr>
+              <w:t xml:space="preserve">Students demonstrate teamwork and support participation in a variety of physical activities. [PDE2-OI2-GQ3-LO1]</w:t>
+            </w:r>
+          </w:p>
+        </w:tc>
+      </w:tr>
+      <w:tr>
+        <w:trPr>
+          <w:cantSplit/>
+        </w:trPr>
+        <w:tc>
+          <w:tcPr>
+            <w:tcW w:type="dxa" w:w="2250"/>
+            <w:tcW w:type="dxa" w:w="1000"/>
+          </w:tcPr>
+          <w:p>
+            <w:pPr>
+              <w:spacing w:after="40" w:before="40"/>
+            </w:pPr>
+            <w:r>
+              <w:rPr>
+                <w:rFonts w:ascii="Calibri" w:hAnsi="Calibri"/>
+                <w:b/>
+                <w:sz w:val="18"/>
+              </w:rPr>
+              <w:t xml:space="preserve">Grade 3</w:t>
+            </w:r>
+          </w:p>
+        </w:tc>
+        <w:tc>
+          <w:tcPr>
+            <w:tcW w:type="dxa" w:w="2250"/>
+            <w:tcW w:type="dxa" w:w="2900"/>
+          </w:tcPr>
+          <w:p>
+            <w:pPr>
+              <w:spacing w:after="40" w:before="40"/>
+            </w:pPr>
+            <w:r>
+              <w:rPr>
+                <w:rFonts w:ascii="Calibri" w:hAnsi="Calibri"/>
+                <w:b w:val="0"/>
+                <w:sz w:val="18"/>
+              </w:rPr>
+              <w:t xml:space="preserve">Students investigate and demonstrate how elements of movement support physical activity. [PDE3-OI2-GQ2-LO1]</w:t>
+            </w:r>
+          </w:p>
+        </w:tc>
+        <w:tc>
+          <w:tcPr>
+            <w:tcW w:type="dxa" w:w="2250"/>
+            <w:tcW w:type="dxa" w:w="2900"/>
+          </w:tcPr>
+          <w:p>
+            <w:pPr>
+              <w:spacing w:after="40" w:before="40"/>
+            </w:pPr>
+            <w:r>
+              <w:rPr>
+                <w:rFonts w:ascii="Calibri" w:hAnsi="Calibri"/>
+                <w:b w:val="0"/>
+                <w:sz w:val="18"/>
+              </w:rPr>
+              <w:t xml:space="preserve">Students investigate and demonstrate how elements of movement support physical activity. [PDE3-OI2-GQ2-LO1]</w:t>
+            </w:r>
+          </w:p>
+        </w:tc>
+        <w:tc>
+          <w:tcPr>
+            <w:tcW w:type="dxa" w:w="2250"/>
+            <w:tcW w:type="dxa" w:w="2900"/>
+          </w:tcPr>
+          <w:p>
+            <w:pPr>
+              <w:spacing w:after="40" w:before="40"/>
+            </w:pPr>
+            <w:r>
+              <w:rPr>
+                <w:rFonts w:ascii="Calibri" w:hAnsi="Calibri"/>
+                <w:b w:val="0"/>
+                <w:sz w:val="18"/>
+              </w:rPr>
+              <w:t xml:space="preserve">Students identify and demonstrate how teamwork supports positive interactions during physical activity. [PDE3-OI2-GQ3-LO1]</w:t>
+            </w:r>
+          </w:p>
+        </w:tc>
+      </w:tr>
+      <w:tr>
+        <w:trPr>
+          <w:cantSplit/>
+        </w:trPr>
+        <w:tc>
+          <w:tcPr>
+            <w:tcW w:type="dxa" w:w="2250"/>
+            <w:tcW w:type="dxa" w:w="1000"/>
+          </w:tcPr>
+          <w:p>
+            <w:pPr>
+              <w:spacing w:after="40" w:before="40"/>
+            </w:pPr>
+            <w:r>
+              <w:rPr>
+                <w:rFonts w:ascii="Calibri" w:hAnsi="Calibri"/>
+                <w:b/>
+                <w:sz w:val="18"/>
+              </w:rPr>
+              <w:t xml:space="preserve">Grade 4</w:t>
+            </w:r>
+          </w:p>
+        </w:tc>
+        <w:tc>
+          <w:tcPr>
+            <w:tcW w:type="dxa" w:w="2250"/>
+            <w:tcW w:type="dxa" w:w="2900"/>
+          </w:tcPr>
+          <w:p>
+            <w:pPr>
+              <w:spacing w:after="40" w:before="40"/>
+            </w:pPr>
+            <w:r>
+              <w:rPr>
+                <w:rFonts w:ascii="Calibri" w:hAnsi="Calibri"/>
+                <w:b w:val="0"/>
+                <w:sz w:val="18"/>
+              </w:rPr>
+              <w:t xml:space="preserve">Students integrate and experiment with elements of movement to support physical activity. [PDE4-OI2-GQ2-LO1]</w:t>
+            </w:r>
+          </w:p>
+        </w:tc>
+        <w:tc>
+          <w:tcPr>
+            <w:tcW w:type="dxa" w:w="2250"/>
+            <w:tcW w:type="dxa" w:w="2900"/>
+          </w:tcPr>
+          <w:p>
+            <w:pPr>
+              <w:spacing w:after="40" w:before="40"/>
+            </w:pPr>
+            <w:r>
+              <w:rPr>
+                <w:rFonts w:ascii="Calibri" w:hAnsi="Calibri"/>
+                <w:b w:val="0"/>
+                <w:sz w:val="18"/>
+              </w:rPr>
+              <w:t xml:space="preserve">Students analyze and explain responsibility and how it can impact personal and group safety. [PDE4-OI4-GQ1-LO1] (Organizing Idea: Safety)</w:t>
+            </w:r>
+          </w:p>
+        </w:tc>
+        <w:tc>
+          <w:tcPr>
+            <w:tcW w:type="dxa" w:w="2250"/>
+            <w:tcW w:type="dxa" w:w="2900"/>
+          </w:tcPr>
+          <w:p>
+            <w:pPr>
+              <w:spacing w:after="40" w:before="40"/>
+            </w:pPr>
+            <w:r>
+              <w:rPr>
+                <w:rFonts w:ascii="Calibri" w:hAnsi="Calibri"/>
+                <w:b w:val="0"/>
+                <w:sz w:val="18"/>
+              </w:rPr>
+              <w:t xml:space="preserve">Students connect and demonstrate how teamwork enhances participation in physical activity. [PDE4-OI2-GQ3-LO1]</w:t>
+            </w:r>
+          </w:p>
+        </w:tc>
+      </w:tr>
+      <w:tr>
+        <w:trPr>
+          <w:cantSplit/>
+        </w:trPr>
+        <w:tc>
+          <w:tcPr>
+            <w:tcW w:type="dxa" w:w="2250"/>
+            <w:tcW w:type="dxa" w:w="1000"/>
+          </w:tcPr>
+          <w:p>
+            <w:pPr>
+              <w:spacing w:after="40" w:before="40"/>
+            </w:pPr>
+            <w:r>
+              <w:rPr>
+                <w:rFonts w:ascii="Calibri" w:hAnsi="Calibri"/>
+                <w:b/>
+                <w:sz w:val="18"/>
+              </w:rPr>
+              <w:t xml:space="preserve">Grade 5</w:t>
+            </w:r>
+          </w:p>
+        </w:tc>
+        <w:tc>
+          <w:tcPr>
+            <w:tcW w:type="dxa" w:w="2250"/>
+            <w:tcW w:type="dxa" w:w="2900"/>
+          </w:tcPr>
+          <w:p>
+            <w:pPr>
+              <w:spacing w:after="40" w:before="40"/>
+            </w:pPr>
+            <w:r>
+              <w:rPr>
+                <w:rFonts w:ascii="Calibri" w:hAnsi="Calibri"/>
+                <w:b w:val="0"/>
+                <w:sz w:val="18"/>
+              </w:rPr>
+              <w:t xml:space="preserve">Students demonstrate and adapt various movement patterns to enhance skill development. [PDE5-OI2-GQ2-LO1]</w:t>
+            </w:r>
+          </w:p>
+        </w:tc>
+        <w:tc>
+          <w:tcPr>
+            <w:tcW w:type="dxa" w:w="2250"/>
+            <w:tcW w:type="dxa" w:w="2900"/>
+          </w:tcPr>
+          <w:p>
+            <w:pPr>
+              <w:spacing w:after="40" w:before="40"/>
+            </w:pPr>
+            <w:r>
+              <w:rPr>
+                <w:rFonts w:ascii="Calibri" w:hAnsi="Calibri"/>
+                <w:b w:val="0"/>
+                <w:sz w:val="18"/>
+              </w:rPr>
+              <w:t xml:space="preserve">Students demonstrate and adapt various movement patterns to enhance skill development. [PDE5-OI2-GQ2-LO1]</w:t>
+            </w:r>
+          </w:p>
+        </w:tc>
+        <w:tc>
+          <w:tcPr>
+            <w:tcW w:type="dxa" w:w="2250"/>
+            <w:tcW w:type="dxa" w:w="2900"/>
+          </w:tcPr>
+          <w:p>
+            <w:pPr>
+              <w:spacing w:after="40" w:before="40"/>
+            </w:pPr>
+            <w:r>
+              <w:rPr>
+                <w:rFonts w:ascii="Calibri" w:hAnsi="Calibri"/>
+                <w:b w:val="0"/>
+                <w:sz w:val="18"/>
+              </w:rPr>
+              <w:t xml:space="preserve">Students demonstrate how collaboration influences physical activity. [PDE5-OI2-GQ3-LO1]</w:t>
+            </w:r>
+          </w:p>
+        </w:tc>
+      </w:tr>
+      <w:tr>
+        <w:trPr>
+          <w:cantSplit/>
+        </w:trPr>
+        <w:tc>
+          <w:tcPr>
+            <w:tcW w:type="dxa" w:w="2250"/>
+            <w:tcW w:type="dxa" w:w="1000"/>
+          </w:tcPr>
+          <w:p>
+            <w:pPr>
+              <w:spacing w:after="40" w:before="40"/>
+            </w:pPr>
+            <w:r>
+              <w:rPr>
+                <w:rFonts w:ascii="Calibri" w:hAnsi="Calibri"/>
+                <w:b/>
+                <w:sz w:val="18"/>
+              </w:rPr>
+              <w:t xml:space="preserve">Grade 6</w:t>
+            </w:r>
+          </w:p>
+        </w:tc>
+        <w:tc>
+          <w:tcPr>
+            <w:tcW w:type="dxa" w:w="2250"/>
+            <w:tcW w:type="dxa" w:w="2900"/>
+          </w:tcPr>
+          <w:p>
+            <w:pPr>
+              <w:spacing w:after="40" w:before="40"/>
+            </w:pPr>
+            <w:r>
+              <w:rPr>
+                <w:rFonts w:ascii="Calibri" w:hAnsi="Calibri"/>
+                <w:b w:val="0"/>
+                <w:sz w:val="18"/>
+              </w:rPr>
+              <w:t xml:space="preserve">Students adapt and apply movement patterns in controlled and dynamic physical activities. [PDE6-OI2-GQ2-LO1]</w:t>
+            </w:r>
+          </w:p>
+        </w:tc>
+        <w:tc>
+          <w:tcPr>
+            <w:tcW w:type="dxa" w:w="2250"/>
+            <w:tcW w:type="dxa" w:w="2900"/>
+          </w:tcPr>
+          <w:p>
+            <w:pPr>
+              <w:spacing w:after="40" w:before="40"/>
+            </w:pPr>
+            <w:r>
+              <w:rPr>
+                <w:rFonts w:ascii="Calibri" w:hAnsi="Calibri"/>
+                <w:b w:val="0"/>
+                <w:sz w:val="18"/>
+              </w:rPr>
+              <w:t xml:space="preserve">Students examine and demonstrate an understanding of structure in physical activity. [PDE6-OI2-GQ1-LO1]</w:t>
+            </w:r>
+          </w:p>
+        </w:tc>
+        <w:tc>
+          <w:tcPr>
+            <w:tcW w:type="dxa" w:w="2250"/>
+            <w:tcW w:type="dxa" w:w="2900"/>
+          </w:tcPr>
+          <w:p>
+            <w:pPr>
+              <w:spacing w:after="40" w:before="40"/>
+            </w:pPr>
+            <w:r>
+              <w:rPr>
+                <w:rFonts w:ascii="Calibri" w:hAnsi="Calibri"/>
+                <w:b w:val="0"/>
+                <w:sz w:val="18"/>
+              </w:rPr>
+              <w:t xml:space="preserve">Students examine and demonstrate an understanding of structure in physical activity. [PDE6-OI2-GQ1-LO1] (Grade 6 teamwork guiding question is conflict resolution — not taught this week)</w:t>
+            </w:r>
+          </w:p>
+        </w:tc>
+      </w:tr>
+    </w:tbl>
+    <w:p/>
+    <w:p>
+      <w:r>
+        <w:rPr>
+          <w:rFonts w:ascii="Calibri" w:hAnsi="Calibri"/>
+          <w:b/>
+          <w:sz w:val="22"/>
+        </w:rPr>
+        <w:t xml:space="preserve">Suggested weekly “I can” statement</w:t>
+      </w:r>
+    </w:p>
+    <w:p>
+      <w:r>
+        <w:rPr>
+          <w:rFonts w:ascii="Calibri" w:hAnsi="Calibri"/>
+          <w:b w:val="0"/>
+          <w:sz w:val="22"/>
+        </w:rPr>
+        <w:t xml:space="preserve">I can work with my class on the parachute: lift together on the count so the chute stays round, use force and timing to pop the beanbags without letting go, listen for my colour or name and cross under safely with my head up, and help my group solve number challenges so no one is left out.</w:t>
+      </w:r>
+    </w:p>
+    <w:p>
+      <w:r>
+        <w:rPr>
+          <w:rFonts w:ascii="Calibri" w:hAnsi="Calibri"/>
+          <w:b/>
+          <w:sz w:val="22"/>
+        </w:rPr>
+        <w:t xml:space="preserve">Rubric — Grades 3–6 (EIPS 2026–27 levels; criteria from this week’s lessons)</w:t>
+      </w:r>
+    </w:p>
+    <w:tbl>
+      <w:tblPr>
+        <w:tblStyle w:val="TableGrid"/>
+        <w:tblW w:type="auto" w:w="0"/>
+        <w:tblLook w:firstColumn="1" w:firstRow="1" w:lastColumn="0" w:lastRow="0" w:noHBand="0" w:noVBand="1" w:val="04A0"/>
+        <w:tblLayout w:type="fixed"/>
+      </w:tblPr>
+      <w:tblGrid>
+        <w:gridCol w:w="1500"/>
         <w:gridCol w:w="1900"/>
         <w:gridCol w:w="1900"/>
         <w:gridCol w:w="1900"/>
@@ -2901,7 +5336,7 @@
         <w:tc>
           <w:tcPr>
             <w:tcW w:type="dxa" w:w="1800"/>
-            <w:tcW w:type="dxa" w:w="1400"/>
+            <w:tcW w:type="dxa" w:w="1500"/>
             <w:shd w:val="clear" w:color="auto" w:fill="D9D9D9"/>
           </w:tcPr>
           <w:p>
@@ -2934,7 +5369,7 @@
                 <w:b/>
                 <w:sz w:val="18"/>
               </w:rPr>
-              <w:t xml:space="preserve">Beginning</w:t>
+              <w:t xml:space="preserve">Not Yet Meeting Expectations</w:t>
             </w:r>
           </w:p>
         </w:tc>
@@ -2954,7 +5389,7 @@
                 <w:b/>
                 <w:sz w:val="18"/>
               </w:rPr>
-              <w:t xml:space="preserve">Developing</w:t>
+              <w:t xml:space="preserve">Minimally Meeting Expectations</w:t>
             </w:r>
           </w:p>
         </w:tc>
@@ -2974,7 +5409,7 @@
                 <w:b/>
                 <w:sz w:val="18"/>
               </w:rPr>
-              <w:t xml:space="preserve">Proficient</w:t>
+              <w:t xml:space="preserve">Solidifying Expectations</w:t>
             </w:r>
           </w:p>
         </w:tc>
@@ -2994,7 +5429,7 @@
                 <w:b/>
                 <w:sz w:val="18"/>
               </w:rPr>
-              <w:t xml:space="preserve">Extending</w:t>
+              <w:t xml:space="preserve">Mastering Expectations</w:t>
             </w:r>
           </w:p>
         </w:tc>
@@ -3006,7 +5441,7 @@
         <w:tc>
           <w:tcPr>
             <w:tcW w:type="dxa" w:w="1800"/>
-            <w:tcW w:type="dxa" w:w="1400"/>
+            <w:tcW w:type="dxa" w:w="1500"/>
           </w:tcPr>
           <w:p>
             <w:pPr>
@@ -3020,7 +5455,7 @@
               </w:rPr>
               <w:t xml:space="preserve">1. Lift together</w:t>
               <w:br/>
-              <w:t xml:space="preserve">(Tue Oct 13)</w:t>
+              <w:t xml:space="preserve">(Tue Oct 13; recheck Fri)</w:t>
             </w:r>
           </w:p>
         </w:tc>
@@ -3058,7 +5493,7 @@
                 <w:b w:val="0"/>
                 <w:sz w:val="18"/>
               </w:rPr>
-              <w:t xml:space="preserve">Lifts on the count most of the time; ripples and waves are sometimes out of rhythm; steps into the dome with reminders.</w:t>
+              <w:t xml:space="preserve">Lifts on the count some of the time; ripples and waves are sometimes out of rhythm; steps into the dome with reminders.</w:t>
             </w:r>
           </w:p>
         </w:tc>
@@ -3096,7 +5531,7 @@
                 <w:b w:val="0"/>
                 <w:sz w:val="18"/>
               </w:rPr>
-              <w:t xml:space="preserve">Proficient and helps the group’s timing (Gr 5–6 counts the lift); calm leader in Hot Air Balloon rounds.</w:t>
+              <w:t xml:space="preserve">Helps the group’s timing (Gr 5–6 counts the lift for the class); calm leader in Hot Air Balloon rounds.</w:t>
             </w:r>
           </w:p>
         </w:tc>
@@ -3108,7 +5543,7 @@
         <w:tc>
           <w:tcPr>
             <w:tcW w:type="dxa" w:w="1800"/>
-            <w:tcW w:type="dxa" w:w="1400"/>
+            <w:tcW w:type="dxa" w:w="1500"/>
           </w:tcPr>
           <w:p>
             <w:pPr>
@@ -3120,9 +5555,9 @@
                 <w:b/>
                 <w:sz w:val="18"/>
               </w:rPr>
-              <w:t xml:space="preserve">2. Force &amp; timing — popcorn</w:t>
+              <w:t xml:space="preserve">2. Force and timing — popcorn</w:t>
               <w:br/>
-              <w:t xml:space="preserve">(Wed Oct 14, early dismissal)</w:t>
+              <w:t xml:space="preserve">(Wed Oct 14, early dismissal; recheck Fri)</w:t>
             </w:r>
           </w:p>
         </w:tc>
@@ -3141,7 +5576,7 @@
                 <w:b w:val="0"/>
                 <w:sz w:val="18"/>
               </w:rPr>
-              <w:t xml:space="preserve">Lets go to chase a bag or shakes randomly; bags fly off with no control.</w:t>
+              <w:t xml:space="preserve">Lets go to chase a bag or shakes without control; bags fly off with no control.</w:t>
             </w:r>
           </w:p>
         </w:tc>
@@ -3160,7 +5595,7 @@
                 <w:b w:val="0"/>
                 <w:sz w:val="18"/>
               </w:rPr>
-              <w:t xml:space="preserve">Holds on most of the time; pops the bags but timing with the group is uneven; follows the colour rule with reminders.</w:t>
+              <w:t xml:space="preserve">Holds on and pops the bags, but timing with the group is uneven; follows the colour rule with reminders.</w:t>
             </w:r>
           </w:p>
         </w:tc>
@@ -3198,7 +5633,7 @@
                 <w:b w:val="0"/>
                 <w:sz w:val="18"/>
               </w:rPr>
-              <w:t xml:space="preserve">Proficient and changes force on purpose (keeps 6 up; Gr 5–6 pops to a target hoop); suggests a group strategy.</w:t>
+              <w:t xml:space="preserve">Changes force on purpose to reach a goal (keeps 6 up; Gr 5–6 pops to a target hoop); suggests a group strategy.</w:t>
             </w:r>
           </w:p>
         </w:tc>
@@ -3210,7 +5645,7 @@
         <w:tc>
           <w:tcPr>
             <w:tcW w:type="dxa" w:w="1800"/>
-            <w:tcW w:type="dxa" w:w="1400"/>
+            <w:tcW w:type="dxa" w:w="1500"/>
           </w:tcPr>
           <w:p>
             <w:pPr>
@@ -3222,7 +5657,7 @@
                 <w:b/>
                 <w:sz w:val="18"/>
               </w:rPr>
-              <w:t xml:space="preserve">3. Listen &amp; cross safely</w:t>
+              <w:t xml:space="preserve">3. Listen and cross safely</w:t>
               <w:br/>
               <w:t xml:space="preserve">(Thu Oct 15)</w:t>
             </w:r>
@@ -3262,7 +5697,7 @@
                 <w:b w:val="0"/>
                 <w:sz w:val="18"/>
               </w:rPr>
-              <w:t xml:space="preserve">Goes on own colour or name with a prompt; crosses under mostly safely; new grip is sometimes rushed.</w:t>
+              <w:t xml:space="preserve">Crosses on own colour or name with a prompt; crosses under mostly safely; new grip is sometimes rushed.</w:t>
             </w:r>
           </w:p>
         </w:tc>
@@ -3281,7 +5716,7 @@
                 <w:b w:val="0"/>
                 <w:sz w:val="18"/>
               </w:rPr>
-              <w:t xml:space="preserve">Crosses under on own colour or name call with heads up; takes a new handle without colliding; soft tags and rescues in Sharks and Dolphins.</w:t>
+              <w:t xml:space="preserve">Crosses under right away on own call with head up; takes a new handle without colliding; soft tags and rescues in Sharks and Dolphins.</w:t>
             </w:r>
           </w:p>
         </w:tc>
@@ -3300,7 +5735,7 @@
                 <w:b w:val="0"/>
                 <w:sz w:val="18"/>
               </w:rPr>
-              <w:t xml:space="preserve">Proficient and helps others find a space; Gr 5–6 handles the three-mouse version safely and switches roles fairly.</w:t>
+              <w:t xml:space="preserve">Crosses safely every time and helps others find a space; Gr 5–6 handles the three-mouse version safely and switches roles fairly.</w:t>
             </w:r>
           </w:p>
         </w:tc>
@@ -3312,7 +5747,7 @@
         <w:tc>
           <w:tcPr>
             <w:tcW w:type="dxa" w:w="1800"/>
-            <w:tcW w:type="dxa" w:w="1400"/>
+            <w:tcW w:type="dxa" w:w="1500"/>
           </w:tcPr>
           <w:p>
             <w:pPr>
@@ -3364,7 +5799,7 @@
                 <w:b w:val="0"/>
                 <w:sz w:val="18"/>
               </w:rPr>
-              <w:t xml:space="preserve">Joins the number shape with prompts; waits for the group some of the time.</w:t>
+              <w:t xml:space="preserve">Joins the number shape when prompted; waits for the group some of the time.</w:t>
             </w:r>
           </w:p>
         </w:tc>
@@ -3383,7 +5818,7 @@
                 <w:b w:val="0"/>
                 <w:sz w:val="18"/>
               </w:rPr>
-              <w:t xml:space="preserve">Makes the number with bodies and follows the lift call; solves the group problem so no one is left out; waits for everyone.</w:t>
+              <w:t xml:space="preserve">Helps make the number with bodies and follows the lift call; solves the group problem so no one is left out; waits for everyone.</w:t>
             </w:r>
           </w:p>
         </w:tc>
@@ -3402,7 +5837,7 @@
                 <w:b w:val="0"/>
                 <w:sz w:val="18"/>
               </w:rPr>
-              <w:t xml:space="preserve">Proficient and leads kindly (student caller; Gr 5–6 silent number shapes); invites a left-out classmate in.</w:t>
+              <w:t xml:space="preserve">Leads kindly (student caller; Gr 5–6 silent number shapes); invites a left-out classmate in.</w:t>
             </w:r>
           </w:p>
         </w:tc>
@@ -3416,7 +5851,450 @@
           <w:b/>
           <w:sz w:val="22"/>
         </w:rPr>
-        <w:t xml:space="preserve">Proficient look-fors by grade band (from the daily lessons)</w:t>
+        <w:t xml:space="preserve">Rubric — Grades 1–2 (EIPS 2026–27 K–2 levels)</w:t>
+      </w:r>
+    </w:p>
+    <w:tbl>
+      <w:tblPr>
+        <w:tblStyle w:val="TableGrid"/>
+        <w:tblW w:type="auto" w:w="0"/>
+        <w:tblLook w:firstColumn="1" w:firstRow="1" w:lastColumn="0" w:lastRow="0" w:noHBand="0" w:noVBand="1" w:val="04A0"/>
+        <w:tblLayout w:type="fixed"/>
+      </w:tblPr>
+      <w:tblGrid>
+        <w:gridCol w:w="1900"/>
+        <w:gridCol w:w="2600"/>
+        <w:gridCol w:w="2600"/>
+        <w:gridCol w:w="2600"/>
+      </w:tblGrid>
+      <w:tr>
+        <w:trPr>
+          <w:tblHeader/>
+          <w:cantSplit/>
+        </w:trPr>
+        <w:tc>
+          <w:tcPr>
+            <w:tcW w:type="dxa" w:w="2250"/>
+            <w:tcW w:type="dxa" w:w="1900"/>
+            <w:shd w:val="clear" w:color="auto" w:fill="D9D9D9"/>
+          </w:tcPr>
+          <w:p>
+            <w:pPr>
+              <w:spacing w:after="40" w:before="40"/>
+            </w:pPr>
+            <w:r>
+              <w:rPr>
+                <w:rFonts w:ascii="Calibri" w:hAnsi="Calibri"/>
+                <w:b/>
+                <w:sz w:val="18"/>
+              </w:rPr>
+              <w:t xml:space="preserve">Criterion (lesson)</w:t>
+            </w:r>
+          </w:p>
+        </w:tc>
+        <w:tc>
+          <w:tcPr>
+            <w:tcW w:type="dxa" w:w="2250"/>
+            <w:tcW w:type="dxa" w:w="2600"/>
+            <w:shd w:val="clear" w:color="auto" w:fill="D9D9D9"/>
+          </w:tcPr>
+          <w:p>
+            <w:pPr>
+              <w:spacing w:after="40" w:before="40"/>
+            </w:pPr>
+            <w:r>
+              <w:rPr>
+                <w:rFonts w:ascii="Calibri" w:hAnsi="Calibri"/>
+                <w:b/>
+                <w:sz w:val="18"/>
+              </w:rPr>
+              <w:t xml:space="preserve">Not Yet Meeting Expectations</w:t>
+            </w:r>
+          </w:p>
+        </w:tc>
+        <w:tc>
+          <w:tcPr>
+            <w:tcW w:type="dxa" w:w="2250"/>
+            <w:tcW w:type="dxa" w:w="2600"/>
+            <w:shd w:val="clear" w:color="auto" w:fill="D9D9D9"/>
+          </w:tcPr>
+          <w:p>
+            <w:pPr>
+              <w:spacing w:after="40" w:before="40"/>
+            </w:pPr>
+            <w:r>
+              <w:rPr>
+                <w:rFonts w:ascii="Calibri" w:hAnsi="Calibri"/>
+                <w:b/>
+                <w:sz w:val="18"/>
+              </w:rPr>
+              <w:t xml:space="preserve">Meeting Expectations</w:t>
+            </w:r>
+          </w:p>
+        </w:tc>
+        <w:tc>
+          <w:tcPr>
+            <w:tcW w:type="dxa" w:w="2250"/>
+            <w:tcW w:type="dxa" w:w="2600"/>
+            <w:shd w:val="clear" w:color="auto" w:fill="D9D9D9"/>
+          </w:tcPr>
+          <w:p>
+            <w:pPr>
+              <w:spacing w:after="40" w:before="40"/>
+            </w:pPr>
+            <w:r>
+              <w:rPr>
+                <w:rFonts w:ascii="Calibri" w:hAnsi="Calibri"/>
+                <w:b/>
+                <w:sz w:val="18"/>
+              </w:rPr>
+              <w:t xml:space="preserve">Mastering Expectations</w:t>
+            </w:r>
+          </w:p>
+        </w:tc>
+      </w:tr>
+      <w:tr>
+        <w:trPr>
+          <w:cantSplit/>
+        </w:trPr>
+        <w:tc>
+          <w:tcPr>
+            <w:tcW w:type="dxa" w:w="2250"/>
+            <w:tcW w:type="dxa" w:w="1900"/>
+          </w:tcPr>
+          <w:p>
+            <w:pPr>
+              <w:spacing w:after="40" w:before="40"/>
+            </w:pPr>
+            <w:r>
+              <w:rPr>
+                <w:rFonts w:ascii="Calibri" w:hAnsi="Calibri"/>
+                <w:b/>
+                <w:sz w:val="18"/>
+              </w:rPr>
+              <w:t xml:space="preserve">1. Lift together</w:t>
+              <w:br/>
+              <w:t xml:space="preserve">(Tue Oct 13)</w:t>
+            </w:r>
+          </w:p>
+        </w:tc>
+        <w:tc>
+          <w:tcPr>
+            <w:tcW w:type="dxa" w:w="2250"/>
+            <w:tcW w:type="dxa" w:w="2600"/>
+          </w:tcPr>
+          <w:p>
+            <w:pPr>
+              <w:spacing w:after="40" w:before="40"/>
+            </w:pPr>
+            <w:r>
+              <w:rPr>
+                <w:rFonts w:ascii="Calibri" w:hAnsi="Calibri"/>
+                <w:b w:val="0"/>
+                <w:sz w:val="18"/>
+              </w:rPr>
+              <w:t xml:space="preserve">Lifts too early or too late, or lets go; needs reminders.</w:t>
+            </w:r>
+          </w:p>
+        </w:tc>
+        <w:tc>
+          <w:tcPr>
+            <w:tcW w:type="dxa" w:w="2250"/>
+            <w:tcW w:type="dxa" w:w="2600"/>
+          </w:tcPr>
+          <w:p>
+            <w:pPr>
+              <w:spacing w:after="40" w:before="40"/>
+            </w:pPr>
+            <w:r>
+              <w:rPr>
+                <w:rFonts w:ascii="Calibri" w:hAnsi="Calibri"/>
+                <w:b w:val="0"/>
+                <w:sz w:val="18"/>
+              </w:rPr>
+              <w:t xml:space="preserve">Lifts on the teacher count so the chute stays round; hands stay on.</w:t>
+            </w:r>
+          </w:p>
+        </w:tc>
+        <w:tc>
+          <w:tcPr>
+            <w:tcW w:type="dxa" w:w="2250"/>
+            <w:tcW w:type="dxa" w:w="2600"/>
+          </w:tcPr>
+          <w:p>
+            <w:pPr>
+              <w:spacing w:after="40" w:before="40"/>
+            </w:pPr>
+            <w:r>
+              <w:rPr>
+                <w:rFonts w:ascii="Calibri" w:hAnsi="Calibri"/>
+                <w:b w:val="0"/>
+                <w:sz w:val="18"/>
+              </w:rPr>
+              <w:t xml:space="preserve">Lifts on the count every time and helps friends stay together.</w:t>
+            </w:r>
+          </w:p>
+        </w:tc>
+      </w:tr>
+      <w:tr>
+        <w:trPr>
+          <w:cantSplit/>
+        </w:trPr>
+        <w:tc>
+          <w:tcPr>
+            <w:tcW w:type="dxa" w:w="2250"/>
+            <w:tcW w:type="dxa" w:w="1900"/>
+          </w:tcPr>
+          <w:p>
+            <w:pPr>
+              <w:spacing w:after="40" w:before="40"/>
+            </w:pPr>
+            <w:r>
+              <w:rPr>
+                <w:rFonts w:ascii="Calibri" w:hAnsi="Calibri"/>
+                <w:b/>
+                <w:sz w:val="18"/>
+              </w:rPr>
+              <w:t xml:space="preserve">2. Pop the popcorn</w:t>
+              <w:br/>
+              <w:t xml:space="preserve">(Wed Oct 14, early dismissal)</w:t>
+            </w:r>
+          </w:p>
+        </w:tc>
+        <w:tc>
+          <w:tcPr>
+            <w:tcW w:type="dxa" w:w="2250"/>
+            <w:tcW w:type="dxa" w:w="2600"/>
+          </w:tcPr>
+          <w:p>
+            <w:pPr>
+              <w:spacing w:after="40" w:before="40"/>
+            </w:pPr>
+            <w:r>
+              <w:rPr>
+                <w:rFonts w:ascii="Calibri" w:hAnsi="Calibri"/>
+                <w:b w:val="0"/>
+                <w:sz w:val="18"/>
+              </w:rPr>
+              <w:t xml:space="preserve">Lets go to chase a bag.</w:t>
+            </w:r>
+          </w:p>
+        </w:tc>
+        <w:tc>
+          <w:tcPr>
+            <w:tcW w:type="dxa" w:w="2250"/>
+            <w:tcW w:type="dxa" w:w="2600"/>
+          </w:tcPr>
+          <w:p>
+            <w:pPr>
+              <w:spacing w:after="40" w:before="40"/>
+            </w:pPr>
+            <w:r>
+              <w:rPr>
+                <w:rFonts w:ascii="Calibri" w:hAnsi="Calibri"/>
+                <w:b w:val="0"/>
+                <w:sz w:val="18"/>
+              </w:rPr>
+              <w:t xml:space="preserve">Shakes to pop the bags (3–4 beanbags) and keeps both hands on.</w:t>
+            </w:r>
+          </w:p>
+        </w:tc>
+        <w:tc>
+          <w:tcPr>
+            <w:tcW w:type="dxa" w:w="2250"/>
+            <w:tcW w:type="dxa" w:w="2600"/>
+          </w:tcPr>
+          <w:p>
+            <w:pPr>
+              <w:spacing w:after="40" w:before="40"/>
+            </w:pPr>
+            <w:r>
+              <w:rPr>
+                <w:rFonts w:ascii="Calibri" w:hAnsi="Calibri"/>
+                <w:b w:val="0"/>
+                <w:sz w:val="18"/>
+              </w:rPr>
+              <w:t xml:space="preserve">Changes how hard they shake to keep the bags on, and follows the colour rule.</w:t>
+            </w:r>
+          </w:p>
+        </w:tc>
+      </w:tr>
+      <w:tr>
+        <w:trPr>
+          <w:cantSplit/>
+        </w:trPr>
+        <w:tc>
+          <w:tcPr>
+            <w:tcW w:type="dxa" w:w="2250"/>
+            <w:tcW w:type="dxa" w:w="1900"/>
+          </w:tcPr>
+          <w:p>
+            <w:pPr>
+              <w:spacing w:after="40" w:before="40"/>
+            </w:pPr>
+            <w:r>
+              <w:rPr>
+                <w:rFonts w:ascii="Calibri" w:hAnsi="Calibri"/>
+                <w:b/>
+                <w:sz w:val="18"/>
+              </w:rPr>
+              <w:t xml:space="preserve">3. Cross under safely</w:t>
+              <w:br/>
+              <w:t xml:space="preserve">(Thu Oct 15)</w:t>
+            </w:r>
+          </w:p>
+        </w:tc>
+        <w:tc>
+          <w:tcPr>
+            <w:tcW w:type="dxa" w:w="2250"/>
+            <w:tcW w:type="dxa" w:w="2600"/>
+          </w:tcPr>
+          <w:p>
+            <w:pPr>
+              <w:spacing w:after="40" w:before="40"/>
+            </w:pPr>
+            <w:r>
+              <w:rPr>
+                <w:rFonts w:ascii="Calibri" w:hAnsi="Calibri"/>
+                <w:b w:val="0"/>
+                <w:sz w:val="18"/>
+              </w:rPr>
+              <w:t xml:space="preserve">Misses their colour or bumps into people.</w:t>
+            </w:r>
+          </w:p>
+        </w:tc>
+        <w:tc>
+          <w:tcPr>
+            <w:tcW w:type="dxa" w:w="2250"/>
+            <w:tcW w:type="dxa" w:w="2600"/>
+          </w:tcPr>
+          <w:p>
+            <w:pPr>
+              <w:spacing w:after="40" w:before="40"/>
+            </w:pPr>
+            <w:r>
+              <w:rPr>
+                <w:rFonts w:ascii="Calibri" w:hAnsi="Calibri"/>
+                <w:b w:val="0"/>
+                <w:sz w:val="18"/>
+              </w:rPr>
+              <w:t xml:space="preserve">When their colour is called, walks under with head up and finds a new handle.</w:t>
+            </w:r>
+          </w:p>
+        </w:tc>
+        <w:tc>
+          <w:tcPr>
+            <w:tcW w:type="dxa" w:w="2250"/>
+            <w:tcW w:type="dxa" w:w="2600"/>
+          </w:tcPr>
+          <w:p>
+            <w:pPr>
+              <w:spacing w:after="40" w:before="40"/>
+            </w:pPr>
+            <w:r>
+              <w:rPr>
+                <w:rFonts w:ascii="Calibri" w:hAnsi="Calibri"/>
+                <w:b w:val="0"/>
+                <w:sz w:val="18"/>
+              </w:rPr>
+              <w:t xml:space="preserve">Goes right away on their call, crosses safely, and helps a friend find a space.</w:t>
+            </w:r>
+          </w:p>
+        </w:tc>
+      </w:tr>
+      <w:tr>
+        <w:trPr>
+          <w:cantSplit/>
+        </w:trPr>
+        <w:tc>
+          <w:tcPr>
+            <w:tcW w:type="dxa" w:w="2250"/>
+            <w:tcW w:type="dxa" w:w="1900"/>
+          </w:tcPr>
+          <w:p>
+            <w:pPr>
+              <w:spacing w:after="40" w:before="40"/>
+            </w:pPr>
+            <w:r>
+              <w:rPr>
+                <w:rFonts w:ascii="Calibri" w:hAnsi="Calibri"/>
+                <w:b/>
+                <w:sz w:val="18"/>
+              </w:rPr>
+              <w:t xml:space="preserve">4. Work as a group</w:t>
+              <w:br/>
+              <w:t xml:space="preserve">(Fri Oct 16)</w:t>
+            </w:r>
+          </w:p>
+        </w:tc>
+        <w:tc>
+          <w:tcPr>
+            <w:tcW w:type="dxa" w:w="2250"/>
+            <w:tcW w:type="dxa" w:w="2600"/>
+          </w:tcPr>
+          <w:p>
+            <w:pPr>
+              <w:spacing w:after="40" w:before="40"/>
+            </w:pPr>
+            <w:r>
+              <w:rPr>
+                <w:rFonts w:ascii="Calibri" w:hAnsi="Calibri"/>
+                <w:b w:val="0"/>
+                <w:sz w:val="18"/>
+              </w:rPr>
+              <w:t xml:space="preserve">Needs help to join the number shape.</w:t>
+            </w:r>
+          </w:p>
+        </w:tc>
+        <w:tc>
+          <w:tcPr>
+            <w:tcW w:type="dxa" w:w="2250"/>
+            <w:tcW w:type="dxa" w:w="2600"/>
+          </w:tcPr>
+          <w:p>
+            <w:pPr>
+              <w:spacing w:after="40" w:before="40"/>
+            </w:pPr>
+            <w:r>
+              <w:rPr>
+                <w:rFonts w:ascii="Calibri" w:hAnsi="Calibri"/>
+                <w:b w:val="0"/>
+                <w:sz w:val="18"/>
+              </w:rPr>
+              <w:t xml:space="preserve">Joins the number shape and waits for everyone.</w:t>
+            </w:r>
+          </w:p>
+        </w:tc>
+        <w:tc>
+          <w:tcPr>
+            <w:tcW w:type="dxa" w:w="2250"/>
+            <w:tcW w:type="dxa" w:w="2600"/>
+          </w:tcPr>
+          <w:p>
+            <w:pPr>
+              <w:spacing w:after="40" w:before="40"/>
+            </w:pPr>
+            <w:r>
+              <w:rPr>
+                <w:rFonts w:ascii="Calibri" w:hAnsi="Calibri"/>
+                <w:b w:val="0"/>
+                <w:sz w:val="18"/>
+              </w:rPr>
+              <w:t xml:space="preserve">Helps the group make the shape and invites a friend in.</w:t>
+            </w:r>
+          </w:p>
+        </w:tc>
+      </w:tr>
+    </w:tbl>
+    <w:p/>
+    <w:p>
+      <w:r>
+        <w:rPr>
+          <w:rFonts w:ascii="Calibri" w:hAnsi="Calibri"/>
+          <w:b/>
+          <w:sz w:val="22"/>
+        </w:rPr>
+        <w:t xml:space="preserve">Solidifying / Meeting look-fors by grade band (from the daily lessons)</w:t>
       </w:r>
     </w:p>
     <w:tbl>
@@ -3428,9 +6306,9 @@
       </w:tblPr>
       <w:tblGrid>
         <w:gridCol w:w="1600"/>
-        <w:gridCol w:w="2400"/>
-        <w:gridCol w:w="2400"/>
-        <w:gridCol w:w="2400"/>
+        <w:gridCol w:w="2700"/>
+        <w:gridCol w:w="2700"/>
+        <w:gridCol w:w="2700"/>
       </w:tblGrid>
       <w:tr>
         <w:trPr>
@@ -3460,7 +6338,7 @@
         <w:tc>
           <w:tcPr>
             <w:tcW w:type="dxa" w:w="2250"/>
-            <w:tcW w:type="dxa" w:w="2400"/>
+            <w:tcW w:type="dxa" w:w="2700"/>
             <w:shd w:val="clear" w:color="auto" w:fill="D9D9D9"/>
           </w:tcPr>
           <w:p>
@@ -3473,14 +6351,14 @@
                 <w:b/>
                 <w:sz w:val="18"/>
               </w:rPr>
-              <w:t xml:space="preserve">Grades 1–2</w:t>
+              <w:t xml:space="preserve">Grades 1–2 (Meeting)</w:t>
             </w:r>
           </w:p>
         </w:tc>
         <w:tc>
           <w:tcPr>
             <w:tcW w:type="dxa" w:w="2250"/>
-            <w:tcW w:type="dxa" w:w="2400"/>
+            <w:tcW w:type="dxa" w:w="2700"/>
             <w:shd w:val="clear" w:color="auto" w:fill="D9D9D9"/>
           </w:tcPr>
           <w:p>
@@ -3493,14 +6371,14 @@
                 <w:b/>
                 <w:sz w:val="18"/>
               </w:rPr>
-              <w:t xml:space="preserve">Grades 3–4</w:t>
+              <w:t xml:space="preserve">Grades 3–4 (Solidifying)</w:t>
             </w:r>
           </w:p>
         </w:tc>
         <w:tc>
           <w:tcPr>
             <w:tcW w:type="dxa" w:w="2250"/>
-            <w:tcW w:type="dxa" w:w="2400"/>
+            <w:tcW w:type="dxa" w:w="2700"/>
             <w:shd w:val="clear" w:color="auto" w:fill="D9D9D9"/>
           </w:tcPr>
           <w:p>
@@ -3513,7 +6391,7 @@
                 <w:b/>
                 <w:sz w:val="18"/>
               </w:rPr>
-              <w:t xml:space="preserve">Grades 5–6</w:t>
+              <w:t xml:space="preserve">Grades 5–6 (Solidifying)</w:t>
             </w:r>
           </w:p>
         </w:tc>
@@ -3544,7 +6422,7 @@
         <w:tc>
           <w:tcPr>
             <w:tcW w:type="dxa" w:w="2250"/>
-            <w:tcW w:type="dxa" w:w="2400"/>
+            <w:tcW w:type="dxa" w:w="2700"/>
           </w:tcPr>
           <w:p>
             <w:pPr>
@@ -3563,7 +6441,7 @@
         <w:tc>
           <w:tcPr>
             <w:tcW w:type="dxa" w:w="2250"/>
-            <w:tcW w:type="dxa" w:w="2400"/>
+            <w:tcW w:type="dxa" w:w="2700"/>
           </w:tcPr>
           <w:p>
             <w:pPr>
@@ -3582,7 +6460,7 @@
         <w:tc>
           <w:tcPr>
             <w:tcW w:type="dxa" w:w="2250"/>
-            <w:tcW w:type="dxa" w:w="2400"/>
+            <w:tcW w:type="dxa" w:w="2700"/>
           </w:tcPr>
           <w:p>
             <w:pPr>
@@ -3618,14 +6496,14 @@
                 <w:b/>
                 <w:sz w:val="18"/>
               </w:rPr>
-              <w:t xml:space="preserve">2. Force &amp; timing — popcorn</w:t>
+              <w:t xml:space="preserve">2. Force and timing — popcorn</w:t>
             </w:r>
           </w:p>
         </w:tc>
         <w:tc>
           <w:tcPr>
             <w:tcW w:type="dxa" w:w="2250"/>
-            <w:tcW w:type="dxa" w:w="2400"/>
+            <w:tcW w:type="dxa" w:w="2700"/>
           </w:tcPr>
           <w:p>
             <w:pPr>
@@ -3644,7 +6522,7 @@
         <w:tc>
           <w:tcPr>
             <w:tcW w:type="dxa" w:w="2250"/>
-            <w:tcW w:type="dxa" w:w="2400"/>
+            <w:tcW w:type="dxa" w:w="2700"/>
           </w:tcPr>
           <w:p>
             <w:pPr>
@@ -3663,7 +6541,7 @@
         <w:tc>
           <w:tcPr>
             <w:tcW w:type="dxa" w:w="2250"/>
-            <w:tcW w:type="dxa" w:w="2400"/>
+            <w:tcW w:type="dxa" w:w="2700"/>
           </w:tcPr>
           <w:p>
             <w:pPr>
@@ -3699,14 +6577,14 @@
                 <w:b/>
                 <w:sz w:val="18"/>
               </w:rPr>
-              <w:t xml:space="preserve">3. Listen &amp; cross safely</w:t>
+              <w:t xml:space="preserve">3. Listen and cross safely</w:t>
             </w:r>
           </w:p>
         </w:tc>
         <w:tc>
           <w:tcPr>
             <w:tcW w:type="dxa" w:w="2250"/>
-            <w:tcW w:type="dxa" w:w="2400"/>
+            <w:tcW w:type="dxa" w:w="2700"/>
           </w:tcPr>
           <w:p>
             <w:pPr>
@@ -3725,7 +6603,7 @@
         <w:tc>
           <w:tcPr>
             <w:tcW w:type="dxa" w:w="2250"/>
-            <w:tcW w:type="dxa" w:w="2400"/>
+            <w:tcW w:type="dxa" w:w="2700"/>
           </w:tcPr>
           <w:p>
             <w:pPr>
@@ -3744,7 +6622,7 @@
         <w:tc>
           <w:tcPr>
             <w:tcW w:type="dxa" w:w="2250"/>
-            <w:tcW w:type="dxa" w:w="2400"/>
+            <w:tcW w:type="dxa" w:w="2700"/>
           </w:tcPr>
           <w:p>
             <w:pPr>
@@ -3787,7 +6665,7 @@
         <w:tc>
           <w:tcPr>
             <w:tcW w:type="dxa" w:w="2250"/>
-            <w:tcW w:type="dxa" w:w="2400"/>
+            <w:tcW w:type="dxa" w:w="2700"/>
           </w:tcPr>
           <w:p>
             <w:pPr>
@@ -3806,7 +6684,7 @@
         <w:tc>
           <w:tcPr>
             <w:tcW w:type="dxa" w:w="2250"/>
-            <w:tcW w:type="dxa" w:w="2400"/>
+            <w:tcW w:type="dxa" w:w="2700"/>
           </w:tcPr>
           <w:p>
             <w:pPr>
@@ -3825,7 +6703,7 @@
         <w:tc>
           <w:tcPr>
             <w:tcW w:type="dxa" w:w="2250"/>
-            <w:tcW w:type="dxa" w:w="2400"/>
+            <w:tcW w:type="dxa" w:w="2700"/>
           </w:tcPr>
           <w:p>
             <w:pPr>
@@ -3874,7 +6752,7 @@
           <w:b w:val="0"/>
           <w:sz w:val="22"/>
         </w:rPr>
-        <w:t xml:space="preserve">Tue Oct 13: Criterion 1, lift together (ripples, waves, dome; Hot Air Balloon).</w:t>
+        <w:t xml:space="preserve">Tue Oct 13: Criterion 1 — observation checklist during ripples, waves, dome and Hot Air Balloon.</w:t>
       </w:r>
     </w:p>
     <w:p>
@@ -3887,7 +6765,7 @@
           <w:b w:val="0"/>
           <w:sz w:val="22"/>
         </w:rPr>
-        <w:t xml:space="preserve">Wed Oct 14 (early dismissal): Criterion 2, popcorn force and timing — watch during the game only; keep it tight and don’t add extra assessment.</w:t>
+        <w:t xml:space="preserve">Wed Oct 14 (early dismissal): Criterion 2 — observation during the popcorn game only; keep it tight and don’t add extra assessment.</w:t>
       </w:r>
     </w:p>
     <w:p>
@@ -3900,7 +6778,7 @@
           <w:b w:val="0"/>
           <w:sz w:val="22"/>
         </w:rPr>
-        <w:t xml:space="preserve">Thu Oct 15: Criterion 3, change-places and Sharks and Dolphins (crossing under on the call, heads up, new handle).</w:t>
+        <w:t xml:space="preserve">Thu Oct 15: Criterion 3 — observation during change-places and Sharks and Dolphins, plus a quick conversation at the cool-down: “How do you cross under safely?”</w:t>
       </w:r>
     </w:p>
     <w:p>
@@ -3913,7 +6791,59 @@
           <w:b w:val="0"/>
           <w:sz w:val="22"/>
         </w:rPr>
-        <w:t xml:space="preserve">Fri Oct 16: Criterion 4, number games (number shapes, merry-go-round freeze numbers); re-check any criterion you missed during BackBurst or the warm-up.</w:t>
+        <w:t xml:space="preserve">Fri Oct 16: Criterion 4 — observation of the number shapes (the group’s finished shape is the product), plus a conversation: “How did your group make sure no one was left out?”</w:t>
+      </w:r>
+    </w:p>
+    <w:p>
+      <w:pPr>
+        <w:pStyle w:val="ListBullet"/>
+      </w:pPr>
+      <w:r>
+        <w:rPr>
+          <w:rFonts w:ascii="Calibri" w:hAnsi="Calibri"/>
+          <w:b w:val="0"/>
+          <w:sz w:val="22"/>
+        </w:rPr>
+        <w:t xml:space="preserve">Reassessment: on Friday, re-check any criterion you missed or where a student was not yet at Solidifying / Meeting, during BackBurst, the merry-go-round or the warm-up. This is the second-chance opportunity.</w:t>
+      </w:r>
+    </w:p>
+    <w:p>
+      <w:pPr>
+        <w:pStyle w:val="ListBullet"/>
+      </w:pPr>
+      <w:r>
+        <w:rPr>
+          <w:rFonts w:ascii="Calibri" w:hAnsi="Calibri"/>
+          <w:b w:val="0"/>
+          <w:sz w:val="22"/>
+        </w:rPr>
+        <w:t xml:space="preserve">Evidence types this week: observation (all four days), conversation (Thu and Fri cool-downs), product (Fri number shapes and any exit slips).</w:t>
+      </w:r>
+    </w:p>
+    <w:p>
+      <w:pPr>
+        <w:pStyle w:val="ListBullet"/>
+      </w:pPr>
+      <w:r>
+        <w:rPr>
+          <w:rFonts w:ascii="Calibri" w:hAnsi="Calibri"/>
+          <w:b w:val="0"/>
+          <w:sz w:val="22"/>
+        </w:rPr>
+        <w:t xml:space="preserve">Learner attributes (“Co-operates with Others”, “Respects Self and Others”) are recorded separately on the same scale; note them during the number games.</w:t>
+      </w:r>
+    </w:p>
+    <w:p>
+      <w:pPr>
+        <w:pStyle w:val="ListBullet"/>
+      </w:pPr>
+      <w:r>
+        <w:rPr>
+          <w:rFonts w:ascii="Calibri" w:hAnsi="Calibri"/>
+          <w:b w:val="0"/>
+          <w:sz w:val="22"/>
+        </w:rPr>
+        <w:t xml:space="preserve">Recording: the teacher enters evidence in PowerTeacher Pro. A substitute fills in the checklist only and leaves it for the teacher.</w:t>
       </w:r>
     </w:p>
     <w:p>
@@ -3923,7 +6853,7 @@
           <w:b/>
           <w:sz w:val="22"/>
         </w:rPr>
-        <w:t xml:space="preserve">Quick checklist (✓ = Proficient look-for seen; – = needs a reminder)</w:t>
+        <w:t xml:space="preserve">Quick checklist (✓ = Solidifying / Meeting look-for seen; – = needs a reminder)</w:t>
       </w:r>
     </w:p>
     <w:tbl>
@@ -4475,17 +7405,59 @@
         <w:pStyle w:val="Heading2"/>
       </w:pPr>
       <w:r>
-        <w:t>If the gym is short</w:t>
-      </w:r>
-    </w:p>
-    <w:p>
+        <w:t>Exit and clean-up</w:t>
+      </w:r>
+    </w:p>
+    <w:p>
+      <w:pPr>
+        <w:pStyle w:val="ListBullet"/>
+      </w:pPr>
       <w:r>
         <w:rPr>
           <w:rFonts w:ascii="Calibri" w:hAnsi="Calibri"/>
           <w:b w:val="0"/>
           <w:sz w:val="22"/>
         </w:rPr>
-        <w:t xml:space="preserve">Keep wu + game only; skip the skill station. Still do the cool-down sentence. On Wed early dismissal, default to this short pattern for all bands. No parachute? Use a king-size sheet for ripples, dome and popcorn, and run Sharks and Dolphins without the chute.</w:t>
+        <w:t xml:space="preserve">Two whistles: chute down gently. Four helpers fold the chute into quarters and put it in its bag.</w:t>
+      </w:r>
+    </w:p>
+    <w:p>
+      <w:pPr>
+        <w:pStyle w:val="ListBullet"/>
+      </w:pPr>
+      <w:r>
+        <w:rPr>
+          <w:rFonts w:ascii="Calibri" w:hAnsi="Calibri"/>
+          <w:b w:val="0"/>
+          <w:sz w:val="22"/>
+        </w:rPr>
+        <w:t xml:space="preserve">Beanbags, noodles, hoops and cones go back to their bins by colour.</w:t>
+      </w:r>
+    </w:p>
+    <w:p>
+      <w:pPr>
+        <w:pStyle w:val="ListBullet"/>
+      </w:pPr>
+      <w:r>
+        <w:rPr>
+          <w:rFonts w:ascii="Calibri" w:hAnsi="Calibri"/>
+          <w:b w:val="0"/>
+          <w:sz w:val="22"/>
+        </w:rPr>
+        <w:t xml:space="preserve">Line up at the door: “Walk to the line like the chute is still in your hands — slow and together.”</w:t>
+      </w:r>
+    </w:p>
+    <w:p>
+      <w:pPr>
+        <w:pStyle w:val="ListBullet"/>
+      </w:pPr>
+      <w:r>
+        <w:rPr>
+          <w:rFonts w:ascii="Calibri" w:hAnsi="Calibri"/>
+          <w:b w:val="0"/>
+          <w:sz w:val="22"/>
+        </w:rPr>
+        <w:t xml:space="preserve">Check the floor for stray beanbags before the next class arrives.</w:t>
       </w:r>
     </w:p>
     <w:p>
@@ -4493,6 +7465,197 @@
         <w:pStyle w:val="Heading2"/>
       </w:pPr>
       <w:r>
+        <w:t>Sub notes</w:t>
+      </w:r>
+    </w:p>
+    <w:p>
+      <w:pPr>
+        <w:pStyle w:val="ListBullet"/>
+      </w:pPr>
+      <w:r>
+        <w:rPr>
+          <w:rFonts w:ascii="Calibri" w:hAnsi="Calibri"/>
+          <w:b w:val="0"/>
+          <w:sz w:val="22"/>
+        </w:rPr>
+        <w:t xml:space="preserve">Materials: the parachute, beanbags, noodles, hoops and pinnies are in the PE storage room; check the sub binder for the room map and class lists.</w:t>
+      </w:r>
+    </w:p>
+    <w:p>
+      <w:pPr>
+        <w:pStyle w:val="ListBullet"/>
+      </w:pPr>
+      <w:r>
+        <w:rPr>
+          <w:rFonts w:ascii="Calibri" w:hAnsi="Calibri"/>
+          <w:b w:val="0"/>
+          <w:sz w:val="22"/>
+        </w:rPr>
+        <w:t xml:space="preserve">Take attendance at the start of class using the class list in the sub binder. Check the class medical alert list in the sub binder before you begin.</w:t>
+      </w:r>
+    </w:p>
+    <w:p>
+      <w:pPr>
+        <w:pStyle w:val="ListBullet"/>
+      </w:pPr>
+      <w:r>
+        <w:rPr>
+          <w:rFonts w:ascii="Calibri" w:hAnsi="Calibri"/>
+          <w:b w:val="0"/>
+          <w:sz w:val="22"/>
+        </w:rPr>
+        <w:t xml:space="preserve">Ask the educational assistant or the office for help with keys, equipment or a student who needs support. Follow ISP supports listed in the class binder.</w:t>
+      </w:r>
+    </w:p>
+    <w:p>
+      <w:pPr>
+        <w:pStyle w:val="ListBullet"/>
+      </w:pPr>
+      <w:r>
+        <w:rPr>
+          <w:rFonts w:ascii="Calibri" w:hAnsi="Calibri"/>
+          <w:b w:val="0"/>
+          <w:sz w:val="22"/>
+        </w:rPr>
+        <w:t xml:space="preserve">Teach from the band section for the grade you have. Read the exact words in quotes. Use the stop signal first.</w:t>
+      </w:r>
+    </w:p>
+    <w:p>
+      <w:pPr>
+        <w:pStyle w:val="ListBullet"/>
+      </w:pPr>
+      <w:r>
+        <w:rPr>
+          <w:rFonts w:ascii="Calibri" w:hAnsi="Calibri"/>
+          <w:b w:val="0"/>
+          <w:sz w:val="22"/>
+        </w:rPr>
+        <w:t xml:space="preserve">A substitute skips Cat &amp; Mouse and the three-mouse version (nobody goes on top of the chute), Rocket Launch and BackBurst. Do not add elimination rules.</w:t>
+      </w:r>
+    </w:p>
+    <w:p>
+      <w:pPr>
+        <w:pStyle w:val="ListBullet"/>
+      </w:pPr>
+      <w:r>
+        <w:rPr>
+          <w:rFonts w:ascii="Calibri" w:hAnsi="Calibri"/>
+          <w:b w:val="0"/>
+          <w:sz w:val="22"/>
+        </w:rPr>
+        <w:t xml:space="preserve">Leave for the teacher: attendance taken, the quick checklist (even partly filled), and a short note on what you covered and any incidents.</w:t>
+      </w:r>
+    </w:p>
+    <w:p>
+      <w:pPr>
+        <w:pStyle w:val="ListBullet"/>
+      </w:pPr>
+      <w:r>
+        <w:rPr>
+          <w:rFonts w:ascii="Calibri" w:hAnsi="Calibri"/>
+          <w:b w:val="0"/>
+          <w:sz w:val="22"/>
+        </w:rPr>
+        <w:t xml:space="preserve">Plan B (no gym or no parachute): in a cleared classroom, use a king-size sheet for ripples, dome and popcorn with small groups; play Four Corners / Guess Who or a stay-in warm-up from the Warm Up Games page; run number shapes on the floor without a chute. Same outcomes (moving together, force and timing, spacing, teamwork).</w:t>
+      </w:r>
+    </w:p>
+    <w:p>
+      <w:r>
+        <w:rPr>
+          <w:rFonts w:ascii="Calibri" w:hAnsi="Calibri"/>
+          <w:sz w:val="22"/>
+        </w:rPr>
+        <w:t xml:space="preserve">Plan B links: </w:t>
+      </w:r>
+      <w:hyperlink r:id="rId113">
+        <w:r>
+          <w:rPr>
+            <w:color w:val="0563C1"/>
+            <w:u w:val="single"/>
+            <w:sz w:val="22"/>
+            <w:rFonts w:ascii="Calibri" w:hAnsi="Calibri"/>
+          </w:rPr>
+          <w:t>Warm Up Games — No Gym, No Problem</w:t>
+        </w:r>
+      </w:hyperlink>
+      <w:r>
+        <w:rPr>
+          <w:rFonts w:ascii="Calibri" w:hAnsi="Calibri"/>
+          <w:sz w:val="22"/>
+        </w:rPr>
+        <w:t xml:space="preserve"> · </w:t>
+      </w:r>
+      <w:hyperlink r:id="rId114">
+        <w:r>
+          <w:rPr>
+            <w:color w:val="0563C1"/>
+            <w:u w:val="single"/>
+            <w:sz w:val="22"/>
+            <w:rFonts w:ascii="Calibri" w:hAnsi="Calibri"/>
+          </w:rPr>
+          <w:t>Four Corners / Guess Who</w:t>
+        </w:r>
+      </w:hyperlink>
+      <w:r>
+        <w:rPr>
+          <w:rFonts w:ascii="Calibri" w:hAnsi="Calibri"/>
+          <w:sz w:val="22"/>
+        </w:rPr>
+        <w:t xml:space="preserve"> · </w:t>
+      </w:r>
+      <w:hyperlink r:id="rId115">
+        <w:r>
+          <w:rPr>
+            <w:color w:val="0563C1"/>
+            <w:u w:val="single"/>
+            <w:sz w:val="22"/>
+            <w:rFonts w:ascii="Calibri" w:hAnsi="Calibri"/>
+          </w:rPr>
+          <w:t>Parachute card</w:t>
+        </w:r>
+      </w:hyperlink>
+      <w:r>
+        <w:rPr>
+          <w:rFonts w:ascii="Calibri" w:hAnsi="Calibri"/>
+          <w:sz w:val="22"/>
+        </w:rPr>
+        <w:t xml:space="preserve"> · </w:t>
+      </w:r>
+      <w:hyperlink r:id="rId116">
+        <w:r>
+          <w:rPr>
+            <w:color w:val="0563C1"/>
+            <w:u w:val="single"/>
+            <w:sz w:val="22"/>
+            <w:rFonts w:ascii="Calibri" w:hAnsi="Calibri"/>
+          </w:rPr>
+          <w:t>House rules / stay-in</w:t>
+        </w:r>
+      </w:hyperlink>
+    </w:p>
+    <w:p>
+      <w:pPr>
+        <w:pStyle w:val="Heading2"/>
+      </w:pPr>
+      <w:r>
+        <w:t>If the gym is short</w:t>
+      </w:r>
+    </w:p>
+    <w:p>
+      <w:r>
+        <w:rPr>
+          <w:rFonts w:ascii="Calibri" w:hAnsi="Calibri"/>
+          <w:b w:val="0"/>
+          <w:sz w:val="22"/>
+        </w:rPr>
+        <w:t xml:space="preserve">Keep wu + game only; skip the skill station. Still do the cool-down sentence. On Wed early dismissal, default to this short pattern for all bands. No parachute? Use a king-size sheet for ripples, dome and popcorn, and run Sharks and Dolphins without the chute.</w:t>
+      </w:r>
+    </w:p>
+    <w:p>
+      <w:pPr>
+        <w:pStyle w:val="Heading2"/>
+      </w:pPr>
+      <w:r>
         <w:t>Notes</w:t>
       </w:r>
     </w:p>
@@ -4542,9 +7705,27 @@
           <w:rFonts w:ascii="Calibri" w:hAnsi="Calibri"/>
           <w:sz w:val="22"/>
         </w:rPr>
-        <w:t xml:space="preserve">Next week on the playbook: </w:t>
-      </w:r>
-      <w:hyperlink r:id="rId111">
+        <w:t xml:space="preserve">Last week: </w:t>
+      </w:r>
+      <w:hyperlink r:id="rId117">
+        <w:r>
+          <w:rPr>
+            <w:color w:val="0563C1"/>
+            <w:u w:val="single"/>
+            <w:sz w:val="22"/>
+            <w:rFonts w:ascii="Calibri" w:hAnsi="Calibri"/>
+          </w:rPr>
+          <w:t>Week 6 · October W1 (football)</w:t>
+        </w:r>
+      </w:hyperlink>
+      <w:r>
+        <w:rPr>
+          <w:rFonts w:ascii="Calibri" w:hAnsi="Calibri"/>
+          <w:sz w:val="22"/>
+        </w:rPr>
+        <w:t xml:space="preserve">   ·   Next week on the playbook: </w:t>
+      </w:r>
+      <w:hyperlink r:id="rId118">
         <w:r>
           <w:rPr>
             <w:color w:val="0563C1"/>

</xml_diff>

<commit_message>
Weekly plan Word files: remove Notes for teacher, Curriculum outcomes and Game & activity links sections (build step, idempotent); links kept for the site in weekly-plans-links.json
</commit_message>
<xml_diff>
--- a/weekly-plans/PE-Weekly-Plan-Oct-13-16-2026-Parachute-Week-7.docx
+++ b/weekly-plans/PE-Weekly-Plan-Oct-13-16-2026-Parachute-Week-7.docx
@@ -218,1275 +218,6 @@
           <w:sz w:val="22"/>
         </w:rPr>
         <w:t xml:space="preserve">House rules: No elimination · hands stay on the chute unless your colour or name is called · walk under first, heads up · no wrapping anyone, nobody pulled off their feet, one cat on hands and knees only (never standing on the chute) · teacher-formed groups · ~24 kids (whole class on one chute, or 12 + 12 on two) · stay-in only (a drop or tangle = restart from the last good shape; a tag = stretch 10 / role swap, then back)</w:t>
-      </w:r>
-    </w:p>
-    <w:p>
-      <w:pPr>
-        <w:pStyle w:val="Heading2"/>
-      </w:pPr>
-      <w:r>
-        <w:t>Notes for teacher</w:t>
-      </w:r>
-    </w:p>
-    <w:p>
-      <w:pPr>
-        <w:pStyle w:val="ListBullet"/>
-      </w:pPr>
-      <w:r>
-        <w:rPr>
-          <w:rFonts w:ascii="Calibri" w:hAnsi="Calibri"/>
-          <w:b w:val="0"/>
-          <w:sz w:val="22"/>
-        </w:rPr>
-        <w:t xml:space="preserve">Updated Oct 16, 2026 to the Alberta lesson plan standard. Lesson content, dates and links are unchanged from the Oct 9 version. Added: word-for-word outcomes, EIPS 2026–27 rubric levels, safety, differentiation, management cues and sub notes.</w:t>
-      </w:r>
-    </w:p>
-    <w:p>
-      <w:pPr>
-        <w:pStyle w:val="ListBullet"/>
-      </w:pPr>
-      <w:r>
-        <w:rPr>
-          <w:rFonts w:ascii="Calibri" w:hAnsi="Calibri"/>
-          <w:b w:val="0"/>
-          <w:sz w:val="22"/>
-        </w:rPr>
-        <w:t xml:space="preserve">Outcomes are copied word for word from the new LearnAlberta data file for Physical Education and Wellness K–6 (retrieved Oct 11, 2026; includes the 2026–27 minor updates). The same saved copy was used for the Week 8 Circus plan. Spot-check the wording on the LearnAlberta page before you use it on report cards.</w:t>
-      </w:r>
-    </w:p>
-    <w:p>
-      <w:pPr>
-        <w:pStyle w:val="ListBullet"/>
-      </w:pPr>
-      <w:r>
-        <w:rPr>
-          <w:rFonts w:ascii="Calibri" w:hAnsi="Calibri"/>
-          <w:b w:val="0"/>
-          <w:sz w:val="22"/>
-        </w:rPr>
-        <w:t xml:space="preserve">The Oct 9 version listed “Movement Tactics” as an organizing idea. That is not a Physical Education and Wellness K–6 organizing idea, so it was removed. This week is cited under Movement Skill Development, plus Safety for Grade 4.</w:t>
-      </w:r>
-    </w:p>
-    <w:p>
-      <w:pPr>
-        <w:pStyle w:val="ListBullet"/>
-      </w:pPr>
-      <w:r>
-        <w:rPr>
-          <w:rFonts w:ascii="Calibri" w:hAnsi="Calibri"/>
-          <w:b w:val="0"/>
-          <w:sz w:val="22"/>
-        </w:rPr>
-        <w:t xml:space="preserve">Crossing under the chute safely is cited under spatial awareness for Grades 1–2, under the Grade 4 Safety outcome, under the movement (space, direction, avoiding others) outcomes for Grades 3 and 5, and under the Grade 6 structure outcome. Safety is also taught as routines every day.</w:t>
-      </w:r>
-    </w:p>
-    <w:p>
-      <w:pPr>
-        <w:pStyle w:val="ListBullet"/>
-      </w:pPr>
-      <w:r>
-        <w:rPr>
-          <w:rFonts w:ascii="Calibri" w:hAnsi="Calibri"/>
-          <w:b w:val="0"/>
-          <w:sz w:val="22"/>
-        </w:rPr>
-        <w:t xml:space="preserve">Grade 6: the Grade 6 teamwork guiding question is about conflict resolution, which this week does not teach. Grade 6 number games are cited under the Grade 6 structure outcome (rules, roles, inclusion). Co-operation is still observed as the learner attribute “Co-operates with Others”.</w:t>
-      </w:r>
-    </w:p>
-    <w:p>
-      <w:pPr>
-        <w:pStyle w:val="ListBullet"/>
-      </w:pPr>
-      <w:r>
-        <w:rPr>
-          <w:rFonts w:ascii="Calibri" w:hAnsi="Calibri"/>
-          <w:b w:val="0"/>
-          <w:sz w:val="22"/>
-        </w:rPr>
-        <w:t xml:space="preserve">Healthy Relationships is not cited this week. Lifting together and including everyone are assessed through the teamwork outcomes (Grades 1–5) and the learner attributes.</w:t>
-      </w:r>
-    </w:p>
-    <w:p>
-      <w:pPr>
-        <w:pStyle w:val="ListBullet"/>
-      </w:pPr>
-      <w:r>
-        <w:rPr>
-          <w:rFonts w:ascii="Calibri" w:hAnsi="Calibri"/>
-          <w:b w:val="0"/>
-          <w:sz w:val="22"/>
-        </w:rPr>
-        <w:t xml:space="preserve">Library games used as warm-ups or finishers (Hoop Run &amp; Spin, Zone Tag, Post the Parcel, Pancake Relay, Hot Air Balloon, BackBurst, Horse and Jockey, Four Corners / Guess Who, Dizzy Dizzy) support the lesson but are not assessed this week.</w:t>
-      </w:r>
-    </w:p>
-    <w:p>
-      <w:pPr>
-        <w:pStyle w:val="ListBullet"/>
-      </w:pPr>
-      <w:r>
-        <w:rPr>
-          <w:rFonts w:ascii="Calibri" w:hAnsi="Calibri"/>
-          <w:b w:val="0"/>
-          <w:sz w:val="22"/>
-        </w:rPr>
-        <w:t xml:space="preserve">EIPS 2026–27 reporting pilot levels are used in the rubric (no percentages).</w:t>
-      </w:r>
-    </w:p>
-    <w:p>
-      <w:pPr>
-        <w:pStyle w:val="Heading2"/>
-      </w:pPr>
-      <w:r>
-        <w:t>Curriculum outcomes (Physical Education and Wellness K–6, word for word)</w:t>
-      </w:r>
-    </w:p>
-    <w:p>
-      <w:r>
-        <w:rPr>
-          <w:rFonts w:ascii="Calibri" w:hAnsi="Calibri"/>
-          <w:b w:val="0"/>
-          <w:sz w:val="22"/>
-        </w:rPr>
-        <w:t xml:space="preserve">Source: new LearnAlberta, Physical Education and Wellness K–6, in effect 2026–27. Codes in brackets are LearnAlberta’s internal codes. The Learning Outcome is what you assess and report; the KUSP lines show the part this week teaches.</w:t>
-      </w:r>
-    </w:p>
-    <w:p>
-      <w:r>
-        <w:rPr>
-          <w:rFonts w:ascii="Calibri" w:hAnsi="Calibri"/>
-          <w:sz w:val="22"/>
-        </w:rPr>
-        <w:t xml:space="preserve">Check wording: </w:t>
-      </w:r>
-      <w:hyperlink r:id="rId17">
-        <w:r>
-          <w:rPr>
-            <w:color w:val="0563C1"/>
-            <w:u w:val="single"/>
-            <w:sz w:val="22"/>
-            <w:rFonts w:ascii="Calibri" w:hAnsi="Calibri"/>
-          </w:rPr>
-          <w:t>LearnAlberta — Physical Education and Wellness K–6</w:t>
-        </w:r>
-      </w:hyperlink>
-    </w:p>
-    <w:p>
-      <w:pPr>
-        <w:pStyle w:val="Heading3"/>
-      </w:pPr>
-      <w:r>
-        <w:t>Grades 1–2</w:t>
-      </w:r>
-    </w:p>
-    <w:p>
-      <w:r>
-        <w:rPr>
-          <w:rFonts w:ascii="Calibri" w:hAnsi="Calibri"/>
-          <w:b/>
-          <w:sz w:val="22"/>
-        </w:rPr>
-        <w:t xml:space="preserve">Physical Education and Wellness, Grade 1</w:t>
-      </w:r>
-    </w:p>
-    <w:p>
-      <w:pPr>
-        <w:pStyle w:val="ListBullet"/>
-      </w:pPr>
-      <w:r>
-        <w:rPr>
-          <w:rFonts w:ascii="Calibri" w:hAnsi="Calibri"/>
-          <w:b w:val="0"/>
-          <w:sz w:val="22"/>
-        </w:rPr>
-        <w:t xml:space="preserve">Organizing Idea: Movement Skill Development: Developing physical literacy through movement and active living supports well-being across a lifespan.</w:t>
-      </w:r>
-    </w:p>
-    <w:p>
-      <w:pPr>
-        <w:pStyle w:val="ListBullet"/>
-      </w:pPr>
-      <w:r>
-        <w:rPr>
-          <w:rFonts w:ascii="Calibri" w:hAnsi="Calibri"/>
-          <w:b w:val="0"/>
-          <w:sz w:val="22"/>
-        </w:rPr>
-        <w:t xml:space="preserve">Guiding Question: How might awareness of the surroundings impact movement?</w:t>
-      </w:r>
-    </w:p>
-    <w:p>
-      <w:pPr>
-        <w:pStyle w:val="ListBullet"/>
-      </w:pPr>
-      <w:r>
-        <w:rPr>
-          <w:rFonts w:ascii="Calibri" w:hAnsi="Calibri"/>
-          <w:b w:val="0"/>
-          <w:sz w:val="22"/>
-        </w:rPr>
-        <w:t xml:space="preserve">Learning Outcome: Students demonstrate how movement can support different types of physical activity. [PDE1-OI2-GQ2-LO1]</w:t>
-      </w:r>
-    </w:p>
-    <w:p>
-      <w:pPr>
-        <w:pStyle w:val="ListBullet"/>
-      </w:pPr>
-      <w:r>
-        <w:rPr>
-          <w:rFonts w:ascii="Calibri" w:hAnsi="Calibri"/>
-          <w:b w:val="0"/>
-          <w:sz w:val="22"/>
-        </w:rPr>
-        <w:t xml:space="preserve">KUSP focus this week: Understanding: “Object manipulation is the ability to control and handle objects with the body.”; Skills &amp; Procedures: “Demonstrate a variety of object-manipulation skills.” Skills &amp; Procedures: “Perform non-locomotor movements in a variety of physical activity contexts.”</w:t>
-      </w:r>
-    </w:p>
-    <w:p>
-      <w:r>
-        <w:rPr>
-          <w:rFonts w:ascii="Calibri" w:hAnsi="Calibri"/>
-          <w:b w:val="0"/>
-          <w:i/>
-          <w:sz w:val="22"/>
-        </w:rPr>
-        <w:t xml:space="preserve">Used for: lift together on a count (Tue) and popcorn force and timing (Wed).</w:t>
-      </w:r>
-    </w:p>
-    <w:p>
-      <w:r>
-        <w:rPr>
-          <w:rFonts w:ascii="Calibri" w:hAnsi="Calibri"/>
-          <w:b/>
-          <w:sz w:val="22"/>
-        </w:rPr>
-        <w:t xml:space="preserve">Physical Education and Wellness, Grade 1</w:t>
-      </w:r>
-    </w:p>
-    <w:p>
-      <w:pPr>
-        <w:pStyle w:val="ListBullet"/>
-      </w:pPr>
-      <w:r>
-        <w:rPr>
-          <w:rFonts w:ascii="Calibri" w:hAnsi="Calibri"/>
-          <w:b w:val="0"/>
-          <w:sz w:val="22"/>
-        </w:rPr>
-        <w:t xml:space="preserve">Organizing Idea: Movement Skill Development: Developing physical literacy through movement and active living supports well-being across a lifespan.</w:t>
-      </w:r>
-    </w:p>
-    <w:p>
-      <w:pPr>
-        <w:pStyle w:val="ListBullet"/>
-      </w:pPr>
-      <w:r>
-        <w:rPr>
-          <w:rFonts w:ascii="Calibri" w:hAnsi="Calibri"/>
-          <w:b w:val="0"/>
-          <w:sz w:val="22"/>
-        </w:rPr>
-        <w:t xml:space="preserve">Guiding Question: How might awareness of the surroundings impact movement?</w:t>
-      </w:r>
-    </w:p>
-    <w:p>
-      <w:pPr>
-        <w:pStyle w:val="ListBullet"/>
-      </w:pPr>
-      <w:r>
-        <w:rPr>
-          <w:rFonts w:ascii="Calibri" w:hAnsi="Calibri"/>
-          <w:b w:val="0"/>
-          <w:sz w:val="22"/>
-        </w:rPr>
-        <w:t xml:space="preserve">Learning Outcome: Students exhibit spatial awareness during a variety of physical activities. [PDE1-OI2-GQ1-LO1]</w:t>
-      </w:r>
-    </w:p>
-    <w:p>
-      <w:pPr>
-        <w:pStyle w:val="ListBullet"/>
-      </w:pPr>
-      <w:r>
-        <w:rPr>
-          <w:rFonts w:ascii="Calibri" w:hAnsi="Calibri"/>
-          <w:b w:val="0"/>
-          <w:sz w:val="22"/>
-        </w:rPr>
-        <w:t xml:space="preserve">KUSP focus this week: Knowledge: “Responses that support movement through general space include • adjusting location and distance • demonstrating control • stopping on signal • moving safely”; Skills &amp; Procedures: “Demonstrate appropriate responses to environmental cues.”</w:t>
-      </w:r>
-    </w:p>
-    <w:p>
-      <w:r>
-        <w:rPr>
-          <w:rFonts w:ascii="Calibri" w:hAnsi="Calibri"/>
-          <w:b w:val="0"/>
-          <w:i/>
-          <w:sz w:val="22"/>
-        </w:rPr>
-        <w:t xml:space="preserve">Used for: listening for your colour or name and crossing under safely (Thu).</w:t>
-      </w:r>
-    </w:p>
-    <w:p>
-      <w:r>
-        <w:rPr>
-          <w:rFonts w:ascii="Calibri" w:hAnsi="Calibri"/>
-          <w:b/>
-          <w:sz w:val="22"/>
-        </w:rPr>
-        <w:t xml:space="preserve">Physical Education and Wellness, Grade 1</w:t>
-      </w:r>
-    </w:p>
-    <w:p>
-      <w:pPr>
-        <w:pStyle w:val="ListBullet"/>
-      </w:pPr>
-      <w:r>
-        <w:rPr>
-          <w:rFonts w:ascii="Calibri" w:hAnsi="Calibri"/>
-          <w:b w:val="0"/>
-          <w:sz w:val="22"/>
-        </w:rPr>
-        <w:t xml:space="preserve">Organizing Idea: Movement Skill Development: Developing physical literacy through movement and active living supports well-being across a lifespan.</w:t>
-      </w:r>
-    </w:p>
-    <w:p>
-      <w:pPr>
-        <w:pStyle w:val="ListBullet"/>
-      </w:pPr>
-      <w:r>
-        <w:rPr>
-          <w:rFonts w:ascii="Calibri" w:hAnsi="Calibri"/>
-          <w:b w:val="0"/>
-          <w:sz w:val="22"/>
-        </w:rPr>
-        <w:t xml:space="preserve">Guiding Question: How can fair play contribute to engagement in physical activity?</w:t>
-      </w:r>
-    </w:p>
-    <w:p>
-      <w:pPr>
-        <w:pStyle w:val="ListBullet"/>
-      </w:pPr>
-      <w:r>
-        <w:rPr>
-          <w:rFonts w:ascii="Calibri" w:hAnsi="Calibri"/>
-          <w:b w:val="0"/>
-          <w:sz w:val="22"/>
-        </w:rPr>
-        <w:t xml:space="preserve">Learning Outcome: Students demonstrate fair play and support engagement in a variety of physical activities. [PDE1-OI2-GQ3-LO1]</w:t>
-      </w:r>
-    </w:p>
-    <w:p>
-      <w:pPr>
-        <w:pStyle w:val="ListBullet"/>
-      </w:pPr>
-      <w:r>
-        <w:rPr>
-          <w:rFonts w:ascii="Calibri" w:hAnsi="Calibri"/>
-          <w:b w:val="0"/>
-          <w:sz w:val="22"/>
-        </w:rPr>
-        <w:t xml:space="preserve">KUSP focus this week: Understanding: “Fair play involves acknowledging the importance of all.”; Skills &amp; Procedures: “Demonstrate practices that support fair play.”</w:t>
-      </w:r>
-    </w:p>
-    <w:p>
-      <w:r>
-        <w:rPr>
-          <w:rFonts w:ascii="Calibri" w:hAnsi="Calibri"/>
-          <w:b w:val="0"/>
-          <w:i/>
-          <w:sz w:val="22"/>
-        </w:rPr>
-        <w:t xml:space="preserve">Used for: number games — waiting for everyone and including everyone (Fri).</w:t>
-      </w:r>
-    </w:p>
-    <w:p>
-      <w:r>
-        <w:rPr>
-          <w:rFonts w:ascii="Calibri" w:hAnsi="Calibri"/>
-          <w:b/>
-          <w:sz w:val="22"/>
-        </w:rPr>
-        <w:t xml:space="preserve">Physical Education and Wellness, Grade 2</w:t>
-      </w:r>
-    </w:p>
-    <w:p>
-      <w:pPr>
-        <w:pStyle w:val="ListBullet"/>
-      </w:pPr>
-      <w:r>
-        <w:rPr>
-          <w:rFonts w:ascii="Calibri" w:hAnsi="Calibri"/>
-          <w:b w:val="0"/>
-          <w:sz w:val="22"/>
-        </w:rPr>
-        <w:t xml:space="preserve">Organizing Idea: Movement Skill Development: Developing physical literacy through movement and active living supports well-being across a lifespan.</w:t>
-      </w:r>
-    </w:p>
-    <w:p>
-      <w:pPr>
-        <w:pStyle w:val="ListBullet"/>
-      </w:pPr>
-      <w:r>
-        <w:rPr>
-          <w:rFonts w:ascii="Calibri" w:hAnsi="Calibri"/>
-          <w:b w:val="0"/>
-          <w:sz w:val="22"/>
-        </w:rPr>
-        <w:t xml:space="preserve">Guiding Question: How are awareness and movement connected?</w:t>
-      </w:r>
-    </w:p>
-    <w:p>
-      <w:pPr>
-        <w:pStyle w:val="ListBullet"/>
-      </w:pPr>
-      <w:r>
-        <w:rPr>
-          <w:rFonts w:ascii="Calibri" w:hAnsi="Calibri"/>
-          <w:b w:val="0"/>
-          <w:sz w:val="22"/>
-        </w:rPr>
-        <w:t xml:space="preserve">Learning Outcome: Students modify movement to improve control and efficiency. [PDE2-OI2-GQ2-LO1]</w:t>
-      </w:r>
-    </w:p>
-    <w:p>
-      <w:pPr>
-        <w:pStyle w:val="ListBullet"/>
-      </w:pPr>
-      <w:r>
-        <w:rPr>
-          <w:rFonts w:ascii="Calibri" w:hAnsi="Calibri"/>
-          <w:b w:val="0"/>
-          <w:sz w:val="22"/>
-        </w:rPr>
-        <w:t xml:space="preserve">KUSP focus this week: Knowledge: “Object manipulation can occur in a variety of ways, such as • sending objects, including passing and pulling • retaining objects, including bouncing • receiving objects, including collecting”; Skills &amp; Procedures: “Experiment with the three phases of movement in a variety of physical activities.” Skills &amp; Procedures: “Modify one or more phases of movement to improve control and efficiency.”</w:t>
-      </w:r>
-    </w:p>
-    <w:p>
-      <w:r>
-        <w:rPr>
-          <w:rFonts w:ascii="Calibri" w:hAnsi="Calibri"/>
-          <w:b w:val="0"/>
-          <w:i/>
-          <w:sz w:val="22"/>
-        </w:rPr>
-        <w:t xml:space="preserve">Used for: lift together on a count (Tue) and popcorn force and timing (Wed).</w:t>
-      </w:r>
-    </w:p>
-    <w:p>
-      <w:r>
-        <w:rPr>
-          <w:rFonts w:ascii="Calibri" w:hAnsi="Calibri"/>
-          <w:b/>
-          <w:sz w:val="22"/>
-        </w:rPr>
-        <w:t xml:space="preserve">Physical Education and Wellness, Grade 2</w:t>
-      </w:r>
-    </w:p>
-    <w:p>
-      <w:pPr>
-        <w:pStyle w:val="ListBullet"/>
-      </w:pPr>
-      <w:r>
-        <w:rPr>
-          <w:rFonts w:ascii="Calibri" w:hAnsi="Calibri"/>
-          <w:b w:val="0"/>
-          <w:sz w:val="22"/>
-        </w:rPr>
-        <w:t xml:space="preserve">Organizing Idea: Movement Skill Development: Developing physical literacy through movement and active living supports well-being across a lifespan.</w:t>
-      </w:r>
-    </w:p>
-    <w:p>
-      <w:pPr>
-        <w:pStyle w:val="ListBullet"/>
-      </w:pPr>
-      <w:r>
-        <w:rPr>
-          <w:rFonts w:ascii="Calibri" w:hAnsi="Calibri"/>
-          <w:b w:val="0"/>
-          <w:sz w:val="22"/>
-        </w:rPr>
-        <w:t xml:space="preserve">Guiding Question: How are awareness and movement connected?</w:t>
-      </w:r>
-    </w:p>
-    <w:p>
-      <w:pPr>
-        <w:pStyle w:val="ListBullet"/>
-      </w:pPr>
-      <w:r>
-        <w:rPr>
-          <w:rFonts w:ascii="Calibri" w:hAnsi="Calibri"/>
-          <w:b w:val="0"/>
-          <w:sz w:val="22"/>
-        </w:rPr>
-        <w:t xml:space="preserve">Learning Outcome: Students refine and apply spatial awareness across a variety of physical activity contexts. [PDE2-OI2-GQ1-LO1]</w:t>
-      </w:r>
-    </w:p>
-    <w:p>
-      <w:pPr>
-        <w:pStyle w:val="ListBullet"/>
-      </w:pPr>
-      <w:r>
-        <w:rPr>
-          <w:rFonts w:ascii="Calibri" w:hAnsi="Calibri"/>
-          <w:b w:val="0"/>
-          <w:sz w:val="22"/>
-        </w:rPr>
-        <w:t xml:space="preserve">KUSP focus this week: Skills &amp; Procedures: “Scan and assess surroundings to support spatial awareness.” Skills &amp; Procedures: “Refine movement skills in relation to people or objects in a variety of physical activities.”</w:t>
-      </w:r>
-    </w:p>
-    <w:p>
-      <w:r>
-        <w:rPr>
-          <w:rFonts w:ascii="Calibri" w:hAnsi="Calibri"/>
-          <w:b w:val="0"/>
-          <w:i/>
-          <w:sz w:val="22"/>
-        </w:rPr>
-        <w:t xml:space="preserve">Used for: crossing under and taking a new handle without bumping (Thu).</w:t>
-      </w:r>
-    </w:p>
-    <w:p>
-      <w:r>
-        <w:rPr>
-          <w:rFonts w:ascii="Calibri" w:hAnsi="Calibri"/>
-          <w:b/>
-          <w:sz w:val="22"/>
-        </w:rPr>
-        <w:t xml:space="preserve">Physical Education and Wellness, Grade 2</w:t>
-      </w:r>
-    </w:p>
-    <w:p>
-      <w:pPr>
-        <w:pStyle w:val="ListBullet"/>
-      </w:pPr>
-      <w:r>
-        <w:rPr>
-          <w:rFonts w:ascii="Calibri" w:hAnsi="Calibri"/>
-          <w:b w:val="0"/>
-          <w:sz w:val="22"/>
-        </w:rPr>
-        <w:t xml:space="preserve">Organizing Idea: Movement Skill Development: Developing physical literacy through movement and active living supports well-being across a lifespan.</w:t>
-      </w:r>
-    </w:p>
-    <w:p>
-      <w:pPr>
-        <w:pStyle w:val="ListBullet"/>
-      </w:pPr>
-      <w:r>
-        <w:rPr>
-          <w:rFonts w:ascii="Calibri" w:hAnsi="Calibri"/>
-          <w:b w:val="0"/>
-          <w:sz w:val="22"/>
-        </w:rPr>
-        <w:t xml:space="preserve">Guiding Question: How can teamwork support participation, safety, and enjoyment?</w:t>
-      </w:r>
-    </w:p>
-    <w:p>
-      <w:pPr>
-        <w:pStyle w:val="ListBullet"/>
-      </w:pPr>
-      <w:r>
-        <w:rPr>
-          <w:rFonts w:ascii="Calibri" w:hAnsi="Calibri"/>
-          <w:b w:val="0"/>
-          <w:sz w:val="22"/>
-        </w:rPr>
-        <w:t xml:space="preserve">Learning Outcome: Students demonstrate teamwork and support participation in a variety of physical activities. [PDE2-OI2-GQ3-LO1]</w:t>
-      </w:r>
-    </w:p>
-    <w:p>
-      <w:pPr>
-        <w:pStyle w:val="ListBullet"/>
-      </w:pPr>
-      <w:r>
-        <w:rPr>
-          <w:rFonts w:ascii="Calibri" w:hAnsi="Calibri"/>
-          <w:b w:val="0"/>
-          <w:sz w:val="22"/>
-        </w:rPr>
-        <w:t xml:space="preserve">KUSP focus this week: Knowledge: “Teamwork includes • communicating • making decisions • sharing ideas • contributing • involving all participants”; Skills &amp; Procedures: “Exhibit teamwork in a variety of physical activity contexts.”</w:t>
-      </w:r>
-    </w:p>
-    <w:p>
-      <w:r>
-        <w:rPr>
-          <w:rFonts w:ascii="Calibri" w:hAnsi="Calibri"/>
-          <w:b w:val="0"/>
-          <w:i/>
-          <w:sz w:val="22"/>
-        </w:rPr>
-        <w:t xml:space="preserve">Used for: number games as a group (Fri).</w:t>
-      </w:r>
-    </w:p>
-    <w:p>
-      <w:pPr>
-        <w:pStyle w:val="Heading3"/>
-      </w:pPr>
-      <w:r>
-        <w:t>Grades 3–4</w:t>
-      </w:r>
-    </w:p>
-    <w:p>
-      <w:r>
-        <w:rPr>
-          <w:rFonts w:ascii="Calibri" w:hAnsi="Calibri"/>
-          <w:b/>
-          <w:sz w:val="22"/>
-        </w:rPr>
-        <w:t xml:space="preserve">Physical Education and Wellness, Grade 3</w:t>
-      </w:r>
-    </w:p>
-    <w:p>
-      <w:pPr>
-        <w:pStyle w:val="ListBullet"/>
-      </w:pPr>
-      <w:r>
-        <w:rPr>
-          <w:rFonts w:ascii="Calibri" w:hAnsi="Calibri"/>
-          <w:b w:val="0"/>
-          <w:sz w:val="22"/>
-        </w:rPr>
-        <w:t xml:space="preserve">Organizing Idea: Movement Skill Development: Developing physical literacy through movement and active living supports well-being across a lifespan.</w:t>
-      </w:r>
-    </w:p>
-    <w:p>
-      <w:pPr>
-        <w:pStyle w:val="ListBullet"/>
-      </w:pPr>
-      <w:r>
-        <w:rPr>
-          <w:rFonts w:ascii="Calibri" w:hAnsi="Calibri"/>
-          <w:b w:val="0"/>
-          <w:sz w:val="22"/>
-        </w:rPr>
-        <w:t xml:space="preserve">Guiding Question: How can elements of movement support movement competence?</w:t>
-      </w:r>
-    </w:p>
-    <w:p>
-      <w:pPr>
-        <w:pStyle w:val="ListBullet"/>
-      </w:pPr>
-      <w:r>
-        <w:rPr>
-          <w:rFonts w:ascii="Calibri" w:hAnsi="Calibri"/>
-          <w:b w:val="0"/>
-          <w:sz w:val="22"/>
-        </w:rPr>
-        <w:t xml:space="preserve">Learning Outcome: Students investigate and demonstrate how elements of movement support physical activity. [PDE3-OI2-GQ2-LO1]</w:t>
-      </w:r>
-    </w:p>
-    <w:p>
-      <w:pPr>
-        <w:pStyle w:val="ListBullet"/>
-      </w:pPr>
-      <w:r>
-        <w:rPr>
-          <w:rFonts w:ascii="Calibri" w:hAnsi="Calibri"/>
-          <w:b w:val="0"/>
-          <w:sz w:val="22"/>
-        </w:rPr>
-        <w:t xml:space="preserve">KUSP focus this week: Knowledge: “Force involves a push or a pull and can be strong or light.”; Understanding: “Effort determines speed, time, and force.”; Skills &amp; Procedures: “Experiment with effort in a variety of movement contexts.” Skills &amp; Procedures: “Adjust movement in response to the element of space.” Skills &amp; Procedures: “Demonstrate directional movement in physical activity.”</w:t>
-      </w:r>
-    </w:p>
-    <w:p>
-      <w:r>
-        <w:rPr>
-          <w:rFonts w:ascii="Calibri" w:hAnsi="Calibri"/>
-          <w:b w:val="0"/>
-          <w:i/>
-          <w:sz w:val="22"/>
-        </w:rPr>
-        <w:t xml:space="preserve">Used for: lift together (Tue), popcorn force and timing (Wed), and crossing under safely (Thu).</w:t>
-      </w:r>
-    </w:p>
-    <w:p>
-      <w:r>
-        <w:rPr>
-          <w:rFonts w:ascii="Calibri" w:hAnsi="Calibri"/>
-          <w:b/>
-          <w:sz w:val="22"/>
-        </w:rPr>
-        <w:t xml:space="preserve">Physical Education and Wellness, Grade 3</w:t>
-      </w:r>
-    </w:p>
-    <w:p>
-      <w:pPr>
-        <w:pStyle w:val="ListBullet"/>
-      </w:pPr>
-      <w:r>
-        <w:rPr>
-          <w:rFonts w:ascii="Calibri" w:hAnsi="Calibri"/>
-          <w:b w:val="0"/>
-          <w:sz w:val="22"/>
-        </w:rPr>
-        <w:t xml:space="preserve">Organizing Idea: Movement Skill Development: Developing physical literacy through movement and active living supports well-being across a lifespan.</w:t>
-      </w:r>
-    </w:p>
-    <w:p>
-      <w:pPr>
-        <w:pStyle w:val="ListBullet"/>
-      </w:pPr>
-      <w:r>
-        <w:rPr>
-          <w:rFonts w:ascii="Calibri" w:hAnsi="Calibri"/>
-          <w:b w:val="0"/>
-          <w:sz w:val="22"/>
-        </w:rPr>
-        <w:t xml:space="preserve">Guiding Question: How can teamwork support positive interactions?</w:t>
-      </w:r>
-    </w:p>
-    <w:p>
-      <w:pPr>
-        <w:pStyle w:val="ListBullet"/>
-      </w:pPr>
-      <w:r>
-        <w:rPr>
-          <w:rFonts w:ascii="Calibri" w:hAnsi="Calibri"/>
-          <w:b w:val="0"/>
-          <w:sz w:val="22"/>
-        </w:rPr>
-        <w:t xml:space="preserve">Learning Outcome: Students identify and demonstrate how teamwork supports positive interactions during physical activity. [PDE3-OI2-GQ3-LO1]</w:t>
-      </w:r>
-    </w:p>
-    <w:p>
-      <w:pPr>
-        <w:pStyle w:val="ListBullet"/>
-      </w:pPr>
-      <w:r>
-        <w:rPr>
-          <w:rFonts w:ascii="Calibri" w:hAnsi="Calibri"/>
-          <w:b w:val="0"/>
-          <w:sz w:val="22"/>
-        </w:rPr>
-        <w:t xml:space="preserve">KUSP focus this week: Understanding: “Teamwork provides opportunities for individuals to contribute to team efforts and goals.”; Skills &amp; Procedures: “Engage in positive interactions that support teamwork.”</w:t>
-      </w:r>
-    </w:p>
-    <w:p>
-      <w:r>
-        <w:rPr>
-          <w:rFonts w:ascii="Calibri" w:hAnsi="Calibri"/>
-          <w:b w:val="0"/>
-          <w:i/>
-          <w:sz w:val="22"/>
-        </w:rPr>
-        <w:t xml:space="preserve">Used for: number games and student callers (Fri).</w:t>
-      </w:r>
-    </w:p>
-    <w:p>
-      <w:r>
-        <w:rPr>
-          <w:rFonts w:ascii="Calibri" w:hAnsi="Calibri"/>
-          <w:b/>
-          <w:sz w:val="22"/>
-        </w:rPr>
-        <w:t xml:space="preserve">Physical Education and Wellness, Grade 4</w:t>
-      </w:r>
-    </w:p>
-    <w:p>
-      <w:pPr>
-        <w:pStyle w:val="ListBullet"/>
-      </w:pPr>
-      <w:r>
-        <w:rPr>
-          <w:rFonts w:ascii="Calibri" w:hAnsi="Calibri"/>
-          <w:b w:val="0"/>
-          <w:sz w:val="22"/>
-        </w:rPr>
-        <w:t xml:space="preserve">Organizing Idea: Movement Skill Development: Developing physical literacy through movement and active living supports well-being across a lifespan.</w:t>
-      </w:r>
-    </w:p>
-    <w:p>
-      <w:pPr>
-        <w:pStyle w:val="ListBullet"/>
-      </w:pPr>
-      <w:r>
-        <w:rPr>
-          <w:rFonts w:ascii="Calibri" w:hAnsi="Calibri"/>
-          <w:b w:val="0"/>
-          <w:sz w:val="22"/>
-        </w:rPr>
-        <w:t xml:space="preserve">Guiding Question: How can elements of movement support active living?</w:t>
-      </w:r>
-    </w:p>
-    <w:p>
-      <w:pPr>
-        <w:pStyle w:val="ListBullet"/>
-      </w:pPr>
-      <w:r>
-        <w:rPr>
-          <w:rFonts w:ascii="Calibri" w:hAnsi="Calibri"/>
-          <w:b w:val="0"/>
-          <w:sz w:val="22"/>
-        </w:rPr>
-        <w:t xml:space="preserve">Learning Outcome: Students integrate and experiment with elements of movement to support physical activity. [PDE4-OI2-GQ2-LO1]</w:t>
-      </w:r>
-    </w:p>
-    <w:p>
-      <w:pPr>
-        <w:pStyle w:val="ListBullet"/>
-      </w:pPr>
-      <w:r>
-        <w:rPr>
-          <w:rFonts w:ascii="Calibri" w:hAnsi="Calibri"/>
-          <w:b w:val="0"/>
-          <w:sz w:val="22"/>
-        </w:rPr>
-        <w:t xml:space="preserve">KUSP focus this week: Knowledge: “Non-locomotor movements include lifting, extending, and flexing.”; Understanding: “Elements of movement can be manipulated to improve accuracy and control.”; Skills &amp; Procedures: “Manipulate movement elements to improve efficiency, accuracy, and control.”</w:t>
-      </w:r>
-    </w:p>
-    <w:p>
-      <w:r>
-        <w:rPr>
-          <w:rFonts w:ascii="Calibri" w:hAnsi="Calibri"/>
-          <w:b w:val="0"/>
-          <w:i/>
-          <w:sz w:val="22"/>
-        </w:rPr>
-        <w:t xml:space="preserve">Used for: lift together (Tue) and popcorn force and timing (Wed).</w:t>
-      </w:r>
-    </w:p>
-    <w:p>
-      <w:r>
-        <w:rPr>
-          <w:rFonts w:ascii="Calibri" w:hAnsi="Calibri"/>
-          <w:b/>
-          <w:sz w:val="22"/>
-        </w:rPr>
-        <w:t xml:space="preserve">Physical Education and Wellness, Grade 4</w:t>
-      </w:r>
-    </w:p>
-    <w:p>
-      <w:pPr>
-        <w:pStyle w:val="ListBullet"/>
-      </w:pPr>
-      <w:r>
-        <w:rPr>
-          <w:rFonts w:ascii="Calibri" w:hAnsi="Calibri"/>
-          <w:b w:val="0"/>
-          <w:sz w:val="22"/>
-        </w:rPr>
-        <w:t xml:space="preserve">Organizing Idea: Safety: A lifetime of optimal well-being is supported by prioritizing health and safety.</w:t>
-      </w:r>
-    </w:p>
-    <w:p>
-      <w:pPr>
-        <w:pStyle w:val="ListBullet"/>
-      </w:pPr>
-      <w:r>
-        <w:rPr>
-          <w:rFonts w:ascii="Calibri" w:hAnsi="Calibri"/>
-          <w:b w:val="0"/>
-          <w:sz w:val="22"/>
-        </w:rPr>
-        <w:t xml:space="preserve">Guiding Question: How can taking responsibility impact safety?</w:t>
-      </w:r>
-    </w:p>
-    <w:p>
-      <w:pPr>
-        <w:pStyle w:val="ListBullet"/>
-      </w:pPr>
-      <w:r>
-        <w:rPr>
-          <w:rFonts w:ascii="Calibri" w:hAnsi="Calibri"/>
-          <w:b w:val="0"/>
-          <w:sz w:val="22"/>
-        </w:rPr>
-        <w:t xml:space="preserve">Learning Outcome: Students analyze and explain responsibility and how it can impact personal and group safety. [PDE4-OI4-GQ1-LO1]</w:t>
-      </w:r>
-    </w:p>
-    <w:p>
-      <w:pPr>
-        <w:pStyle w:val="ListBullet"/>
-      </w:pPr>
-      <w:r>
-        <w:rPr>
-          <w:rFonts w:ascii="Calibri" w:hAnsi="Calibri"/>
-          <w:b w:val="0"/>
-          <w:sz w:val="22"/>
-        </w:rPr>
-        <w:t xml:space="preserve">KUSP focus this week: Knowledge: “Responsibility includes making decisions to ensure self or others are not in unsafe and uncomfortable situations.”; Understanding: “Responsibility includes an awareness of surroundings to determine the safety of a situation.”; Skills &amp; Procedures: “Examine how responsibility can impact safety in a variety of situations.”</w:t>
-      </w:r>
-    </w:p>
-    <w:p>
-      <w:r>
-        <w:rPr>
-          <w:rFonts w:ascii="Calibri" w:hAnsi="Calibri"/>
-          <w:b w:val="0"/>
-          <w:i/>
-          <w:sz w:val="22"/>
-        </w:rPr>
-        <w:t xml:space="preserve">Used for: crossing under safely, Sharks and Dolphins, and the chute safety rules (Thu, all week).</w:t>
-      </w:r>
-    </w:p>
-    <w:p>
-      <w:r>
-        <w:rPr>
-          <w:rFonts w:ascii="Calibri" w:hAnsi="Calibri"/>
-          <w:b/>
-          <w:sz w:val="22"/>
-        </w:rPr>
-        <w:t xml:space="preserve">Physical Education and Wellness, Grade 4</w:t>
-      </w:r>
-    </w:p>
-    <w:p>
-      <w:pPr>
-        <w:pStyle w:val="ListBullet"/>
-      </w:pPr>
-      <w:r>
-        <w:rPr>
-          <w:rFonts w:ascii="Calibri" w:hAnsi="Calibri"/>
-          <w:b w:val="0"/>
-          <w:sz w:val="22"/>
-        </w:rPr>
-        <w:t xml:space="preserve">Organizing Idea: Movement Skill Development: Developing physical literacy through movement and active living supports well-being across a lifespan.</w:t>
-      </w:r>
-    </w:p>
-    <w:p>
-      <w:pPr>
-        <w:pStyle w:val="ListBullet"/>
-      </w:pPr>
-      <w:r>
-        <w:rPr>
-          <w:rFonts w:ascii="Calibri" w:hAnsi="Calibri"/>
-          <w:b w:val="0"/>
-          <w:sz w:val="22"/>
-        </w:rPr>
-        <w:t xml:space="preserve">Guiding Question: How can teamwork enhance participation in physical activity?</w:t>
-      </w:r>
-    </w:p>
-    <w:p>
-      <w:pPr>
-        <w:pStyle w:val="ListBullet"/>
-      </w:pPr>
-      <w:r>
-        <w:rPr>
-          <w:rFonts w:ascii="Calibri" w:hAnsi="Calibri"/>
-          <w:b w:val="0"/>
-          <w:sz w:val="22"/>
-        </w:rPr>
-        <w:t xml:space="preserve">Learning Outcome: Students connect and demonstrate how teamwork enhances participation in physical activity. [PDE4-OI2-GQ3-LO1]</w:t>
-      </w:r>
-    </w:p>
-    <w:p>
-      <w:pPr>
-        <w:pStyle w:val="ListBullet"/>
-      </w:pPr>
-      <w:r>
-        <w:rPr>
-          <w:rFonts w:ascii="Calibri" w:hAnsi="Calibri"/>
-          <w:b w:val="0"/>
-          <w:sz w:val="22"/>
-        </w:rPr>
-        <w:t xml:space="preserve">KUSP focus this week: Knowledge: “Team success is optimized through the contributions of all members.”; Skills &amp; Procedures: “Demonstrate effective teamwork strategies during physical activity.”</w:t>
-      </w:r>
-    </w:p>
-    <w:p>
-      <w:r>
-        <w:rPr>
-          <w:rFonts w:ascii="Calibri" w:hAnsi="Calibri"/>
-          <w:b w:val="0"/>
-          <w:i/>
-          <w:sz w:val="22"/>
-        </w:rPr>
-        <w:t xml:space="preserve">Used for: number games and student callers (Fri).</w:t>
-      </w:r>
-    </w:p>
-    <w:p>
-      <w:pPr>
-        <w:pStyle w:val="Heading3"/>
-      </w:pPr>
-      <w:r>
-        <w:t>Grades 5–6</w:t>
-      </w:r>
-    </w:p>
-    <w:p>
-      <w:r>
-        <w:rPr>
-          <w:rFonts w:ascii="Calibri" w:hAnsi="Calibri"/>
-          <w:b/>
-          <w:sz w:val="22"/>
-        </w:rPr>
-        <w:t xml:space="preserve">Physical Education and Wellness, Grade 5</w:t>
-      </w:r>
-    </w:p>
-    <w:p>
-      <w:pPr>
-        <w:pStyle w:val="ListBullet"/>
-      </w:pPr>
-      <w:r>
-        <w:rPr>
-          <w:rFonts w:ascii="Calibri" w:hAnsi="Calibri"/>
-          <w:b w:val="0"/>
-          <w:sz w:val="22"/>
-        </w:rPr>
-        <w:t xml:space="preserve">Organizing Idea: Movement Skill Development: Developing physical literacy through movement and active living supports well-being across a lifespan.</w:t>
-      </w:r>
-    </w:p>
-    <w:p>
-      <w:pPr>
-        <w:pStyle w:val="ListBullet"/>
-      </w:pPr>
-      <w:r>
-        <w:rPr>
-          <w:rFonts w:ascii="Calibri" w:hAnsi="Calibri"/>
-          <w:b w:val="0"/>
-          <w:sz w:val="22"/>
-        </w:rPr>
-        <w:t xml:space="preserve">Guiding Question: How can diverse movement patterns contribute to success across physical activities?</w:t>
-      </w:r>
-    </w:p>
-    <w:p>
-      <w:pPr>
-        <w:pStyle w:val="ListBullet"/>
-      </w:pPr>
-      <w:r>
-        <w:rPr>
-          <w:rFonts w:ascii="Calibri" w:hAnsi="Calibri"/>
-          <w:b w:val="0"/>
-          <w:sz w:val="22"/>
-        </w:rPr>
-        <w:t xml:space="preserve">Learning Outcome: Students demonstrate and adapt various movement patterns to enhance skill development. [PDE5-OI2-GQ2-LO1]</w:t>
-      </w:r>
-    </w:p>
-    <w:p>
-      <w:pPr>
-        <w:pStyle w:val="ListBullet"/>
-      </w:pPr>
-      <w:r>
-        <w:rPr>
-          <w:rFonts w:ascii="Calibri" w:hAnsi="Calibri"/>
-          <w:b w:val="0"/>
-          <w:sz w:val="22"/>
-        </w:rPr>
-        <w:t xml:space="preserve">KUSP focus this week: Knowledge: “Movement patterns can be improved by adapting elements of movement, such as • sending and receiving while changing direction and speed • throwing objects at different levels • adjusting speed or changing direction to avoid individuals or objects”; Skills &amp; Procedures: “Perform movement patterns using various types of equipment, individually and with others.” Skills &amp; Procedures: “Adapt elements of movement to enhance movement patterns.”</w:t>
-      </w:r>
-    </w:p>
-    <w:p>
-      <w:r>
-        <w:rPr>
-          <w:rFonts w:ascii="Calibri" w:hAnsi="Calibri"/>
-          <w:b w:val="0"/>
-          <w:i/>
-          <w:sz w:val="22"/>
-        </w:rPr>
-        <w:t xml:space="preserve">Used for: students count the lift (Tue), pop to a target hoop (Wed), and the three-mouse version and crossing under (Thu).</w:t>
-      </w:r>
-    </w:p>
-    <w:p>
-      <w:r>
-        <w:rPr>
-          <w:rFonts w:ascii="Calibri" w:hAnsi="Calibri"/>
-          <w:b/>
-          <w:sz w:val="22"/>
-        </w:rPr>
-        <w:t xml:space="preserve">Physical Education and Wellness, Grade 5</w:t>
-      </w:r>
-    </w:p>
-    <w:p>
-      <w:pPr>
-        <w:pStyle w:val="ListBullet"/>
-      </w:pPr>
-      <w:r>
-        <w:rPr>
-          <w:rFonts w:ascii="Calibri" w:hAnsi="Calibri"/>
-          <w:b w:val="0"/>
-          <w:sz w:val="22"/>
-        </w:rPr>
-        <w:t xml:space="preserve">Organizing Idea: Movement Skill Development: Developing physical literacy through movement and active living supports well-being across a lifespan.</w:t>
-      </w:r>
-    </w:p>
-    <w:p>
-      <w:pPr>
-        <w:pStyle w:val="ListBullet"/>
-      </w:pPr>
-      <w:r>
-        <w:rPr>
-          <w:rFonts w:ascii="Calibri" w:hAnsi="Calibri"/>
-          <w:b w:val="0"/>
-          <w:sz w:val="22"/>
-        </w:rPr>
-        <w:t xml:space="preserve">Guiding Question: What is the relationship between collaboration and physical activity?</w:t>
-      </w:r>
-    </w:p>
-    <w:p>
-      <w:pPr>
-        <w:pStyle w:val="ListBullet"/>
-      </w:pPr>
-      <w:r>
-        <w:rPr>
-          <w:rFonts w:ascii="Calibri" w:hAnsi="Calibri"/>
-          <w:b w:val="0"/>
-          <w:sz w:val="22"/>
-        </w:rPr>
-        <w:t xml:space="preserve">Learning Outcome: Students demonstrate how collaboration influences physical activity. [PDE5-OI2-GQ3-LO1]</w:t>
-      </w:r>
-    </w:p>
-    <w:p>
-      <w:pPr>
-        <w:pStyle w:val="ListBullet"/>
-      </w:pPr>
-      <w:r>
-        <w:rPr>
-          <w:rFonts w:ascii="Calibri" w:hAnsi="Calibri"/>
-          <w:b w:val="0"/>
-          <w:sz w:val="22"/>
-        </w:rPr>
-        <w:t xml:space="preserve">KUSP focus this week: Knowledge: “Collaboration during physical activity involves • identifying goals • planning strategy • exchanging ideas • making and implementing decisions”; Skills &amp; Procedures: “Practise collaboration during physical activity.” Skills &amp; Procedures: “Demonstrate respect for the contributions and perspectives of others when working together to make decisions or achieve team goals.”</w:t>
-      </w:r>
-    </w:p>
-    <w:p>
-      <w:r>
-        <w:rPr>
-          <w:rFonts w:ascii="Calibri" w:hAnsi="Calibri"/>
-          <w:b w:val="0"/>
-          <w:i/>
-          <w:sz w:val="22"/>
-        </w:rPr>
-        <w:t xml:space="preserve">Used for: silent number shapes and student leaders (Fri).</w:t>
-      </w:r>
-    </w:p>
-    <w:p>
-      <w:r>
-        <w:rPr>
-          <w:rFonts w:ascii="Calibri" w:hAnsi="Calibri"/>
-          <w:b/>
-          <w:sz w:val="22"/>
-        </w:rPr>
-        <w:t xml:space="preserve">Physical Education and Wellness, Grade 6</w:t>
-      </w:r>
-    </w:p>
-    <w:p>
-      <w:pPr>
-        <w:pStyle w:val="ListBullet"/>
-      </w:pPr>
-      <w:r>
-        <w:rPr>
-          <w:rFonts w:ascii="Calibri" w:hAnsi="Calibri"/>
-          <w:b w:val="0"/>
-          <w:sz w:val="22"/>
-        </w:rPr>
-        <w:t xml:space="preserve">Organizing Idea: Movement Skill Development: Developing physical literacy through movement and active living supports well-being across a lifespan.</w:t>
-      </w:r>
-    </w:p>
-    <w:p>
-      <w:pPr>
-        <w:pStyle w:val="ListBullet"/>
-      </w:pPr>
-      <w:r>
-        <w:rPr>
-          <w:rFonts w:ascii="Calibri" w:hAnsi="Calibri"/>
-          <w:b w:val="0"/>
-          <w:sz w:val="22"/>
-        </w:rPr>
-        <w:t xml:space="preserve">Guiding Question: In what ways can movement patterns function to improve performance?</w:t>
-      </w:r>
-    </w:p>
-    <w:p>
-      <w:pPr>
-        <w:pStyle w:val="ListBullet"/>
-      </w:pPr>
-      <w:r>
-        <w:rPr>
-          <w:rFonts w:ascii="Calibri" w:hAnsi="Calibri"/>
-          <w:b w:val="0"/>
-          <w:sz w:val="22"/>
-        </w:rPr>
-        <w:t xml:space="preserve">Learning Outcome: Students adapt and apply movement patterns in controlled and dynamic physical activities. [PDE6-OI2-GQ2-LO1]</w:t>
-      </w:r>
-    </w:p>
-    <w:p>
-      <w:pPr>
-        <w:pStyle w:val="ListBullet"/>
-      </w:pPr>
-      <w:r>
-        <w:rPr>
-          <w:rFonts w:ascii="Calibri" w:hAnsi="Calibri"/>
-          <w:b w:val="0"/>
-          <w:sz w:val="22"/>
-        </w:rPr>
-        <w:t xml:space="preserve">KUSP focus this week: Knowledge: “Patterns are movements that enable the body to move in response to a stimulus.”; Skills &amp; Procedures: “Implement movement patterns in response to a variety of physical, verbal, visual, and musical stimuli.” Skills &amp; Procedures: “Adapt movement patterns to improve accuracy, speed, and proficiency in a variety of controlled and dynamic physical activities.”</w:t>
-      </w:r>
-    </w:p>
-    <w:p>
-      <w:r>
-        <w:rPr>
-          <w:rFonts w:ascii="Calibri" w:hAnsi="Calibri"/>
-          <w:b w:val="0"/>
-          <w:i/>
-          <w:sz w:val="22"/>
-        </w:rPr>
-        <w:t xml:space="preserve">Used for: lifting on a student count (Tue) and popping to a target hoop (Wed).</w:t>
-      </w:r>
-    </w:p>
-    <w:p>
-      <w:r>
-        <w:rPr>
-          <w:rFonts w:ascii="Calibri" w:hAnsi="Calibri"/>
-          <w:b/>
-          <w:sz w:val="22"/>
-        </w:rPr>
-        <w:t xml:space="preserve">Physical Education and Wellness, Grade 6</w:t>
-      </w:r>
-    </w:p>
-    <w:p>
-      <w:pPr>
-        <w:pStyle w:val="ListBullet"/>
-      </w:pPr>
-      <w:r>
-        <w:rPr>
-          <w:rFonts w:ascii="Calibri" w:hAnsi="Calibri"/>
-          <w:b w:val="0"/>
-          <w:sz w:val="22"/>
-        </w:rPr>
-        <w:t xml:space="preserve">Organizing Idea: Movement Skill Development: Developing physical literacy through movement and active living supports well-being across a lifespan.</w:t>
-      </w:r>
-    </w:p>
-    <w:p>
-      <w:pPr>
-        <w:pStyle w:val="ListBullet"/>
-      </w:pPr>
-      <w:r>
-        <w:rPr>
-          <w:rFonts w:ascii="Calibri" w:hAnsi="Calibri"/>
-          <w:b w:val="0"/>
-          <w:sz w:val="22"/>
-        </w:rPr>
-        <w:t xml:space="preserve">Guiding Question: How does structure bring organization to physical activity?</w:t>
-      </w:r>
-    </w:p>
-    <w:p>
-      <w:pPr>
-        <w:pStyle w:val="ListBullet"/>
-      </w:pPr>
-      <w:r>
-        <w:rPr>
-          <w:rFonts w:ascii="Calibri" w:hAnsi="Calibri"/>
-          <w:b w:val="0"/>
-          <w:sz w:val="22"/>
-        </w:rPr>
-        <w:t xml:space="preserve">Learning Outcome: Students examine and demonstrate an understanding of structure in physical activity. [PDE6-OI2-GQ1-LO1]</w:t>
-      </w:r>
-    </w:p>
-    <w:p>
-      <w:pPr>
-        <w:pStyle w:val="ListBullet"/>
-      </w:pPr>
-      <w:r>
-        <w:rPr>
-          <w:rFonts w:ascii="Calibri" w:hAnsi="Calibri"/>
-          <w:b w:val="0"/>
-          <w:sz w:val="22"/>
-        </w:rPr>
-        <w:t xml:space="preserve">KUSP focus this week: Knowledge: “Structural components of physical activities can have various characteristics and features, such as • rules and guidelines • protocols • purpose or intent • number and roles of participants • required equipment”; Understanding: “Structure provides parameters to support safety, engagement, and inclusion of all participants.”; Skills &amp; Procedures: “Apply structure in the creation and playing of games.”</w:t>
-      </w:r>
-    </w:p>
-    <w:p>
-      <w:r>
-        <w:rPr>
-          <w:rFonts w:ascii="Calibri" w:hAnsi="Calibri"/>
-          <w:b w:val="0"/>
-          <w:i/>
-          <w:sz w:val="22"/>
-        </w:rPr>
-        <w:t xml:space="preserve">Used for: crossing on the call and the three-mouse rules (Thu), and silent number shapes (Fri). See Notes for teacher about Grade 6 teamwork.</w:t>
       </w:r>
     </w:p>
     <w:p>
@@ -1852,684 +583,6 @@
           <w:sz w:val="22"/>
         </w:rPr>
         <w:t xml:space="preserve">A drop or tangle = restart from the last good shape · soft tag / stretch 10, then back in — no elimination</w:t>
-      </w:r>
-    </w:p>
-    <w:p>
-      <w:pPr>
-        <w:pStyle w:val="Heading2"/>
-      </w:pPr>
-      <w:r>
-        <w:t>Game &amp; activity links used this week</w:t>
-      </w:r>
-    </w:p>
-    <w:p>
-      <w:r>
-        <w:rPr>
-          <w:rFonts w:ascii="Calibri" w:hAnsi="Calibri"/>
-          <w:b w:val="0"/>
-          <w:sz w:val="22"/>
-        </w:rPr>
-        <w:t xml:space="preserve">Click any link for a demo or refresher:</w:t>
-      </w:r>
-    </w:p>
-    <w:p>
-      <w:r>
-        <w:rPr>
-          <w:rFonts w:ascii="Calibri" w:hAnsi="Calibri"/>
-          <w:sz w:val="22"/>
-        </w:rPr>
-        <w:t xml:space="preserve">Week 7 lessons (playbook): </w:t>
-      </w:r>
-      <w:hyperlink r:id="rId18">
-        <w:r>
-          <w:rPr>
-            <w:color w:val="0563C1"/>
-            <w:u w:val="single"/>
-            <w:sz w:val="22"/>
-            <w:rFonts w:ascii="Calibri" w:hAnsi="Calibri"/>
-          </w:rPr>
-          <w:t>Playbook — October W2 · Week 7</w:t>
-        </w:r>
-      </w:hyperlink>
-    </w:p>
-    <w:p>
-      <w:r>
-        <w:rPr>
-          <w:rFonts w:ascii="Calibri" w:hAnsi="Calibri"/>
-          <w:sz w:val="22"/>
-        </w:rPr>
-        <w:t xml:space="preserve">Tue · C1 ripples and dome: </w:t>
-      </w:r>
-      <w:hyperlink r:id="rId19">
-        <w:r>
-          <w:rPr>
-            <w:color w:val="0563C1"/>
-            <w:u w:val="single"/>
-            <w:sz w:val="22"/>
-            <w:rFonts w:ascii="Calibri" w:hAnsi="Calibri"/>
-          </w:rPr>
-          <w:t>Playbook — W2 · C1</w:t>
-        </w:r>
-      </w:hyperlink>
-    </w:p>
-    <w:p>
-      <w:r>
-        <w:rPr>
-          <w:rFonts w:ascii="Calibri" w:hAnsi="Calibri"/>
-          <w:sz w:val="22"/>
-        </w:rPr>
-        <w:t xml:space="preserve">Wed · C2 popcorn: </w:t>
-      </w:r>
-      <w:hyperlink r:id="rId20">
-        <w:r>
-          <w:rPr>
-            <w:color w:val="0563C1"/>
-            <w:u w:val="single"/>
-            <w:sz w:val="22"/>
-            <w:rFonts w:ascii="Calibri" w:hAnsi="Calibri"/>
-          </w:rPr>
-          <w:t>Playbook — W2 · C2</w:t>
-        </w:r>
-      </w:hyperlink>
-    </w:p>
-    <w:p>
-      <w:r>
-        <w:rPr>
-          <w:rFonts w:ascii="Calibri" w:hAnsi="Calibri"/>
-          <w:sz w:val="22"/>
-        </w:rPr>
-        <w:t xml:space="preserve">Thu · C3 change-places: </w:t>
-      </w:r>
-      <w:hyperlink r:id="rId21">
-        <w:r>
-          <w:rPr>
-            <w:color w:val="0563C1"/>
-            <w:u w:val="single"/>
-            <w:sz w:val="22"/>
-            <w:rFonts w:ascii="Calibri" w:hAnsi="Calibri"/>
-          </w:rPr>
-          <w:t>Playbook — W2 · C3</w:t>
-        </w:r>
-      </w:hyperlink>
-    </w:p>
-    <w:p>
-      <w:r>
-        <w:rPr>
-          <w:rFonts w:ascii="Calibri" w:hAnsi="Calibri"/>
-          <w:sz w:val="22"/>
-        </w:rPr>
-        <w:t xml:space="preserve">Fri · C4 number games: </w:t>
-      </w:r>
-      <w:hyperlink r:id="rId22">
-        <w:r>
-          <w:rPr>
-            <w:color w:val="0563C1"/>
-            <w:u w:val="single"/>
-            <w:sz w:val="22"/>
-            <w:rFonts w:ascii="Calibri" w:hAnsi="Calibri"/>
-          </w:rPr>
-          <w:t>Playbook — W2 · C4</w:t>
-        </w:r>
-      </w:hyperlink>
-    </w:p>
-    <w:p>
-      <w:r>
-        <w:rPr>
-          <w:rFonts w:ascii="Calibri" w:hAnsi="Calibri"/>
-          <w:sz w:val="22"/>
-        </w:rPr>
-        <w:t xml:space="preserve">Parachute set (playbook card): </w:t>
-      </w:r>
-      <w:hyperlink r:id="rId23">
-        <w:r>
-          <w:rPr>
-            <w:color w:val="0563C1"/>
-            <w:u w:val="single"/>
-            <w:sz w:val="22"/>
-            <w:rFonts w:ascii="Calibri" w:hAnsi="Calibri"/>
-          </w:rPr>
-          <w:t>Playbook — Parachute popcorn / dome / cat-and-mouse</w:t>
-        </w:r>
-      </w:hyperlink>
-    </w:p>
-    <w:p>
-      <w:r>
-        <w:rPr>
-          <w:rFonts w:ascii="Calibri" w:hAnsi="Calibri"/>
-          <w:sz w:val="22"/>
-        </w:rPr>
-        <w:t xml:space="preserve">Hot Air Balloon (library · dome): </w:t>
-      </w:r>
-      <w:hyperlink r:id="rId24">
-        <w:r>
-          <w:rPr>
-            <w:color w:val="0563C1"/>
-            <w:u w:val="single"/>
-            <w:sz w:val="22"/>
-            <w:rFonts w:ascii="Calibri" w:hAnsi="Calibri"/>
-          </w:rPr>
-          <w:t>Coach Gelardi short</w:t>
-        </w:r>
-      </w:hyperlink>
-    </w:p>
-    <w:p>
-      <w:r>
-        <w:rPr>
-          <w:rFonts w:ascii="Calibri" w:hAnsi="Calibri"/>
-          <w:sz w:val="22"/>
-        </w:rPr>
-        <w:t xml:space="preserve">BackBurst (library · dome finisher): </w:t>
-      </w:r>
-      <w:hyperlink r:id="rId25">
-        <w:r>
-          <w:rPr>
-            <w:color w:val="0563C1"/>
-            <w:u w:val="single"/>
-            <w:sz w:val="22"/>
-            <w:rFonts w:ascii="Calibri" w:hAnsi="Calibri"/>
-          </w:rPr>
-          <w:t>Coach Gelardi short</w:t>
-        </w:r>
-      </w:hyperlink>
-    </w:p>
-    <w:p>
-      <w:r>
-        <w:rPr>
-          <w:rFonts w:ascii="Calibri" w:hAnsi="Calibri"/>
-          <w:sz w:val="22"/>
-        </w:rPr>
-        <w:t xml:space="preserve">Parachute Popcorn rules: </w:t>
-      </w:r>
-      <w:hyperlink r:id="rId26">
-        <w:r>
-          <w:rPr>
-            <w:color w:val="0563C1"/>
-            <w:u w:val="single"/>
-            <w:sz w:val="22"/>
-            <w:rFonts w:ascii="Calibri" w:hAnsi="Calibri"/>
-          </w:rPr>
-          <w:t>PhysEdGames — Popcorn</w:t>
-        </w:r>
-      </w:hyperlink>
-    </w:p>
-    <w:p>
-      <w:r>
-        <w:rPr>
-          <w:rFonts w:ascii="Calibri" w:hAnsi="Calibri"/>
-          <w:sz w:val="22"/>
-        </w:rPr>
-        <w:t xml:space="preserve">Parachute Popcorn demo: </w:t>
-      </w:r>
-      <w:hyperlink r:id="rId27">
-        <w:r>
-          <w:rPr>
-            <w:color w:val="0563C1"/>
-            <w:u w:val="single"/>
-            <w:sz w:val="22"/>
-            <w:rFonts w:ascii="Calibri" w:hAnsi="Calibri"/>
-          </w:rPr>
-          <w:t>PhysEdGames YouTube — Popcorn</w:t>
-        </w:r>
-      </w:hyperlink>
-    </w:p>
-    <w:p>
-      <w:r>
-        <w:rPr>
-          <w:rFonts w:ascii="Calibri" w:hAnsi="Calibri"/>
-          <w:sz w:val="22"/>
-        </w:rPr>
-        <w:t xml:space="preserve">Parachute Rocket Launch (Gr 5–6 popcorn option): </w:t>
-      </w:r>
-      <w:hyperlink r:id="rId28">
-        <w:r>
-          <w:rPr>
-            <w:color w:val="0563C1"/>
-            <w:u w:val="single"/>
-            <w:sz w:val="22"/>
-            <w:rFonts w:ascii="Calibri" w:hAnsi="Calibri"/>
-          </w:rPr>
-          <w:t>PhysEdGames — Rocket Launch</w:t>
-        </w:r>
-      </w:hyperlink>
-    </w:p>
-    <w:p>
-      <w:r>
-        <w:rPr>
-          <w:rFonts w:ascii="Calibri" w:hAnsi="Calibri"/>
-          <w:sz w:val="22"/>
-        </w:rPr>
-        <w:t xml:space="preserve">Rocket Launch demo: </w:t>
-      </w:r>
-      <w:hyperlink r:id="rId29">
-        <w:r>
-          <w:rPr>
-            <w:color w:val="0563C1"/>
-            <w:u w:val="single"/>
-            <w:sz w:val="22"/>
-            <w:rFonts w:ascii="Calibri" w:hAnsi="Calibri"/>
-          </w:rPr>
-          <w:t>PhysEdGames YouTube — Rocket Launch</w:t>
-        </w:r>
-      </w:hyperlink>
-    </w:p>
-    <w:p>
-      <w:r>
-        <w:rPr>
-          <w:rFonts w:ascii="Calibri" w:hAnsi="Calibri"/>
-          <w:sz w:val="22"/>
-        </w:rPr>
-        <w:t xml:space="preserve">Sharks and Dolphins (playbook card · chute version): </w:t>
-      </w:r>
-      <w:hyperlink r:id="rId30">
-        <w:r>
-          <w:rPr>
-            <w:color w:val="0563C1"/>
-            <w:u w:val="single"/>
-            <w:sz w:val="22"/>
-            <w:rFonts w:ascii="Calibri" w:hAnsi="Calibri"/>
-          </w:rPr>
-          <w:t>Playbook — Sharks and Dolphins</w:t>
-        </w:r>
-      </w:hyperlink>
-    </w:p>
-    <w:p>
-      <w:r>
-        <w:rPr>
-          <w:rFonts w:ascii="Calibri" w:hAnsi="Calibri"/>
-          <w:sz w:val="22"/>
-        </w:rPr>
-        <w:t xml:space="preserve">Parachute Sharks &amp; Lifeguards (playbook video for C3): </w:t>
-      </w:r>
-      <w:hyperlink r:id="rId31">
-        <w:r>
-          <w:rPr>
-            <w:color w:val="0563C1"/>
-            <w:u w:val="single"/>
-            <w:sz w:val="22"/>
-            <w:rFonts w:ascii="Calibri" w:hAnsi="Calibri"/>
-          </w:rPr>
-          <w:t>YouTube — Sharks &amp; Lifeguards</w:t>
-        </w:r>
-      </w:hyperlink>
-    </w:p>
-    <w:p>
-      <w:r>
-        <w:rPr>
-          <w:rFonts w:ascii="Calibri" w:hAnsi="Calibri"/>
-          <w:sz w:val="22"/>
-        </w:rPr>
-        <w:t xml:space="preserve">Parachute Cat &amp; Mouse rules: </w:t>
-      </w:r>
-      <w:hyperlink r:id="rId32">
-        <w:r>
-          <w:rPr>
-            <w:color w:val="0563C1"/>
-            <w:u w:val="single"/>
-            <w:sz w:val="22"/>
-            <w:rFonts w:ascii="Calibri" w:hAnsi="Calibri"/>
-          </w:rPr>
-          <w:t>PhysEdGames — Cat &amp; Mouse</w:t>
-        </w:r>
-      </w:hyperlink>
-    </w:p>
-    <w:p>
-      <w:r>
-        <w:rPr>
-          <w:rFonts w:ascii="Calibri" w:hAnsi="Calibri"/>
-          <w:sz w:val="22"/>
-        </w:rPr>
-        <w:t xml:space="preserve">Cat &amp; Mouse demo: </w:t>
-      </w:r>
-      <w:hyperlink r:id="rId33">
-        <w:r>
-          <w:rPr>
-            <w:color w:val="0563C1"/>
-            <w:u w:val="single"/>
-            <w:sz w:val="22"/>
-            <w:rFonts w:ascii="Calibri" w:hAnsi="Calibri"/>
-          </w:rPr>
-          <w:t>PhysEdGames YouTube — Cat &amp; Mouse</w:t>
-        </w:r>
-      </w:hyperlink>
-    </w:p>
-    <w:p>
-      <w:r>
-        <w:rPr>
-          <w:rFonts w:ascii="Calibri" w:hAnsi="Calibri"/>
-          <w:sz w:val="22"/>
-        </w:rPr>
-        <w:t xml:space="preserve">Dizzy Dizzy (merry-go-round direction changes): </w:t>
-      </w:r>
-      <w:hyperlink r:id="rId34">
-        <w:r>
-          <w:rPr>
-            <w:color w:val="0563C1"/>
-            <w:u w:val="single"/>
-            <w:sz w:val="22"/>
-            <w:rFonts w:ascii="Calibri" w:hAnsi="Calibri"/>
-          </w:rPr>
-          <w:t>PhysEdGames — Dizzy Dizzy</w:t>
-        </w:r>
-      </w:hyperlink>
-    </w:p>
-    <w:p>
-      <w:r>
-        <w:rPr>
-          <w:rFonts w:ascii="Calibri" w:hAnsi="Calibri"/>
-          <w:sz w:val="22"/>
-        </w:rPr>
-        <w:t xml:space="preserve">Dizzy Dizzy demo: </w:t>
-      </w:r>
-      <w:hyperlink r:id="rId35">
-        <w:r>
-          <w:rPr>
-            <w:color w:val="0563C1"/>
-            <w:u w:val="single"/>
-            <w:sz w:val="22"/>
-            <w:rFonts w:ascii="Calibri" w:hAnsi="Calibri"/>
-          </w:rPr>
-          <w:t>PhysEdGames YouTube — Dizzy Dizzy</w:t>
-        </w:r>
-      </w:hyperlink>
-    </w:p>
-    <w:p>
-      <w:r>
-        <w:rPr>
-          <w:rFonts w:ascii="Calibri" w:hAnsi="Calibri"/>
-          <w:sz w:val="22"/>
-        </w:rPr>
-        <w:t xml:space="preserve">Hoop Run &amp; Spin (NEW · wu): </w:t>
-      </w:r>
-      <w:hyperlink r:id="rId36">
-        <w:r>
-          <w:rPr>
-            <w:color w:val="0563C1"/>
-            <w:u w:val="single"/>
-            <w:sz w:val="22"/>
-            <w:rFonts w:ascii="Calibri" w:hAnsi="Calibri"/>
-          </w:rPr>
-          <w:t>Playbook New Games — Hoop Run &amp; Spin</w:t>
-        </w:r>
-      </w:hyperlink>
-    </w:p>
-    <w:p>
-      <w:r>
-        <w:rPr>
-          <w:rFonts w:ascii="Calibri" w:hAnsi="Calibri"/>
-          <w:sz w:val="22"/>
-        </w:rPr>
-        <w:t xml:space="preserve">Hoop Run &amp; Spin demo: </w:t>
-      </w:r>
-      <w:hyperlink r:id="rId37">
-        <w:r>
-          <w:rPr>
-            <w:color w:val="0563C1"/>
-            <w:u w:val="single"/>
-            <w:sz w:val="22"/>
-            <w:rFonts w:ascii="Calibri" w:hAnsi="Calibri"/>
-          </w:rPr>
-          <w:t>Daly Exercise short</w:t>
-        </w:r>
-      </w:hyperlink>
-    </w:p>
-    <w:p>
-      <w:r>
-        <w:rPr>
-          <w:rFonts w:ascii="Calibri" w:hAnsi="Calibri"/>
-          <w:sz w:val="22"/>
-        </w:rPr>
-        <w:t xml:space="preserve">Zone Tag (NEW · wu): </w:t>
-      </w:r>
-      <w:hyperlink r:id="rId38">
-        <w:r>
-          <w:rPr>
-            <w:color w:val="0563C1"/>
-            <w:u w:val="single"/>
-            <w:sz w:val="22"/>
-            <w:rFonts w:ascii="Calibri" w:hAnsi="Calibri"/>
-          </w:rPr>
-          <w:t>Playbook New Games — Zone Tag</w:t>
-        </w:r>
-      </w:hyperlink>
-    </w:p>
-    <w:p>
-      <w:r>
-        <w:rPr>
-          <w:rFonts w:ascii="Calibri" w:hAnsi="Calibri"/>
-          <w:sz w:val="22"/>
-        </w:rPr>
-        <w:t xml:space="preserve">Zone Tag demo: </w:t>
-      </w:r>
-      <w:hyperlink r:id="rId39">
-        <w:r>
-          <w:rPr>
-            <w:color w:val="0563C1"/>
-            <w:u w:val="single"/>
-            <w:sz w:val="22"/>
-            <w:rFonts w:ascii="Calibri" w:hAnsi="Calibri"/>
-          </w:rPr>
-          <w:t>Prime Coaching Sport — Top 5 warm-ups</w:t>
-        </w:r>
-      </w:hyperlink>
-    </w:p>
-    <w:p>
-      <w:r>
-        <w:rPr>
-          <w:rFonts w:ascii="Calibri" w:hAnsi="Calibri"/>
-          <w:sz w:val="22"/>
-        </w:rPr>
-        <w:t xml:space="preserve">Post the Parcel (NEW · Fri wu option): </w:t>
-      </w:r>
-      <w:hyperlink r:id="rId40">
-        <w:r>
-          <w:rPr>
-            <w:color w:val="0563C1"/>
-            <w:u w:val="single"/>
-            <w:sz w:val="22"/>
-            <w:rFonts w:ascii="Calibri" w:hAnsi="Calibri"/>
-          </w:rPr>
-          <w:t>Playbook New Games — Post the Parcel</w:t>
-        </w:r>
-      </w:hyperlink>
-    </w:p>
-    <w:p>
-      <w:r>
-        <w:rPr>
-          <w:rFonts w:ascii="Calibri" w:hAnsi="Calibri"/>
-          <w:sz w:val="22"/>
-        </w:rPr>
-        <w:t xml:space="preserve">Pancake Relay (NEW · Fri wu option): </w:t>
-      </w:r>
-      <w:hyperlink r:id="rId41">
-        <w:r>
-          <w:rPr>
-            <w:color w:val="0563C1"/>
-            <w:u w:val="single"/>
-            <w:sz w:val="22"/>
-            <w:rFonts w:ascii="Calibri" w:hAnsi="Calibri"/>
-          </w:rPr>
-          <w:t>Playbook New Games — Pancake Relay</w:t>
-        </w:r>
-      </w:hyperlink>
-    </w:p>
-    <w:p>
-      <w:r>
-        <w:rPr>
-          <w:rFonts w:ascii="Calibri" w:hAnsi="Calibri"/>
-          <w:sz w:val="22"/>
-        </w:rPr>
-        <w:t xml:space="preserve">Post the Parcel / Pancake Relay demo: </w:t>
-      </w:r>
-      <w:hyperlink r:id="rId42">
-        <w:r>
-          <w:rPr>
-            <w:color w:val="0563C1"/>
-            <w:u w:val="single"/>
-            <w:sz w:val="22"/>
-            <w:rFonts w:ascii="Calibri" w:hAnsi="Calibri"/>
-          </w:rPr>
-          <w:t>Daly Exercise — 3 PE Games to Get Your Class Running</w:t>
-        </w:r>
-      </w:hyperlink>
-    </w:p>
-    <w:p>
-      <w:r>
-        <w:rPr>
-          <w:rFonts w:ascii="Calibri" w:hAnsi="Calibri"/>
-          <w:sz w:val="22"/>
-        </w:rPr>
-        <w:t xml:space="preserve">Horse and Jockey (wu option): </w:t>
-      </w:r>
-      <w:hyperlink r:id="rId43">
-        <w:r>
-          <w:rPr>
-            <w:color w:val="0563C1"/>
-            <w:u w:val="single"/>
-            <w:sz w:val="22"/>
-            <w:rFonts w:ascii="Calibri" w:hAnsi="Calibri"/>
-          </w:rPr>
-          <w:t>Daly Exercise YouTube</w:t>
-        </w:r>
-      </w:hyperlink>
-    </w:p>
-    <w:p>
-      <w:r>
-        <w:rPr>
-          <w:rFonts w:ascii="Calibri" w:hAnsi="Calibri"/>
-          <w:sz w:val="22"/>
-        </w:rPr>
-        <w:t xml:space="preserve">Four Corners / Guess Who (stay-in opener): </w:t>
-      </w:r>
-      <w:hyperlink r:id="rId44">
-        <w:r>
-          <w:rPr>
-            <w:color w:val="0563C1"/>
-            <w:u w:val="single"/>
-            <w:sz w:val="22"/>
-            <w:rFonts w:ascii="Calibri" w:hAnsi="Calibri"/>
-          </w:rPr>
-          <w:t>Daly Exercise YouTube</w:t>
-        </w:r>
-      </w:hyperlink>
-    </w:p>
-    <w:p>
-      <w:r>
-        <w:rPr>
-          <w:rFonts w:ascii="Calibri" w:hAnsi="Calibri"/>
-          <w:sz w:val="22"/>
-        </w:rPr>
-        <w:t xml:space="preserve">Warm-up stay-in ideas: </w:t>
-      </w:r>
-      <w:hyperlink r:id="rId45">
-        <w:r>
-          <w:rPr>
-            <w:color w:val="0563C1"/>
-            <w:u w:val="single"/>
-            <w:sz w:val="22"/>
-            <w:rFonts w:ascii="Calibri" w:hAnsi="Calibri"/>
-          </w:rPr>
-          <w:t>Warm Up Games — No Gym, No Problem</w:t>
-        </w:r>
-      </w:hyperlink>
-    </w:p>
-    <w:p>
-      <w:r>
-        <w:rPr>
-          <w:rFonts w:ascii="Calibri" w:hAnsi="Calibri"/>
-          <w:sz w:val="22"/>
-        </w:rPr>
-        <w:t xml:space="preserve">PhysEdGames channel: </w:t>
-      </w:r>
-      <w:hyperlink r:id="rId46">
-        <w:r>
-          <w:rPr>
-            <w:color w:val="0563C1"/>
-            <w:u w:val="single"/>
-            <w:sz w:val="22"/>
-            <w:rFonts w:ascii="Calibri" w:hAnsi="Calibri"/>
-          </w:rPr>
-          <w:t>@physedgames</w:t>
-        </w:r>
-      </w:hyperlink>
-    </w:p>
-    <w:p>
-      <w:r>
-        <w:rPr>
-          <w:rFonts w:ascii="Calibri" w:hAnsi="Calibri"/>
-          <w:sz w:val="22"/>
-        </w:rPr>
-        <w:t xml:space="preserve">Coach Gelardi: </w:t>
-      </w:r>
-      <w:hyperlink r:id="rId47">
-        <w:r>
-          <w:rPr>
-            <w:color w:val="0563C1"/>
-            <w:u w:val="single"/>
-            <w:sz w:val="22"/>
-            <w:rFonts w:ascii="Calibri" w:hAnsi="Calibri"/>
-          </w:rPr>
-          <w:t>@CoachGelardi</w:t>
-        </w:r>
-      </w:hyperlink>
-    </w:p>
-    <w:p>
-      <w:r>
-        <w:rPr>
-          <w:rFonts w:ascii="Calibri" w:hAnsi="Calibri"/>
-          <w:sz w:val="22"/>
-        </w:rPr>
-        <w:t xml:space="preserve">Daly Exercise: </w:t>
-      </w:r>
-      <w:hyperlink r:id="rId48">
-        <w:r>
-          <w:rPr>
-            <w:color w:val="0563C1"/>
-            <w:u w:val="single"/>
-            <w:sz w:val="22"/>
-            <w:rFonts w:ascii="Calibri" w:hAnsi="Calibri"/>
-          </w:rPr>
-          <w:t>@Daly-Exercise</w:t>
-        </w:r>
-      </w:hyperlink>
-    </w:p>
-    <w:p>
-      <w:r>
-        <w:rPr>
-          <w:rFonts w:ascii="Calibri" w:hAnsi="Calibri"/>
-          <w:sz w:val="22"/>
-        </w:rPr>
-        <w:t xml:space="preserve">Prime Coaching Sport: </w:t>
-      </w:r>
-      <w:hyperlink r:id="rId49">
-        <w:r>
-          <w:rPr>
-            <w:color w:val="0563C1"/>
-            <w:u w:val="single"/>
-            <w:sz w:val="22"/>
-            <w:rFonts w:ascii="Calibri" w:hAnsi="Calibri"/>
-          </w:rPr>
-          <w:t>@PrimeCoachingSport</w:t>
-        </w:r>
-      </w:hyperlink>
-    </w:p>
-    <w:p>
-      <w:r>
-        <w:rPr>
-          <w:rFonts w:ascii="Calibri" w:hAnsi="Calibri"/>
-          <w:b w:val="0"/>
-          <w:sz w:val="22"/>
-        </w:rPr>
-        <w:t xml:space="preserve">Parachute safety: walk under first; one cat (hands and knees) at a time on top; never wrap a classmate or pull the chute down on anyone. If the chute gets chaotic, freeze, reset to ripples, then try again.</w:t>
-      </w:r>
-    </w:p>
-    <w:p>
-      <w:r>
-        <w:rPr>
-          <w:rFonts w:ascii="Calibri" w:hAnsi="Calibri"/>
-          <w:b w:val="0"/>
-          <w:sz w:val="22"/>
-        </w:rPr>
-        <w:t xml:space="preserve">Rocket Launch here is the PhysEdGames parachute game (launch a soft ball off the chute on a count) — not the Daly “Rocket Launch” corner variant filed under Four Corners in the library.</w:t>
       </w:r>
     </w:p>
     <w:p>

</xml_diff>